<commit_message>
Actualizar protocolo con resultados y autocompletado
</commit_message>
<xml_diff>
--- a/docs/protocolos/protocolo_LSM_v22.docx
+++ b/docs/protocolos/protocolo_LSM_v22.docx
@@ -334,7 +334,7 @@
           <w:sz w:val="24"/>
           <w:szCs w:val="24"/>
         </w:rPr>
-        <w:t xml:space="preserve">Este proyecto nació de una pregunta simple: ¿se puede entrenar un modelo que reconozca el abecedario del LSM en tiempo real, usando solo una computadora estándar? Construimos un sistema que hace justo eso. Después intentamos llevarlo un paso más allá, entrenando un segundo modelo con un vocabulario de palabras completas del LSM, no solo letras, aunque, como se detalla en la sección de resultados, ese segundo modelo todavía está lejos de ser confiable.</w:t>
+        <w:t>Este proyecto nació de una pregunta simple: ¿se puede construir una herramienta útil para el LSM aunque todavía no exista un conjunto de datos suficientemente amplio para reconocer todas las palabras? La respuesta que plantea el trabajo es gradual. Primero se reconoce el abecedario; después, el autocompletado utiliza las letras reconocidas para proponer palabras conocidas. En paralelo se mantiene la línea de investigación de reconocimiento directo de palabras, pero sus resultados se presentan como experimentales y no como una función confiable de uso cotidiano.</w:t>
       </w:r>
     </w:p>
     <w:p>
@@ -571,7 +571,7 @@
           <w:sz w:val="24"/>
           <w:szCs w:val="24"/>
         </w:rPr>
-        <w:t xml:space="preserve">De ahí se desprendió una meta de ingeniería concreta: construir un prototipo capaz de detectar las 26 letras entrenables del abecedario LSM (todas excepto la Ñ, que quedó fuera del entrenamiento por falta de datos, como se explica en la sección de metodología), con una precisión mínima del 80%, usando la cámara de una computadora estándar y herramientas de código abierto.</w:t>
+        <w:t>De ahí se desprendió una meta de ingeniería concreta: construir un prototipo que reconozca las letras que puedan validarse con los datos disponibles y que use el autocompletado para formar palabras de manera gradual. La cobertura de la Ñ y de las palabras completas queda condicionada a la recolección de nuevas muestras, por lo que no se presentará como resuelta mientras no exista evidencia suficiente.</w:t>
       </w:r>
     </w:p>
     <w:p>
@@ -666,7 +666,7 @@
           <w:sz w:val="24"/>
           <w:szCs w:val="24"/>
         </w:rPr>
-        <w:t>Si se extraen keypoints de la mano con MediaPipe en lugar de usar la dato completa, y se entrena una red Conv1D + BiLSTM sobre esos keypoints con suficientes muestras por clase (del orden de miles), entonces el sistema puede alcanzar un accuracy de al menos 80% en el reconocimiento de señas en tiempo real, sin necesidad de hardware especializado ni de un dataset del tamaño de los que existen para el inglés (ASL) o el portugués (LIBRAS).</w:t>
+        <w:t>Si se combinan un reconocedor del abecedario LSM y un mecanismo de autocompletado con un diccionario validado, entonces es posible ofrecer una primera versión funcional aunque el reconocimiento directo de palabras todavía tenga datos insuficientes. La hipótesis de largo plazo mantiene que, al incorporar más participantes y muestras por clase, el reconocimiento directo del vocabulario podrá mejorar hasta alcanzar niveles de precisión adecuados para su uso.</w:t>
       </w:r>
     </w:p>
     <w:p>
@@ -742,7 +742,7 @@
           <w:sz w:val="24"/>
           <w:szCs w:val="24"/>
         </w:rPr>
-        <w:t xml:space="preserve">Variables controladas: la resolución de cámara, el modelo de MediaPipe utilizado (HandLandmarker, misma versión para todas las muestras), la proporción de la partición entrenamiento/validación/prueba (70/15/15) y los hiperparámetros de entrenamiento (optimizador, tasa de aprendizaje, tamaño de batch), que se mantuvieron fijos entre el modelo de abecedario y el de vocabulario para poder comparar resultados.</w:t>
+        <w:t>Variables controladas: la resolución de cámara, la representación de puntos clave, la forma de separar los datos, el modelo de visión utilizado y los hiperparámetros de cada experimento. Estas condiciones no fueron idénticas en todas las líneas de trabajo del repositorio, por lo que los resultados deben compararse únicamente cuando la fuente de datos y el protocolo de evaluación sean equivalentes.</w:t>
       </w:r>
     </w:p>
     <w:p>
@@ -905,7 +905,7 @@
           <w:sz w:val="24"/>
           <w:szCs w:val="24"/>
         </w:rPr>
-        <w:t>Para entrenar el sistema recopilamos un dataset propio de 598,127 datos: 574,064 del abecedario, distribuidas en 21 letras estáticas (de la A a la V, sin la Ñ, más la W y la Y), y 24,063 más repartidas en 249 palabras del vocabulario LSM. Las herramientas para construir esto (MediaPipe, TensorFlow, Python) ya eran gratuitas y de código abierto. Lo que no existía era un modelo entrenado específicamente con señas del LSM, publicado abiertamente y disponible para cualquiera que quisiera usarlo.</w:t>
+        <w:t>El repositorio reúne datos y manifiestos de varias fuentes, entre ellos registros de dactilología, datos del abecedario y representaciones de puntos en tres dimensiones. La cobertura nominal llega a 249 etiquetas de palabras, pero eso no significa que todas tengan suficientes muestras ni que todas estén listas para entrenamiento. En el experimento documentado como `successor_positions126` se trabajó con 249 etiquetas, una entrada de 30 cuadros por 126 valores y una partición de 1,675 muestras para entrenamiento, 379 para validación y 393 para prueba. Estos datos muestran por qué la cantidad y la diversidad de participantes son decisivas para el resultado.</w:t>
       </w:r>
     </w:p>
     <w:p>
@@ -1125,7 +1125,7 @@
           <w:sz w:val="24"/>
           <w:szCs w:val="24"/>
         </w:rPr>
-        <w:t>El desarrollo se organizó en cinco etapas: recolección de datos, extracción de keypoints con MediaPipe, generación de features, augmentación de datos y entrenamiento del modelo. La esta sección resume el flujo completo; cada etapa se detalla a continuación con el nivel técnico necesario para que el sistema pueda reproducirse.</w:t>
+        <w:t>El desarrollo se organizó en etapas que pueden repetirse y evaluarse por separado: integración de fuentes de datos, preparación de manifiestos, extracción de puntos clave, entrenamiento de modelos, evaluación y conexión con la aplicación. La estrategia funcional añade una etapa de autocompletado: las letras reconocidas se acumulan, se comparan con un diccionario y se convierten en sugerencias de palabras. El reconocimiento directo de palabras se mantiene como una línea de mejora, no como una capacidad ya garantizada.</w:t>
       </w:r>
     </w:p>
     <w:p>
@@ -1282,7 +1282,7 @@
           <w:sz w:val="24"/>
           <w:szCs w:val="24"/>
         </w:rPr>
-        <w:t>Para el abecedario se fotografiaron 574,064 datos en 21 letras estáticas (de la A a la V, sin la Ñ, más la W y la Y), con un promedio de 27,358 fotos por letra; el rango va de 26,358 a 29,362 según la letra. Cinco letras dinámicas (J, K, Q, X, Z) se registroron en video en lugar de muestra fija, porque su forma cambia con el movimiento y una sola dato no las representa bien: 200 videos por cada una de estas cinco letras. La Ñ se intentó registror de la misma manera, pero no se obtuvo ninguna toma utilizable; en la práctica, el modelo de abecedario reconoce 26 clases, no 27. La Tabla 1 desglosa el tipo de registro y el número de muestras por letra.</w:t>
+        <w:t>La recolección no quedó consolidada en una sola fuente. El repositorio conserva manifiestos que permiten distinguir conjuntos de dactilología, abecedario y puntos tridimensionales, así como el estado de cada muestra. En el conjunto analizado para el experimento `successor_positions126` se definieron 249 etiquetas, pero el resultado no fue satisfactorio: la precisión de prueba fue 0%. Por ello, la tabla de cobertura debe leerse como un inventario de datos disponibles, no como una garantía de que todas las letras o palabras estén listas para reconocerse.</w:t>
       </w:r>
     </w:p>
     <w:tbl>
@@ -3749,7 +3749,7 @@
           <w:sz w:val="24"/>
           <w:szCs w:val="24"/>
         </w:rPr>
-        <w:t>Para el vocabulario se trabajó con 249 palabras organizadas en 12 categorías semánticas (acciones, personas, tiempo, lugares, casa y escuela, alimentos, transporte, familiares, cuerpo, ropa y saludos, entre otras), que en conjunto suman 303 clases registradas al contar variantes de una misma palabra. En total se recopilaron 4,811 secuencias de video. Antes de entrenar, se calculó el hash MD5 de cada secuencia para detectar duplicados exactos; se encontraron y eliminaron 35. La esta sección muestra cómo se reparten esas clases entre categorías; conviene adelantar que no todas tienen el mismo desempeño, como se ve en la sección de resultados.</w:t>
+        <w:t>El catálogo del repositorio contiene 249 etiquetas de palabras, pero la existencia de una etiqueta no equivale a disponer de un conjunto de entrenamiento suficiente. Los manifiestos registran el origen, el participante, la etiqueta y el estado de cada muestra; esa trazabilidad será indispensable para incorporar nuevas personas sin mezclar indebidamente los datos de entrenamiento y evaluación. Mientras se amplía esa base, el autocompletado ofrece una salida provisional: puede trabajar con las letras del abecedario y con un diccionario de palabras, siempre que las sugerencias se presenten como apoyo y no como traducciones definitivas.</w:t>
       </w:r>
     </w:p>
     <w:p>
@@ -3790,7 +3790,7 @@
           <w:sz w:val="24"/>
           <w:szCs w:val="24"/>
         </w:rPr>
-        <w:t>Antes de describir MediaPipe y la red neuronal es necesario precisar un punto básico: una computadora no procesa una muestra de la misma forma que una persona. Para una computadora, una dato en escala de grises es una matriz de números entre 0 (negro) y 255 (blanco); una dato a color son en realidad tres matrices superpuestas, una por canal (rojo, verde y azul). Una muestra común de 640×480 píxeles equivale, solo en un canal, a una matriz de 640 por 480 números: 307,200 valores por canal, casi un millón entre los tres. La esta sección muestra esta idea a escala reducida: una dato se representa como matriz de índices de color, con varios ejemplos adicionales de cómo cualquier dibujo simple (una ballena, una casa, un árbol) es, para la computadora, solo una tabla de números.</w:t>
+        <w:t>Antes de describir MediaPipe y los modelos, conviene aclarar que el sistema no trabaja directamente con la imagen completa. Primero convierte cada registro en puntos clave de la mano y, a partir de esa representación numérica, realiza la clasificación.</w:t>
       </w:r>
     </w:p>
     <w:p>
@@ -3815,7 +3815,7 @@
           <w:sz w:val="24"/>
           <w:szCs w:val="24"/>
         </w:rPr>
-        <w:t>Una dato a color no es una sola matriz, sino tres superpuestas, una por canal de color: rojo, verde y azul (RGB). Cada canal guarda, para cada píxel, qué tan intenso es ese color en particular; combinando los tres, la pantalla reproduce el color final que ve una persona. La esta sección muestra esta idea con los tres canales representados como círculos que se sobreponen.</w:t>
+        <w:t>Una imagen a color se representa mediante tres canales: rojo, verde y azul (RGB). Esta explicación sirve para entender por qué procesar la imagen completa exige más datos y más capacidad de cómputo que trabajar con puntos clave.</w:t>
       </w:r>
     </w:p>
     <w:p>
@@ -3840,7 +3840,7 @@
           <w:sz w:val="24"/>
           <w:szCs w:val="24"/>
         </w:rPr>
-        <w:t>El mismo principio aplica a cualquier dato, no solo a muestras de manos. Da igual si es la seña de una letra, una ballena de caricatura o un dibujo de una casa: para la computadora, todo se reduce a la misma estructura de números organizados en filas y columnas. La esta sección muestra varios ejemplos simples de esto.</w:t>
+        <w:t>El mismo principio aplica a cualquier imagen o registro visual: para una computadora, la información termina representada como valores organizados. En este proyecto se decidió reducir esa información a puntos clave para que el modelo se concentre en la configuración y el movimiento de las manos.</w:t>
       </w:r>
     </w:p>
     <w:p>
@@ -3865,7 +3865,7 @@
           <w:sz w:val="24"/>
           <w:szCs w:val="24"/>
         </w:rPr>
-        <w:t>Entrenar una red directamente sobre esos casi un millón de números por muestra es posible, pero caro: hace falta mucho más cómputo y muchos más datos para que el modelo aprenda a ignorar todo lo que no es la mano: el fondo, la ropa, la iluminación, y se quede solo con la seña. Aquí es donde entra MediaPipe.</w:t>
+        <w:t>Entrenar una red directamente sobre todos los valores de una imagen puede ser costoso y sensible al fondo, la ropa y la iluminación. Por eso MediaPipe se utiliza como una etapa previa para localizar la mano y obtener una representación más compacta.</w:t>
       </w:r>
     </w:p>
     <w:p>
@@ -3899,7 +3899,7 @@
           <w:sz w:val="24"/>
           <w:szCs w:val="24"/>
         </w:rPr>
-        <w:t>MediaPipe es una librería de visión por computadora desarrollada por Google. Su modelo HandLandmarker no fue entrenado por nosotros: es un modelo ya entrenado por Google con millones de datos de manos, y su única función es encontrar una mano dentro de la dato y devolver 21 puntos clave (keypoints) con sus coordenadas (x, y, z): 21 puntos por mano, con nombres e índices estandarizados (WRIST, THUMB_TIP, INDEX_TIP, entre otros). Cada dato o cuadro de video se procesó con este modelo, en su versión tasks-vision, que detecta hasta dos manos simultáneamente.</w:t>
+        <w:t>MediaPipe es una librería de visión por computadora desarrollada por Google. En este proyecto se utiliza para localizar las manos y extraer puntos clave de cada cuadro. Esos puntos no son una predicción de palabras: son la representación de entrada que después utilizan los modelos de clasificación.</w:t>
       </w:r>
     </w:p>
     <w:p>
@@ -3917,7 +3917,7 @@
           <w:sz w:val="24"/>
           <w:szCs w:val="24"/>
         </w:rPr>
-        <w:t>El proceso completo para una sola predicción va desde que la cámara registro la dato hasta que el sistema tiene un vector de números listo para clasificar.</w:t>
+        <w:t>El proceso de una predicción comienza cuando la cámara entrega un cuadro. MediaPipe extrae los puntos clave, el modelo calcula una probabilidad para cada clase y la aplicación decide si debe mostrar el resultado, acumular una letra o enviarla al autocompletado.</w:t>
       </w:r>
     </w:p>
     <w:p>
@@ -3935,7 +3935,7 @@
           <w:sz w:val="24"/>
           <w:szCs w:val="24"/>
         </w:rPr>
-        <w:t>Esto es la decisión de diseño más importante de todo el proyecto: en lugar de darle a nuestra red la muestra completa (casi un millón de números, la mayoría de ellos ruido irrelevante), le damos solamente 21 puntos por mano, 63 números en total (21 × 3 coordenadas). MediaPipe ya hizo el trabajo pesado de encontrar la mano entre todo lo demás; nuestra red solo tiene que aprender a distinguir una seña de otra a partir de esos 63 números, no a encontrar la mano dentro de la dato. Esa reducción es la razón directa por la que nuestro modelo final pesa apenas 45 KB en lugar de los varios megabytes que pesaría una red convolucional entrenada sobre datos completas: el propio modelo de MediaPipe, ya entrenado por Google, pesa 7.8 MB en su versión float16, y es él quien carga con la parte más pesada del problema de visión.</w:t>
+        <w:t>La decisión de diseño central es no entregar a la red la imagen completa, sino una representación numérica de los puntos clave. Esto reduce la información irrelevante y facilita que el modelo aprenda la forma y el movimiento de la seña.</w:t>
       </w:r>
     </w:p>
     <w:p>
@@ -3953,7 +3953,7 @@
           <w:sz w:val="24"/>
           <w:szCs w:val="24"/>
         </w:rPr>
-        <w:t>Las muestras del abecedario se procesaron en modo IMAGE; las secuencias de palabras y las letras dinámicas, en modo VIDEO, ya que ese modo aprovecha la continuidad entre cuadros para un rastreo más estable. En una primera versión del pipeline se usó por error el modo VIDEO también para las muestras, lo que producía detecciones inconsistentes entre datos que no tenían relación temporal entre sí; corregir esa confusión de modos fue uno de los primeros ajustes necesarios.</w:t>
+        <w:t>Las muestras del abecedario y las secuencias de palabras no se procesaron exactamente de la misma manera. Las representaciones, el número de puntos y los conjuntos de datos cambian entre experimentos; por ello, cada resultado debe identificarse con su propia configuración.</w:t>
       </w:r>
     </w:p>
     <w:p>
@@ -3971,7 +3971,7 @@
           <w:sz w:val="24"/>
           <w:szCs w:val="24"/>
         </w:rPr>
-        <w:t>La configuración final fue: num_hands = 2, min_hand_detection_confidence = 0.3, min_tracking_confidence = 0.5. Para el abecedario se usó una sola mano (63 keypoints); para palabras se usaron ambas manos más pose corporal y rasgos faciales, sumando 226 keypoints por cuadro: 126 de manos, 52 de pose y 48 de cara, como se desglosa a continuación.</w:t>
+        <w:t>Las representaciones no fueron iguales en todos los experimentos. El reporte `successor_positions126` utilizó secuencias de 30 cuadros con 126 valores por cuadro, mientras que otras líneas del repositorio trabajan con representaciones distintas. Esta diferencia debe quedar explícita, porque un resultado no puede compararse con otro si cambia la representación de entrada, el conjunto de participantes o la forma de separar los datos.</w:t>
       </w:r>
     </w:p>
     <w:p>
@@ -4012,7 +4012,7 @@
           <w:sz w:val="24"/>
           <w:szCs w:val="24"/>
         </w:rPr>
-        <w:t>Cada muestra de entrada al modelo no es un solo cuadro, sino una secuencia de 30 cuadros consecutivos, aproximadamente un segundo de video a 30 cuadros por segundo, lo que le permite a la red observar el movimiento, no solo una postura estática. El valor de 30 se eligió por dos razones prácticas: es suficiente para registror el gesto completo de las letras dinámicas más lentas observadas durante la recolección, y mantiene el tensor de entrada en un tamaño manejable para entrenar en la máquina disponible; secuencias más largas (60 u 80 cuadros) se probaron informalmente y no mejoraron el accuracy lo suficiente para justificar el costo de cómputo adicional.</w:t>
+        <w:t>Cada muestra de entrada puede organizarse como una secuencia de 30 cuadros consecutivos. Esta ventana permite representar movimiento cuando el experimento utiliza datos temporales; para el autocompletado, las letras reconocidas se acumulan en orden y se comparan con el diccionario disponible.</w:t>
       </w:r>
     </w:p>
     <w:p>
@@ -4181,7 +4181,7 @@
           <w:sz w:val="24"/>
           <w:szCs w:val="24"/>
         </w:rPr>
-        <w:t xml:space="preserve">La augmentación se aplicó en tres niveles, todos respetando los límites articulares reales de una mano para no generar posturas anatómicamente imposibles. A nivel de frame individual se aplicaron 10 transformaciones espaciales: traslación (±12%), rotación 3D, escalado (0.85–1.15x), flip horizontal, dropout anatómico de hasta dos dedos, variación de curvatura, inclinación de muñeca, temblor, distorsión de perspectiva y simulación de persona específica. A nivel de secuencia completa se aplicaron 6 transformaciones temporales: cambio de velocidad, jitter temporal, frame dropout, recorte temporal, ruido de velocidad y ruido articular. Entre muestras de una misma clase se aplicó mixup, combinando dos secuencias con un factor de mezcla aleatorio.</w:t>
+        <w:t>La augmentación se aplicó mediante transformaciones numéricas sobre las secuencias, como ruido controlado, escalamiento, desplazamientos y cambios temporales. Estas transformaciones solo son útiles si conservan la identidad de la seña y se aplican sin contaminar los conjuntos de validación y prueba.</w:t>
       </w:r>
     </w:p>
     <w:p>
@@ -4199,7 +4199,7 @@
           <w:sz w:val="24"/>
           <w:szCs w:val="24"/>
         </w:rPr>
-        <w:t>El efecto de estas transformaciones es acumulativo: una misma muestra original puede generar decenas de variantes distintas combinando traslación, rotación y escalado, como se ilustra en la esta sección.</w:t>
+        <w:t>El efecto de estas transformaciones es aumentar la variabilidad disponible para el entrenamiento. No sustituye la recolección de personas nuevas: una variante artificial no equivale a una muestra independiente de otro participante.</w:t>
       </w:r>
     </w:p>
     <w:p>
@@ -4276,7 +4276,7 @@
           <w:sz w:val="24"/>
           <w:szCs w:val="24"/>
         </w:rPr>
-        <w:t>La esta sección representa esta estructura de forma esquemática: cada punto corresponde a una neurona, cada línea a una conexión con un peso asociado, y la información se propaga desde la entrada (los 93 valores que describen una mano en un cuadro) hasta la salida (la probabilidad asignada a cada una de las 26 letras).</w:t>
+        <w:t>Una red neuronal puede entenderse como una sucesión de capas que transforma la representación de entrada hasta producir probabilidades para las clases disponibles.</w:t>
       </w:r>
     </w:p>
     <w:p>
@@ -4326,7 +4326,7 @@
           <w:sz w:val="24"/>
           <w:szCs w:val="24"/>
         </w:rPr>
-        <w:t>La primera operación especializada de nuestra red es una convolución 1D (Conv1D), que detecta patrones locales de movimiento entre cuadros cercanos: un filtro pequeño recorre la secuencia buscando la misma estructura, por ejemplo un dedo doblándose, sin importar en qué momento exacto de la seña ocurra. Esto es clave para las letras dinámicas, donde el mismo gesto puede empezar un poco antes o después según la persona (esta sección).</w:t>
+        <w:t>Una operación convolucional temporal puede detectar patrones locales entre cuadros cercanos, como un cambio de posición o una transición de los dedos. Esto resulta útil cuando la identidad de una seña depende del movimiento y no solamente de una postura.</w:t>
       </w:r>
     </w:p>
     <w:p>
@@ -4351,7 +4351,7 @@
           <w:sz w:val="24"/>
           <w:szCs w:val="24"/>
         </w:rPr>
-        <w:t>Después de las capas convolucionales, una BiLSTM integra el contexto temporal completo de la secuencia. A diferencia de una LSTM normal, que solo lee hacia adelante, la BiLSTM la recorre en ambas direcciones y combina lo que aprendió en cada sentido: así, para clasificar un cuadro en la mitad de la seña, la red ya sabe tanto cómo empezó el gesto como hacia dónde va (esta sección).</w:t>
+        <w:t>Una capa recurrente puede integrar información de distintos momentos de la secuencia. Sin embargo, la arquitectura y la representación empleadas no fueron idénticas en todas las líneas experimentales del repositorio.</w:t>
       </w:r>
     </w:p>
     <w:p>
@@ -4376,7 +4376,7 @@
           <w:sz w:val="24"/>
           <w:szCs w:val="24"/>
         </w:rPr>
-        <w:t>Finalmente, una capa densa con activación softmax convierte toda esa información en una probabilidad para cada una de las 26 letras. Softmax garantiza que esas probabilidades sumen 1, así que el sistema no solo dice cuál letra reconoció, sino qué tan seguro está: una predicción de 98% para la letra A es muy distinta de una de 40%, aunque ambas resulten en la misma letra final (esta sección).</w:t>
+        <w:t>Finalmente, una capa densa con activación softmax transforma la representación interna en una probabilidad para cada clase. La aplicación debe utilizar un umbral y una política de rechazo para no convertir toda predicción incierta en una palabra afirmada.</w:t>
       </w:r>
     </w:p>
     <w:p>
@@ -4401,7 +4401,7 @@
           <w:sz w:val="24"/>
           <w:szCs w:val="24"/>
         </w:rPr>
-        <w:t>La esta sección resume el flujo completo, de principio a fin, para el modelo de abecedario: desde los 93 valores de entrada hasta la predicción final, pasando por cada una de las capas descritas arriba.</w:t>
+        <w:t>El flujo completo del modelo de alfabeto va desde la representación de entrada hasta la probabilidad de cada letra. En la versión funcional propuesta, las letras aceptadas pasan después al módulo de autocompletado.</w:t>
       </w:r>
     </w:p>
     <w:p>
@@ -4426,7 +4426,7 @@
           <w:sz w:val="24"/>
           <w:szCs w:val="24"/>
         </w:rPr>
-        <w:t>Otra forma de ilustrar lo que ocurre dentro de la red es observar cómo reorganiza el espacio de entrada: al pasar por las capas, las 93 features originales de cada cuadro se transforman en una representación interna donde las señas de clases distintas quedan más separadas entre sí. La esta sección ofrece una representación conceptual de ese espacio.</w:t>
+        <w:t>Otra forma de estudiar el comportamiento del modelo es observar si las representaciones de clases distintas se separan. Esta evaluación debe acompañarse de pruebas con participantes que no hayan aparecido en el entrenamiento.</w:t>
       </w:r>
     </w:p>
     <w:p>
@@ -4467,7 +4467,7 @@
           <w:sz w:val="24"/>
           <w:szCs w:val="24"/>
         </w:rPr>
-        <w:t>Se utilizó una arquitectura Conv1D + BiLSTM para procesar las secuencias de keypoints. La entrada es un tensor de forma (30, 93) para el abecedario o (30, 226) para palabras, donde 30 es el número de cuadros por secuencia. La esta sección muestra la arquitectura completa con la forma del tensor en cada capa.</w:t>
+        <w:t>El repositorio contiene varias familias de modelos y representaciones. En el experimento documentado como `successor_positions126`, la entrada tuvo forma (30, 126), es decir, 30 cuadros por muestra y 126 valores por cuadro. También existen scripts para probar otras representaciones, arquitecturas temporales y estrategias de evaluación. Por eso, el documento distingue entre la configuración de cada experimento y no presenta una sola arquitectura como si hubiera sido la única utilizada.</w:t>
       </w:r>
     </w:p>
     <w:p>
@@ -4526,7 +4526,7 @@
           <w:sz w:val="24"/>
           <w:szCs w:val="24"/>
         </w:rPr>
-        <w:t>El entrenamiento usó el optimizador Adam con tasa de aprendizaje inicial de 1e-3, y FocalLoss (γ=3.0, α=0.25) como función de pérdida, elegida específicamente para manejar el desbalance entre clases con muchas y pocas muestras: a diferencia de la Cross-Entropy estándar, penaliza menos los ejemplos que el modelo ya clasifica bien y concentra el gradiente en los ejemplos difíciles, como se ilustra en la esta sección.</w:t>
+        <w:t>Los experimentos no comparten una única configuración de entrenamiento. Por ejemplo, el reporte `successor_positions126` registra una entrada de 30 cuadros por 126 valores, se ejecutó en CPU y evaluó 249 etiquetas. Los hiperparámetros deben citarse junto con el experimento específico del que provienen.</w:t>
       </w:r>
     </w:p>
     <w:p>
@@ -4551,7 +4551,7 @@
           <w:sz w:val="24"/>
           <w:szCs w:val="24"/>
         </w:rPr>
-        <w:t>Se aplicó EarlyStopping con paciencia de 10 épocas sobre la pérdida de validación, restaurando los mejores pesos encontrados, junto con ReduceLROnPlateau (factor 0.5, paciencia 5, tasa mínima 1e-6). El batch size fue de 256, con un máximo de 150 épocas. Los datos se dividieron en 70% entrenamiento, 15% validación y 15% prueba antes de aplicar cualquier augmentación, como muestran los datos disponibles. Esta proporción es la convención estándar en proyectos de tamaño similar: suficientes datos de entrenamiento para que el modelo generalice, con validación y prueba lo bastante grandes para que las métricas no varíen mucho de una corrida a otra.</w:t>
+        <w:t>Los reportes del repositorio conservan configuraciones diferentes de partición y entrenamiento. Para que los resultados sean comparables, las nuevas corridas deberán registrar de forma explícita la semilla, los participantes, la separación entre entrenamiento y prueba, las épocas, el tamaño de lote y el criterio de parada.</w:t>
       </w:r>
     </w:p>
     <w:p>
@@ -4594,19 +4594,8 @@
             <w:vAlign w:val="center"/>
           </w:tcPr>
           <w:p>
-            <w:pPr>
-              <w:jc w:val="left"/>
-            </w:pPr>
-            <w:r>
-              <w:rPr>
-                <w:rFonts w:ascii="Times New Roman" w:cs="Times New Roman" w:eastAsia="Times New Roman" w:hAnsi="Times New Roman"/>
-                <w:b/>
-                <w:bCs/>
-                <w:color w:val="FFFFFF"/>
-                <w:sz w:val="20"/>
-                <w:szCs w:val="20"/>
-              </w:rPr>
-              <w:t xml:space="preserve">Hiperparámetro</w:t>
+            <w:r>
+              <w:t>Elemento</w:t>
             </w:r>
           </w:p>
         </w:tc>
@@ -4623,19 +4612,8 @@
             <w:vAlign w:val="center"/>
           </w:tcPr>
           <w:p>
-            <w:pPr>
-              <w:jc w:val="left"/>
-            </w:pPr>
-            <w:r>
-              <w:rPr>
-                <w:rFonts w:ascii="Times New Roman" w:cs="Times New Roman" w:eastAsia="Times New Roman" w:hAnsi="Times New Roman"/>
-                <w:b/>
-                <w:bCs/>
-                <w:color w:val="FFFFFF"/>
-                <w:sz w:val="20"/>
-                <w:szCs w:val="20"/>
-              </w:rPr>
-              <w:t xml:space="preserve">Valor</w:t>
+            <w:r>
+              <w:t>Estado actual</w:t>
             </w:r>
           </w:p>
         </w:tc>
@@ -4653,19 +4631,8 @@
             <w:vAlign w:val="center"/>
           </w:tcPr>
           <w:p>
-            <w:pPr>
-              <w:jc w:val="left"/>
-            </w:pPr>
-            <w:r>
-              <w:rPr>
-                <w:rFonts w:ascii="Times New Roman" w:cs="Times New Roman" w:eastAsia="Times New Roman" w:hAnsi="Times New Roman"/>
-                <w:b w:val="false"/>
-                <w:bCs w:val="false"/>
-                <w:color w:val="000000"/>
-                <w:sz w:val="20"/>
-                <w:szCs w:val="20"/>
-              </w:rPr>
-              <w:t xml:space="preserve">Optimizador</w:t>
+            <w:r>
+              <w:t>Fuente de datos</w:t>
             </w:r>
           </w:p>
         </w:tc>
@@ -4681,19 +4648,8 @@
             <w:vAlign w:val="center"/>
           </w:tcPr>
           <w:p>
-            <w:pPr>
-              <w:jc w:val="left"/>
-            </w:pPr>
-            <w:r>
-              <w:rPr>
-                <w:rFonts w:ascii="Times New Roman" w:cs="Times New Roman" w:eastAsia="Times New Roman" w:hAnsi="Times New Roman"/>
-                <w:b w:val="false"/>
-                <w:bCs w:val="false"/>
-                <w:color w:val="000000"/>
-                <w:sz w:val="20"/>
-                <w:szCs w:val="20"/>
-              </w:rPr>
-              <w:t xml:space="preserve">Adam</w:t>
+            <w:r>
+              <w:t>Manifiestos de varias fuentes; cobertura nominal de 249 etiquetas</w:t>
             </w:r>
           </w:p>
         </w:tc>
@@ -4711,19 +4667,8 @@
             <w:vAlign w:val="center"/>
           </w:tcPr>
           <w:p>
-            <w:pPr>
-              <w:jc w:val="left"/>
-            </w:pPr>
-            <w:r>
-              <w:rPr>
-                <w:rFonts w:ascii="Times New Roman" w:cs="Times New Roman" w:eastAsia="Times New Roman" w:hAnsi="Times New Roman"/>
-                <w:b w:val="false"/>
-                <w:bCs w:val="false"/>
-                <w:color w:val="000000"/>
-                <w:sz w:val="20"/>
-                <w:szCs w:val="20"/>
-              </w:rPr>
-              <w:t xml:space="preserve">Tasa de aprendizaje inicial</w:t>
+            <w:r>
+              <w:t>Experimento documentado</w:t>
             </w:r>
           </w:p>
         </w:tc>
@@ -4739,19 +4684,8 @@
             <w:vAlign w:val="center"/>
           </w:tcPr>
           <w:p>
-            <w:pPr>
-              <w:jc w:val="left"/>
-            </w:pPr>
-            <w:r>
-              <w:rPr>
-                <w:rFonts w:ascii="Times New Roman" w:cs="Times New Roman" w:eastAsia="Times New Roman" w:hAnsi="Times New Roman"/>
-                <w:b w:val="false"/>
-                <w:bCs w:val="false"/>
-                <w:color w:val="000000"/>
-                <w:sz w:val="20"/>
-                <w:szCs w:val="20"/>
-              </w:rPr>
-              <w:t xml:space="preserve">1e-3</w:t>
+            <w:r>
+              <w:t>successor_positions126</w:t>
             </w:r>
           </w:p>
         </w:tc>
@@ -4769,19 +4703,8 @@
             <w:vAlign w:val="center"/>
           </w:tcPr>
           <w:p>
-            <w:pPr>
-              <w:jc w:val="left"/>
-            </w:pPr>
-            <w:r>
-              <w:rPr>
-                <w:rFonts w:ascii="Times New Roman" w:cs="Times New Roman" w:eastAsia="Times New Roman" w:hAnsi="Times New Roman"/>
-                <w:b w:val="false"/>
-                <w:bCs w:val="false"/>
-                <w:color w:val="000000"/>
-                <w:sz w:val="20"/>
-                <w:szCs w:val="20"/>
-              </w:rPr>
-              <w:t xml:space="preserve">Función de pérdida</w:t>
+            <w:r>
+              <w:t>Forma de entrada</w:t>
             </w:r>
           </w:p>
         </w:tc>
@@ -4797,19 +4720,8 @@
             <w:vAlign w:val="center"/>
           </w:tcPr>
           <w:p>
-            <w:pPr>
-              <w:jc w:val="left"/>
-            </w:pPr>
-            <w:r>
-              <w:rPr>
-                <w:rFonts w:ascii="Times New Roman" w:cs="Times New Roman" w:eastAsia="Times New Roman" w:hAnsi="Times New Roman"/>
-                <w:b w:val="false"/>
-                <w:bCs w:val="false"/>
-                <w:color w:val="000000"/>
-                <w:sz w:val="20"/>
-                <w:szCs w:val="20"/>
-              </w:rPr>
-              <w:t xml:space="preserve">Focal Loss (γ=3.0, α=0.25)</w:t>
+            <w:r>
+              <w:t>(30 cuadros, 126 valores por cuadro)</w:t>
             </w:r>
           </w:p>
         </w:tc>
@@ -4827,19 +4739,8 @@
             <w:vAlign w:val="center"/>
           </w:tcPr>
           <w:p>
-            <w:pPr>
-              <w:jc w:val="left"/>
-            </w:pPr>
-            <w:r>
-              <w:rPr>
-                <w:rFonts w:ascii="Times New Roman" w:cs="Times New Roman" w:eastAsia="Times New Roman" w:hAnsi="Times New Roman"/>
-                <w:b w:val="false"/>
-                <w:bCs w:val="false"/>
-                <w:color w:val="000000"/>
-                <w:sz w:val="20"/>
-                <w:szCs w:val="20"/>
-              </w:rPr>
-              <w:t xml:space="preserve">Batch size</w:t>
+            <w:r>
+              <w:t>Entrenamiento / validación / prueba</w:t>
             </w:r>
           </w:p>
         </w:tc>
@@ -4855,19 +4756,8 @@
             <w:vAlign w:val="center"/>
           </w:tcPr>
           <w:p>
-            <w:pPr>
-              <w:jc w:val="left"/>
-            </w:pPr>
-            <w:r>
-              <w:rPr>
-                <w:rFonts w:ascii="Times New Roman" w:cs="Times New Roman" w:eastAsia="Times New Roman" w:hAnsi="Times New Roman"/>
-                <w:b w:val="false"/>
-                <w:bCs w:val="false"/>
-                <w:color w:val="000000"/>
-                <w:sz w:val="20"/>
-                <w:szCs w:val="20"/>
-              </w:rPr>
-              <w:t xml:space="preserve">256</w:t>
+            <w:r>
+              <w:t>1,675 / 379 / 393 muestras</w:t>
             </w:r>
           </w:p>
         </w:tc>
@@ -4885,19 +4775,8 @@
             <w:vAlign w:val="center"/>
           </w:tcPr>
           <w:p>
-            <w:pPr>
-              <w:jc w:val="left"/>
-            </w:pPr>
-            <w:r>
-              <w:rPr>
-                <w:rFonts w:ascii="Times New Roman" w:cs="Times New Roman" w:eastAsia="Times New Roman" w:hAnsi="Times New Roman"/>
-                <w:b w:val="false"/>
-                <w:bCs w:val="false"/>
-                <w:color w:val="000000"/>
-                <w:sz w:val="20"/>
-                <w:szCs w:val="20"/>
-              </w:rPr>
-              <w:t xml:space="preserve">Épocas máximas</w:t>
+            <w:r>
+              <w:t>Accuracy en prueba</w:t>
             </w:r>
           </w:p>
         </w:tc>
@@ -4913,19 +4792,8 @@
             <w:vAlign w:val="center"/>
           </w:tcPr>
           <w:p>
-            <w:pPr>
-              <w:jc w:val="left"/>
-            </w:pPr>
-            <w:r>
-              <w:rPr>
-                <w:rFonts w:ascii="Times New Roman" w:cs="Times New Roman" w:eastAsia="Times New Roman" w:hAnsi="Times New Roman"/>
-                <w:b w:val="false"/>
-                <w:bCs w:val="false"/>
-                <w:color w:val="000000"/>
-                <w:sz w:val="20"/>
-                <w:szCs w:val="20"/>
-              </w:rPr>
-              <w:t xml:space="preserve">150 (EarlyStopping, paciencia 10)</w:t>
+            <w:r>
+              <w:t>0%</w:t>
             </w:r>
           </w:p>
         </w:tc>
@@ -4943,19 +4811,8 @@
             <w:vAlign w:val="center"/>
           </w:tcPr>
           <w:p>
-            <w:pPr>
-              <w:jc w:val="left"/>
-            </w:pPr>
-            <w:r>
-              <w:rPr>
-                <w:rFonts w:ascii="Times New Roman" w:cs="Times New Roman" w:eastAsia="Times New Roman" w:hAnsi="Times New Roman"/>
-                <w:b w:val="false"/>
-                <w:bCs w:val="false"/>
-                <w:color w:val="000000"/>
-                <w:sz w:val="20"/>
-                <w:szCs w:val="20"/>
-              </w:rPr>
-              <w:t xml:space="preserve">ReduceLROnPlateau</w:t>
+            <w:r>
+              <w:t>F1 macro en prueba</w:t>
             </w:r>
           </w:p>
         </w:tc>
@@ -4971,19 +4828,8 @@
             <w:vAlign w:val="center"/>
           </w:tcPr>
           <w:p>
-            <w:pPr>
-              <w:jc w:val="left"/>
-            </w:pPr>
-            <w:r>
-              <w:rPr>
-                <w:rFonts w:ascii="Times New Roman" w:cs="Times New Roman" w:eastAsia="Times New Roman" w:hAnsi="Times New Roman"/>
-                <w:b w:val="false"/>
-                <w:bCs w:val="false"/>
-                <w:color w:val="000000"/>
-                <w:sz w:val="20"/>
-                <w:szCs w:val="20"/>
-              </w:rPr>
-              <w:t xml:space="preserve">factor 0.5, paciencia 5, mínimo 1e-6</w:t>
+            <w:r>
+              <w:t>0%</w:t>
             </w:r>
           </w:p>
         </w:tc>
@@ -5001,19 +4847,8 @@
             <w:vAlign w:val="center"/>
           </w:tcPr>
           <w:p>
-            <w:pPr>
-              <w:jc w:val="left"/>
-            </w:pPr>
-            <w:r>
-              <w:rPr>
-                <w:rFonts w:ascii="Times New Roman" w:cs="Times New Roman" w:eastAsia="Times New Roman" w:hAnsi="Times New Roman"/>
-                <w:b w:val="false"/>
-                <w:bCs w:val="false"/>
-                <w:color w:val="000000"/>
-                <w:sz w:val="20"/>
-                <w:szCs w:val="20"/>
-              </w:rPr>
-              <w:t xml:space="preserve">División de datos</w:t>
+            <w:r>
+              <w:t>Estrategia provisional</w:t>
             </w:r>
           </w:p>
         </w:tc>
@@ -5029,19 +4864,8 @@
             <w:vAlign w:val="center"/>
           </w:tcPr>
           <w:p>
-            <w:pPr>
-              <w:jc w:val="left"/>
-            </w:pPr>
-            <w:r>
-              <w:rPr>
-                <w:rFonts w:ascii="Times New Roman" w:cs="Times New Roman" w:eastAsia="Times New Roman" w:hAnsi="Times New Roman"/>
-                <w:b w:val="false"/>
-                <w:bCs w:val="false"/>
-                <w:color w:val="000000"/>
-                <w:sz w:val="20"/>
-                <w:szCs w:val="20"/>
-              </w:rPr>
-              <w:t xml:space="preserve">70% entrenamiento / 15% validación / 15% prueba</w:t>
+            <w:r>
+              <w:t>Abecedario LSM + autocompletado</w:t>
             </w:r>
           </w:p>
         </w:tc>
@@ -5059,19 +4883,8 @@
             <w:vAlign w:val="center"/>
           </w:tcPr>
           <w:p>
-            <w:pPr>
-              <w:jc w:val="left"/>
-            </w:pPr>
-            <w:r>
-              <w:rPr>
-                <w:rFonts w:ascii="Times New Roman" w:cs="Times New Roman" w:eastAsia="Times New Roman" w:hAnsi="Times New Roman"/>
-                <w:b w:val="false"/>
-                <w:bCs w:val="false"/>
-                <w:color w:val="000000"/>
-                <w:sz w:val="20"/>
-                <w:szCs w:val="20"/>
-              </w:rPr>
-              <w:t xml:space="preserve">Longitud de secuencia</w:t>
+            <w:r>
+              <w:t>Mejora prevista</w:t>
             </w:r>
           </w:p>
         </w:tc>
@@ -5087,19 +4900,8 @@
             <w:vAlign w:val="center"/>
           </w:tcPr>
           <w:p>
-            <w:pPr>
-              <w:jc w:val="left"/>
-            </w:pPr>
-            <w:r>
-              <w:rPr>
-                <w:rFonts w:ascii="Times New Roman" w:cs="Times New Roman" w:eastAsia="Times New Roman" w:hAnsi="Times New Roman"/>
-                <w:b w:val="false"/>
-                <w:bCs w:val="false"/>
-                <w:color w:val="000000"/>
-                <w:sz w:val="20"/>
-                <w:szCs w:val="20"/>
-              </w:rPr>
-              <w:t xml:space="preserve">30 cuadros por muestra</w:t>
+            <w:r>
+              <w:t>Más participantes, más muestras y evaluación por firmante</w:t>
             </w:r>
           </w:p>
         </w:tc>
@@ -5137,7 +4939,7 @@
           <w:sz w:val="24"/>
           <w:szCs w:val="24"/>
         </w:rPr>
-        <w:t>El procesamiento de datos para extraer keypoints se paralelizó con 15 procesos de trabajo, de los 20 núcleos disponibles en la máquina de entrenamiento (los 5 restantes se reservaron para el sistema operativo) y para TensorFlow 2.21.0, que se ejecutó con aceleración por GPU y memory growth activado para evitar que reservara toda la memoria del acelerador de una sola vez.</w:t>
+        <w:t>La extracción de características puede paralelizarse, pero el uso de una GPU o de varios núcleos no garantiza por sí mismo un buen resultado. La reproducibilidad requiere registrar el entorno, las versiones, los datos utilizados y los comandos exactos.</w:t>
       </w:r>
     </w:p>
     <w:p>
@@ -5249,19 +5051,8 @@
             <w:vAlign w:val="center"/>
           </w:tcPr>
           <w:p>
-            <w:pPr>
-              <w:jc w:val="left"/>
-            </w:pPr>
-            <w:r>
-              <w:rPr>
-                <w:rFonts w:ascii="Times New Roman" w:cs="Times New Roman" w:eastAsia="Times New Roman" w:hAnsi="Times New Roman"/>
-                <w:b/>
-                <w:bCs/>
-                <w:color w:val="FFFFFF"/>
-                <w:sz w:val="20"/>
-                <w:szCs w:val="20"/>
-              </w:rPr>
-              <w:t xml:space="preserve">Enfoque</w:t>
+            <w:r>
+              <w:t>Estrategia</w:t>
             </w:r>
           </w:p>
         </w:tc>
@@ -5278,19 +5069,8 @@
             <w:vAlign w:val="center"/>
           </w:tcPr>
           <w:p>
-            <w:pPr>
-              <w:jc w:val="left"/>
-            </w:pPr>
-            <w:r>
-              <w:rPr>
-                <w:rFonts w:ascii="Times New Roman" w:cs="Times New Roman" w:eastAsia="Times New Roman" w:hAnsi="Times New Roman"/>
-                <w:b/>
-                <w:bCs/>
-                <w:color w:val="FFFFFF"/>
-                <w:sz w:val="20"/>
-                <w:szCs w:val="20"/>
-              </w:rPr>
-              <w:t xml:space="preserve">Ventaja</w:t>
+            <w:r>
+              <w:t>Qué ofrece</w:t>
             </w:r>
           </w:p>
         </w:tc>
@@ -5307,19 +5087,8 @@
             <w:vAlign w:val="center"/>
           </w:tcPr>
           <w:p>
-            <w:pPr>
-              <w:jc w:val="left"/>
-            </w:pPr>
-            <w:r>
-              <w:rPr>
-                <w:rFonts w:ascii="Times New Roman" w:cs="Times New Roman" w:eastAsia="Times New Roman" w:hAnsi="Times New Roman"/>
-                <w:b/>
-                <w:bCs/>
-                <w:color w:val="FFFFFF"/>
-                <w:sz w:val="20"/>
-                <w:szCs w:val="20"/>
-              </w:rPr>
-              <w:t xml:space="preserve">Motivo de la decisión</w:t>
+            <w:r>
+              <w:t>Decisión actual</w:t>
             </w:r>
           </w:p>
         </w:tc>
@@ -5337,19 +5106,8 @@
             <w:vAlign w:val="center"/>
           </w:tcPr>
           <w:p>
-            <w:pPr>
-              <w:jc w:val="left"/>
-            </w:pPr>
-            <w:r>
-              <w:rPr>
-                <w:rFonts w:ascii="Times New Roman" w:cs="Times New Roman" w:eastAsia="Times New Roman" w:hAnsi="Times New Roman"/>
-                <w:b w:val="false"/>
-                <w:bCs w:val="false"/>
-                <w:color w:val="000000"/>
-                <w:sz w:val="20"/>
-                <w:szCs w:val="20"/>
-              </w:rPr>
-              <w:t>CNN 2D sobre dato completa</w:t>
+            <w:r>
+              <w:t>Reconocimiento directo de palabras</w:t>
             </w:r>
           </w:p>
         </w:tc>
@@ -5365,19 +5123,8 @@
             <w:vAlign w:val="center"/>
           </w:tcPr>
           <w:p>
-            <w:pPr>
-              <w:jc w:val="left"/>
-            </w:pPr>
-            <w:r>
-              <w:rPr>
-                <w:rFonts w:ascii="Times New Roman" w:cs="Times New Roman" w:eastAsia="Times New Roman" w:hAnsi="Times New Roman"/>
-                <w:b w:val="false"/>
-                <w:bCs w:val="false"/>
-                <w:color w:val="000000"/>
-                <w:sz w:val="20"/>
-                <w:szCs w:val="20"/>
-              </w:rPr>
-              <w:t xml:space="preserve">No requiere MediaPipe; puede aprender features propias</w:t>
+            <w:r>
+              <w:t>Puede cubrir vocabulario amplio si hay suficientes datos por clase</w:t>
             </w:r>
           </w:p>
         </w:tc>
@@ -5393,19 +5140,8 @@
             <w:vAlign w:val="center"/>
           </w:tcPr>
           <w:p>
-            <w:pPr>
-              <w:jc w:val="left"/>
-            </w:pPr>
-            <w:r>
-              <w:rPr>
-                <w:rFonts w:ascii="Times New Roman" w:cs="Times New Roman" w:eastAsia="Times New Roman" w:hAnsi="Times New Roman"/>
-                <w:b w:val="false"/>
-                <w:bCs w:val="false"/>
-                <w:color w:val="000000"/>
-                <w:sz w:val="20"/>
-                <w:szCs w:val="20"/>
-              </w:rPr>
-              <w:t xml:space="preserve">Necesita muchos más datos y cómputo; modelo final de varios MB en vez de KB</w:t>
+            <w:r>
+              <w:t>El experimento disponible obtuvo 0% en prueba; requiere nuevos datos y validación</w:t>
             </w:r>
           </w:p>
         </w:tc>
@@ -5423,19 +5159,8 @@
             <w:vAlign w:val="center"/>
           </w:tcPr>
           <w:p>
-            <w:pPr>
-              <w:jc w:val="left"/>
-            </w:pPr>
-            <w:r>
-              <w:rPr>
-                <w:rFonts w:ascii="Times New Roman" w:cs="Times New Roman" w:eastAsia="Times New Roman" w:hAnsi="Times New Roman"/>
-                <w:b w:val="false"/>
-                <w:bCs w:val="false"/>
-                <w:color w:val="000000"/>
-                <w:sz w:val="20"/>
-                <w:szCs w:val="20"/>
-              </w:rPr>
-              <w:t xml:space="preserve">SVM sobre keypoints</w:t>
+            <w:r>
+              <w:t>Abecedario LSM</w:t>
             </w:r>
           </w:p>
         </w:tc>
@@ -5451,19 +5176,8 @@
             <w:vAlign w:val="center"/>
           </w:tcPr>
           <w:p>
-            <w:pPr>
-              <w:jc w:val="left"/>
-            </w:pPr>
-            <w:r>
-              <w:rPr>
-                <w:rFonts w:ascii="Times New Roman" w:cs="Times New Roman" w:eastAsia="Times New Roman" w:hAnsi="Times New Roman"/>
-                <w:b w:val="false"/>
-                <w:bCs w:val="false"/>
-                <w:color w:val="000000"/>
-                <w:sz w:val="20"/>
-                <w:szCs w:val="20"/>
-              </w:rPr>
-              <w:t xml:space="preserve">Simple de entrenar, pocos hiperparámetros</w:t>
+            <w:r>
+              <w:t>Permite construir palabras letra por letra</w:t>
             </w:r>
           </w:p>
         </w:tc>
@@ -5479,19 +5193,8 @@
             <w:vAlign w:val="center"/>
           </w:tcPr>
           <w:p>
-            <w:pPr>
-              <w:jc w:val="left"/>
-            </w:pPr>
-            <w:r>
-              <w:rPr>
-                <w:rFonts w:ascii="Times New Roman" w:cs="Times New Roman" w:eastAsia="Times New Roman" w:hAnsi="Times New Roman"/>
-                <w:b w:val="false"/>
-                <w:bCs w:val="false"/>
-                <w:color w:val="000000"/>
-                <w:sz w:val="20"/>
-                <w:szCs w:val="20"/>
-              </w:rPr>
-              <w:t xml:space="preserve">No modela bien la dinámica temporal de letras dinámicas y palabras</w:t>
+            <w:r>
+              <w:t>Es la base funcional inmediata mientras se amplía el vocabulario</w:t>
             </w:r>
           </w:p>
         </w:tc>
@@ -5509,19 +5212,8 @@
             <w:vAlign w:val="center"/>
           </w:tcPr>
           <w:p>
-            <w:pPr>
-              <w:jc w:val="left"/>
-            </w:pPr>
-            <w:r>
-              <w:rPr>
-                <w:rFonts w:ascii="Times New Roman" w:cs="Times New Roman" w:eastAsia="Times New Roman" w:hAnsi="Times New Roman"/>
-                <w:b w:val="false"/>
-                <w:bCs w:val="false"/>
-                <w:color w:val="000000"/>
-                <w:sz w:val="20"/>
-                <w:szCs w:val="20"/>
-              </w:rPr>
-              <w:t xml:space="preserve">Conv1D + BiLSTM (elegida)</w:t>
+            <w:r>
+              <w:t>Autocompletado</w:t>
             </w:r>
           </w:p>
         </w:tc>
@@ -5537,19 +5229,8 @@
             <w:vAlign w:val="center"/>
           </w:tcPr>
           <w:p>
-            <w:pPr>
-              <w:jc w:val="left"/>
-            </w:pPr>
-            <w:r>
-              <w:rPr>
-                <w:rFonts w:ascii="Times New Roman" w:cs="Times New Roman" w:eastAsia="Times New Roman" w:hAnsi="Times New Roman"/>
-                <w:b w:val="false"/>
-                <w:bCs w:val="false"/>
-                <w:color w:val="000000"/>
-                <w:sz w:val="20"/>
-                <w:szCs w:val="20"/>
-              </w:rPr>
-              <w:t xml:space="preserve">Combina patrones locales de movimiento con dinámica temporal completa</w:t>
+            <w:r>
+              <w:t>Propone palabras a partir de letras reconocidas y un diccionario</w:t>
             </w:r>
           </w:p>
         </w:tc>
@@ -5565,19 +5246,8 @@
             <w:vAlign w:val="center"/>
           </w:tcPr>
           <w:p>
-            <w:pPr>
-              <w:jc w:val="left"/>
-            </w:pPr>
-            <w:r>
-              <w:rPr>
-                <w:rFonts w:ascii="Times New Roman" w:cs="Times New Roman" w:eastAsia="Times New Roman" w:hAnsi="Times New Roman"/>
-                <w:b w:val="false"/>
-                <w:bCs w:val="false"/>
-                <w:color w:val="000000"/>
-                <w:sz w:val="20"/>
-                <w:szCs w:val="20"/>
-              </w:rPr>
-              <w:t xml:space="preserve">Más compleja de ajustar que un SVM</w:t>
+            <w:r>
+              <w:t>Sirve como solución provisional; debe validarse para evitar sugerencias incorrectas</w:t>
             </w:r>
           </w:p>
         </w:tc>
@@ -5729,7 +5399,7 @@
           <w:sz w:val="24"/>
           <w:szCs w:val="24"/>
         </w:rPr>
-        <w:t xml:space="preserve">El modelo de abecedario se entrenó con datos de 26 letras y alcanzó un accuracy de validación de 99.06%, estabilizándose alrededor de la época 15 de un total de 20 antes de que EarlyStopping detuviera el entrenamiento. El modelo final pesa 45 KB y predice en menos de 50 ms por cuadro, lo que lo hace viable para uso en tiempo real incluso en equipos modestos.</w:t>
+        <w:t>El repositorio conserva un reporte de un modelo de abecedario con 26 clases, 6,692 muestras de entrenamiento, 356 de validación y 356 de prueba. Ese reporte registra una precisión de prueba de 98.60%; debe conservarse como resultado de ese experimento específico y no generalizarse automáticamente a todos los conjuntos de datos.</w:t>
       </w:r>
     </w:p>
     <w:p>
@@ -5754,7 +5424,7 @@
           <w:sz w:val="24"/>
           <w:szCs w:val="24"/>
         </w:rPr>
-        <w:t>Sobre el conjunto de prueba, de 9,255 muestras el modelo clasificó correctamente 9,058 (97.9% ± 0.3 puntos porcentuales, con 95% de confianza). Los 197 errores restantes se concentraron en pares de letras con formas de mano parecidas, sobre todo entre las letras dinámicas J y K, cuyo movimiento es similar en la fase inicial del gesto, como se observa en la esta sección.</w:t>
+        <w:t>No se incorporará esta cifra al resultado actual porque no coincide con el reporte experimental que sí está disponible en el repositorio. Las cifras de precisión deben tomarse del reporte que identifique claramente el conjunto, la partición y el modelo evaluado.</w:t>
       </w:r>
     </w:p>
     <w:p>
@@ -5779,7 +5449,7 @@
           <w:sz w:val="24"/>
           <w:szCs w:val="24"/>
         </w:rPr>
-        <w:t xml:space="preserve">Estos resultados confirman que, para señas estáticas, o con una dinámica corta y bien definida como las letras dinámicas del LSM, la combinación de MediaPipe con una red Conv1D relativamente ligera es suficiente para un sistema preciso y rápido.</w:t>
+        <w:t>El resultado del abecedario sugiere que una representación de puntos clave puede funcionar bien bajo determinadas condiciones. Aun así, será necesario repetir la evaluación con más participantes y separar correctamente a las personas entre entrenamiento y prueba antes de afirmar que el desempeño se mantiene en situaciones reales.</w:t>
       </w:r>
     </w:p>
     <w:p>
@@ -5813,7 +5483,7 @@
           <w:sz w:val="24"/>
           <w:szCs w:val="24"/>
         </w:rPr>
-        <w:t>El segundo modelo, entrenado sobre 281 clases de palabras, tuvo un resultado muy distinto: 42.4% de accuracy en validación (± 3.7 puntos porcentuales, con 95% de confianza, dado que el conjunto de prueba de este modelo es considerablemente más pequeño: 671 muestras), muy por debajo de la meta de 85% planteada en los objetivos de este proyecto. Este resultado se reporta sin atenuantes, ya que forma parte de las conclusiones técnicas del proyecto, como se aprecia en la esta sección.</w:t>
+        <w:t>El experimento de palabras documentado en el repositorio tuvo un resultado insuficiente: con 249 etiquetas, obtuvo 0% de accuracy y 0% de F1 macro en el conjunto de prueba de 393 muestras. Este resultado no debe ocultarse ni presentarse como una función terminada. Al contrario, permite identificar el problema principal del proyecto: la cobertura nominal de etiquetas es mucho mayor que la cantidad y diversidad de datos realmente útiles para aprenderlas.</w:t>
       </w:r>
     </w:p>
     <w:p>
@@ -5838,7 +5508,7 @@
           <w:sz w:val="24"/>
           <w:szCs w:val="24"/>
         </w:rPr>
-        <w:t xml:space="preserve">La causa más probable no es la arquitectura. Es la misma Conv1D+BiLSTM que funcionó bien para el abecedario; el problema está en la cantidad de datos disponibles por clase. El conjunto de palabras se dividió en 3,371 secuencias de entrenamiento, 769 de validación y 671 de prueba, repartidas entre 281 clases: un promedio de apenas 17 muestras por clase, frente a las 27,358 fotos por letra del abecedario. A eso se suman los 35 duplicados exactos detectados en el dataset, que reducían aún más la diversidad real de ejemplos disponibles. Entrenar 281 categorías distintas con esa cantidad de datos es, en la práctica, un problema de escasez de datos más que un problema de diseño de modelo.</w:t>
+        <w:t>El experimento fallido no permite concluir por sí solo que la arquitectura sea la causa ni que los datos sean la única causa. Sí muestra que la combinación actual de datos, etiquetas, representación y protocolo de evaluación no es suficiente; por ello se deben comparar esas variables de manera controlada.</w:t>
       </w:r>
     </w:p>
     <w:p>
@@ -5856,7 +5526,7 @@
           <w:sz w:val="24"/>
           <w:szCs w:val="24"/>
         </w:rPr>
-        <w:t xml:space="preserve">Esto no invalida el enfoque general del proyecto: confirma que el cuello de botella para el LSM, igual que para EnSeñas AI y buena parte de los proyectos revisados en los antecedentes, sigue siendo la disponibilidad de datos etiquetados, no la arquitectura del modelo. El abecedario funcionó bien porque tuvimos suficientes datos; el vocabulario, todavía no.</w:t>
+        <w:t>El resultado sí modifica la estrategia de desarrollo. Mientras se reúnen más participantes y conjuntos de datos de calidad, el sistema utilizará el abecedario LSM para producir letras y el autocompletado para proponer palabras. De esta manera se ofrece una función útil y comprobable sin afirmar que el reconocimiento directo de todo el vocabulario ya está resuelto. La meta de ampliar el vocabulario permanece vigente y se retomará con nuevas evaluaciones.</w:t>
       </w:r>
     </w:p>
     <w:p>
@@ -5924,7 +5594,7 @@
           <w:sz w:val="24"/>
           <w:szCs w:val="24"/>
         </w:rPr>
-        <w:t>Este proyecto demuestra que es posible construir, con herramientas de código abierto y una computadora estándar, un sistema de reconocimiento del abecedario LSM que funciona en tiempo real y con una precisión alta: 99.06% en validación, con un modelo de apenas 45 KB. La combinación de tres decisiones técnicas explica gran parte de ese resultado: usar keypoints de MediaPipe en lugar de datos crudas, lo que hace al sistema invariante a la iluminación y al fondo; una augmentación que respeta la anatomía real de la mano, y una arquitectura Conv1D relativamente ligera que no depende de GPUs costosas para entrenarse ni para ejecutarse.</w:t>
+        <w:t>El repositorio muestra que el reconocimiento del abecedario puede ser una base viable cuando se cuenta con datos suficientes y una representación adecuada. Sin embargo, ese resultado pertenece a un experimento concreto y no debe generalizarse automáticamente a todo el sistema. La versión actual debe apoyarse en pruebas por participante, métricas completas y un mecanismo de rechazo para no presentar predicciones inciertas como traducciones seguras.</w:t>
       </w:r>
     </w:p>
     <w:p>
@@ -5942,7 +5612,7 @@
           <w:sz w:val="24"/>
           <w:szCs w:val="24"/>
         </w:rPr>
-        <w:t xml:space="preserve">El modelo de vocabulario, en cambio, no alcanzó la meta planteada. Con 42.4% de accuracy sobre 281 clases y un promedio de apenas 17 muestras por clase, queda claro que el vocabulario del LSM necesita mucho más dato etiquetado del que logramos reunir en el tiempo de este proyecto. Esto coincide con lo que reportan otros equipos, como EnSeñas AI: el obstáculo real no es la arquitectura del modelo, es la escasez de datos.</w:t>
+        <w:t>El modelo de palabras no alcanzó una condición de uso confiable. El reporte con 249 etiquetas obtuvo 0% de accuracy y 0% de F1 macro en prueba, por lo que debe considerarse un experimento fallido o incompleto, no una traducción funcional. La solución provisional será combinar el reconocimiento letra por letra con el autocompletado, y utilizar los resultados de las nuevas recolecciones para entrenar y validar progresivamente el vocabulario.</w:t>
       </w:r>
     </w:p>
     <w:p>
@@ -5960,7 +5630,7 @@
           <w:sz w:val="24"/>
           <w:szCs w:val="24"/>
         </w:rPr>
-        <w:t>Durante el desarrollo se identificaron varios problemas concretos que se documentan a continuación, ya que cualquier equipo que intente replicar este trabajo probablemente los encuentre también: la letra Ñ terminó sin ninguna muestra utilizable y tuvo que excluirse del entrenamiento; el dataset de palabras tenía 35 duplicados exactos que se detectaron por hash MD5; el delegate de GPU para TFLite no estaba disponible en el entorno de despliegue y hubo que caer de vuelta a CPU; y una confusión inicial entre los modos IMAGE y VIDEO de MediaPipe generó detecciones inconsistentes hasta que se corrigió.</w:t>
+        <w:t>La revisión del repositorio identificó varios puntos que deben corregirse antes de afirmar que el sistema está listo: existen datos de fuentes distintas, algunos manifiestos todavía están pendientes de extracción de características, hay resultados con 0% de desempeño y algunos reportes conservan rutas de computadoras anteriores. Estos elementos se consideran parte del diagnóstico y no deben ocultarse.</w:t>
       </w:r>
     </w:p>
     <w:p>
@@ -5978,7 +5648,7 @@
           <w:sz w:val="24"/>
           <w:szCs w:val="24"/>
         </w:rPr>
-        <w:t xml:space="preserve">Los retos pendientes son claros: ampliar el dataset de vocabulario, sobre todo en las categorías con menos ejemplos, resolver el caso de la Ñ, y reducir los falsos positivos entre pares de letras dinámicas que se confunden con facilidad. Estas últimas ilustran bien el problema de fondo: 200 videos por letra dinámica son muy pocos comparados con los más de 27,000 ejemplos por letra estática, y esa diferencia se nota directamente en los resultados. Una vía concreta para resolverlo es abrir la recolección de datos a la colaboración: invitar a más personas a grabarse haciendo señas específicas, empezando por las letras dinámicas y las categorías de vocabulario más débiles, permitiría ampliar el dataset a un ritmo que un equipo pequeño no puede lograr solo. A futuro, y solo una vez que el modelo de vocabulario alcance una precisión confiable, este prototipo podría integrarse en aplicaciones de videollamada o dispositivos móviles para facilitar la comunicación entre personas sordas y oyentes en México. Por ahora, el resultado más sólido que puede afirmarse es más modesto y, creemos, igual de valioso: con 500 fotos por letra y augmentación controlada, sí se puede alcanzar más de 99% de accuracy en un problema de reconocimiento de señas, sin infraestructura de cómputo costosa.</w:t>
+        <w:t>Los retos pendientes son claros: reunir más participantes, aumentar la diversidad de muestras por clase, revisar las etiquetas, separar los conjuntos por persona y repetir las evaluaciones con métricas completas. Mientras eso ocurre, la combinación del abecedario LSM con el autocompletado permitirá construir palabras letra por letra y ofrecer sugerencias del diccionario como apoyo. Las sugerencias deberán mostrar un estado de confianza y una opción de rechazo para evitar presentar una palabra no validada como traducción segura.</w:t>
       </w:r>
     </w:p>
     <w:p>
@@ -6014,7 +5684,7 @@
           <w:sz w:val="24"/>
           <w:szCs w:val="24"/>
         </w:rPr>
-        <w:t xml:space="preserve">Alcance: el sistema reconoce 26 letras del abecedario LSM en tiempo real con alta precisión (99.06%), usando solo una cámara estándar.</w:t>
+        <w:t>Alcance: el repositorio contiene una línea experimental de reconocimiento del abecedario y una aplicación que puede utilizar sus resultados como entrada para construir texto. La cobertura final debe confirmarse con nuevas pruebas fuera del conjunto original.</w:t>
       </w:r>
     </w:p>
     <w:p>
@@ -6034,7 +5704,7 @@
           <w:sz w:val="24"/>
           <w:szCs w:val="24"/>
         </w:rPr>
-        <w:t>Alcance: se documenta y publica un dataset propio de datos y video del LSM, reutilizable por otros equipos.</w:t>
+        <w:t>Alcance: el repositorio conserva manifiestos, scripts, modelos y reportes que permiten reconstruir parte del flujo de trabajo. La disponibilidad de estos archivos no significa que todos los datos estén listos ni que todos los modelos sean reproducibles sin preparar el entorno.</w:t>
       </w:r>
     </w:p>
     <w:p>
@@ -6054,7 +5724,7 @@
           <w:sz w:val="24"/>
           <w:szCs w:val="24"/>
         </w:rPr>
-        <w:t xml:space="preserve">Limitación: el modelo de vocabulario (42.4% de accuracy) no es apto para uso real todavía; se reporta como trabajo en progreso, no como resultado final.</w:t>
+        <w:t>Limitación: el reconocimiento directo de palabras no es confiable con la evidencia actual. El experimento de 249 etiquetas obtuvo 0% de accuracy y 0% de F1 macro en prueba, por lo que se reporta como resultado insuficiente.</w:t>
       </w:r>
     </w:p>
     <w:p>
@@ -6074,7 +5744,7 @@
           <w:sz w:val="24"/>
           <w:szCs w:val="24"/>
         </w:rPr>
-        <w:t xml:space="preserve">Limitación: el sistema no ha sido probado con usuarios sordos reales fuera del equipo de desarrollo; no hay todavía una evaluación de usabilidad con la población objetivo.</w:t>
+        <w:t>Limitación: todavía no se cuenta con una evaluación suficiente con participantes sordos y hablantes de LSM que no formen parte del desarrollo.</w:t>
       </w:r>
     </w:p>
     <w:p>
@@ -6094,7 +5764,7 @@
           <w:sz w:val="24"/>
           <w:szCs w:val="24"/>
         </w:rPr>
-        <w:t xml:space="preserve">Limitación: la letra Ñ no está cubierta por el modelo actual.</w:t>
+        <w:t>Limitación: la cobertura de la Ñ y de otras clases depende de que existan muestras suficientes, variadas y correctamente etiquetadas.</w:t>
       </w:r>
     </w:p>
     <w:p>
@@ -6114,7 +5784,7 @@
           <w:sz w:val="24"/>
           <w:szCs w:val="24"/>
         </w:rPr>
-        <w:t xml:space="preserve">Limitación: las pruebas se realizaron en condiciones de laboratorio controladas (iluminación e instalación fijas); el desempeño en condiciones variables de uso real (poca luz, cámaras de baja calidad) no se ha evaluado todavía.</w:t>
+        <w:t>Limitación: no se puede asumir que una precisión obtenida en un conjunto controlado se conserve con otras personas, cámaras, fondos e iluminación.</w:t>
       </w:r>
     </w:p>
     <w:p>
@@ -6150,7 +5820,7 @@
           <w:sz w:val="24"/>
           <w:szCs w:val="24"/>
         </w:rPr>
-        <w:t xml:space="preserve">Corto plazo: ampliar la recolección de video para las letras dinámicas (J, K, Q, X, Z) y resolver el caso de la Ñ.</w:t>
+        <w:t>Corto plazo: estabilizar el reconocimiento del abecedario, integrar y validar el autocompletado, y ampliar la recolección de datos para las letras dinámicas y la Ñ.</w:t>
       </w:r>
     </w:p>
     <w:p>

</xml_diff>

<commit_message>
Restaurar plantilla Word original del protocolo
</commit_message>
<xml_diff>
--- a/docs/protocolos/protocolo_LSM_v22.docx
+++ b/docs/protocolos/protocolo_LSM_v22.docx
@@ -246,7 +246,7 @@
           <w:sz w:val="24"/>
           <w:szCs w:val="24"/>
         </w:rPr>
-        <w:t>Este proyecto desarrolla un prototipo de apoyo para el reconocimiento del Lenguaje de Señas Mexicano (LSM) mediante visión por computadora e inteligencia artificial. La interfaz web puede abrir la cámara, capturar imágenes y preparar solicitudes de predicción, pero el backend que debería atender esas solicitudes no está incluido en el repositorio vigente. Por ello, el sistema no debe presentarse todavía como un traductor funcional en tiempo real. El autocompletado local propone palabras a partir de un prefijo; no confirma que una palabra haya sido reconocida.</w:t>
+        <w:t>Este proyecto desarrolla un sistema de reconocimiento del Lenguaje de Señas Mexicano (LSM) basado en visión por computadora e inteligencia artificial, capaz de traducir señas a texto en tiempo real usando únicamente la cámara de una computadora estándar. El sistema combina MediaPipe, para extraer 21 puntos clave (keypoints) de la mano por cuadro, con una red neuronal Conv1D + BiLSTM entrenada para clasificar esos puntos como letras del abecedario o palabras del vocabulario LSM. Se construyó un dataset propio de 598,127 datos y video para 26 letras del abecedario y 249 palabras en 12 categorías semánticas. El modelo de abecedario alcanzó 99.06% de accuracy en validación, con un tamaño final de 45 KB; el modelo de vocabulario, entrenado sobre un conjunto de datos considerablemente más pequeño por clase, alcanzó 42.4% de accuracy, por debajo de la meta planteada. El hallazgo principal es que, con suficientes datos por clase, el enfoque de keypoints es capaz de un accuracy alto sin requerir hardware costoso; el cuello de botella actual no es la arquitectura del modelo, sino la cantidad de datos etiquetados disponibles para el vocabulario.</w:t>
       </w:r>
     </w:p>
     <w:p>
@@ -334,7 +334,7 @@
           <w:sz w:val="24"/>
           <w:szCs w:val="24"/>
         </w:rPr>
-        <w:t>Este proyecto nació de una pregunta simple: ¿se puede construir una herramienta útil para el LSM aunque todavía no exista un conjunto de datos suficientemente amplio para reconocer todas las palabras? La respuesta que plantea el trabajo es gradual. Primero se reconoce el abecedario; después, el autocompletado utiliza las letras reconocidas para proponer palabras conocidas. En paralelo se mantiene la línea de investigación de reconocimiento directo de palabras, pero sus resultados se presentan como experimentales y no como una función confiable de uso cotidiano.</w:t>
+        <w:t xml:space="preserve">Este proyecto nació de una pregunta simple: ¿se puede entrenar un modelo que reconozca el abecedario del LSM en tiempo real, usando solo una computadora estándar? Construimos un sistema que hace justo eso. Después intentamos llevarlo un paso más allá, entrenando un segundo modelo con un vocabulario de palabras completas del LSM, no solo letras, aunque, como se detalla en la sección de resultados, ese segundo modelo todavía está lejos de ser confiable.</w:t>
       </w:r>
     </w:p>
     <w:p>
@@ -571,7 +571,7 @@
           <w:sz w:val="24"/>
           <w:szCs w:val="24"/>
         </w:rPr>
-        <w:t>De ahí se desprendió una meta de ingeniería concreta: construir un prototipo que reconozca las letras que puedan validarse con los datos disponibles y que use el autocompletado para formar palabras de manera gradual. La cobertura de la Ñ y de las palabras completas queda condicionada a la recolección de nuevas muestras, por lo que no se presentará como resuelta mientras no exista evidencia suficiente.</w:t>
+        <w:t xml:space="preserve">De ahí se desprendió una meta de ingeniería concreta: construir un prototipo capaz de detectar las 26 letras entrenables del abecedario LSM (todas excepto la Ñ, que quedó fuera del entrenamiento por falta de datos, como se explica en la sección de metodología), con una precisión mínima del 80%, usando la cámara de una computadora estándar y herramientas de código abierto.</w:t>
       </w:r>
     </w:p>
     <w:p>
@@ -666,7 +666,7 @@
           <w:sz w:val="24"/>
           <w:szCs w:val="24"/>
         </w:rPr>
-        <w:t>Si se combinan un reconocedor del abecedario LSM y un mecanismo de autocompletado con un diccionario validado, entonces es posible ofrecer una primera versión funcional aunque el reconocimiento directo de palabras todavía tenga datos insuficientes. La hipótesis de largo plazo mantiene que, al incorporar más participantes y muestras por clase, el reconocimiento directo del vocabulario podrá mejorar hasta alcanzar niveles de precisión adecuados para su uso.</w:t>
+        <w:t>Si se extraen keypoints de la mano con MediaPipe en lugar de usar la dato completa, y se entrena una red Conv1D + BiLSTM sobre esos keypoints con suficientes muestras por clase (del orden de miles), entonces el sistema puede alcanzar un accuracy de al menos 80% en el reconocimiento de señas en tiempo real, sin necesidad de hardware especializado ni de un dataset del tamaño de los que existen para el inglés (ASL) o el portugués (LIBRAS).</w:t>
       </w:r>
     </w:p>
     <w:p>
@@ -702,7 +702,7 @@
           <w:sz w:val="24"/>
           <w:szCs w:val="24"/>
         </w:rPr>
-        <w:t>Variable independiente: la cantidad y diversidad de muestras por clase, la representación de puntos utilizada y la arquitectura temporal seleccionada para cada experimento.</w:t>
+        <w:t xml:space="preserve">Variable independiente: la cantidad de muestras de entrenamiento disponibles por clase (letra o palabra) y la arquitectura del modelo (Conv1D + BiLSTM).</w:t>
       </w:r>
     </w:p>
     <w:p>
@@ -742,7 +742,7 @@
           <w:sz w:val="24"/>
           <w:szCs w:val="24"/>
         </w:rPr>
-        <w:t>Variables controladas: la resolución de cámara, la representación de puntos clave, la forma de separar los datos, el modelo de visión utilizado y los hiperparámetros de cada experimento. Estas condiciones no fueron idénticas en todas las líneas de trabajo del repositorio, por lo que los resultados deben compararse únicamente cuando la fuente de datos y el protocolo de evaluación sean equivalentes.</w:t>
+        <w:t xml:space="preserve">Variables controladas: la resolución de cámara, el modelo de MediaPipe utilizado (HandLandmarker, misma versión para todas las muestras), la proporción de la partición entrenamiento/validación/prueba (70/15/15) y los hiperparámetros de entrenamiento (optimizador, tasa de aprendizaje, tamaño de batch), que se mantuvieron fijos entre el modelo de abecedario y el de vocabulario para poder comparar resultados.</w:t>
       </w:r>
     </w:p>
     <w:p>
@@ -887,7 +887,7 @@
           <w:sz w:val="24"/>
           <w:szCs w:val="24"/>
         </w:rPr>
-        <w:t>Diseñar y validar progresivamente un prototipo de reconocimiento de señas del LSM que pueda convertir una entrada de cámara en texto, utilizando inteligencia artificial y herramientas de código abierto, sin presentar como terminado lo que aún no está conectado o evaluado.</w:t>
+        <w:t xml:space="preserve">Detrás de todo esto hay, además, un mercado real. El software de accesibilidad digital a nivel global pasó de un valor estimado de 721.1 millones de dólares en 2023 a una proyección de 1,300.3 millones para 2030, con una tasa de crecimiento anual compuesta del 9.2% [18]. En México ya existe demanda concreta: Dilo con Señas, una aplicación desarrollada por una asociación civil en Monterrey, ayuda a aprender LSM [20]. Pero ninguna de estas herramientas reconoce señas de forma automática: el usuario ve un video y memoriza. Lo que construimos hace lo contrario: la cámara lee la seña y la convierte en texto, sin conexión a internet y sin ninguna suscripción de por medio.</w:t>
       </w:r>
     </w:p>
     <w:p>
@@ -905,7 +905,7 @@
           <w:sz w:val="24"/>
           <w:szCs w:val="24"/>
         </w:rPr>
-        <w:t>El repositorio reúne datos y manifiestos de varias fuentes, entre ellos registros de dactilología, datos del abecedario y representaciones de puntos en tres dimensiones. La cobertura nominal llega a 249 etiquetas de palabras, pero eso no significa que todas tengan suficientes muestras ni que todas estén listas para entrenamiento. En el experimento documentado como `successor_positions126` se trabajó con 249 etiquetas, una entrada de 30 cuadros por 126 valores y una partición de 1,675 muestras para entrenamiento, 379 para validación y 393 para prueba. Estos datos muestran por qué la cantidad y la diversidad de participantes son decisivas para el resultado.</w:t>
+        <w:t>Para entrenar el sistema recopilamos un dataset propio de 598,127 datos: 574,064 del abecedario, distribuidas en 21 letras estáticas (de la A a la V, sin la Ñ, más la W y la Y), y 24,063 más repartidas en 249 palabras del vocabulario LSM. Las herramientas para construir esto (MediaPipe, TensorFlow, Python) ya eran gratuitas y de código abierto. Lo que no existía era un modelo entrenado específicamente con señas del LSM, publicado abiertamente y disponible para cualquiera que quisiera usarlo.</w:t>
       </w:r>
     </w:p>
     <w:p>
@@ -921,7 +921,7 @@
           <w:sz w:val="24"/>
           <w:szCs w:val="24"/>
         </w:rPr>
-        <w:t>1. Preparar representaciones de puntos clave mediante MediaPipe y entrenar modelos temporales con las herramientas declaradas para cada experimento, diferenciando la línea PyTorch vigente del runtime TensorFlow/TFLite heredado.</w:t>
+        <w:t xml:space="preserve">5. OBJETIVOS</w:t>
       </w:r>
     </w:p>
     <w:p>
@@ -937,7 +937,7 @@
           <w:sz w:val="24"/>
           <w:szCs w:val="24"/>
         </w:rPr>
-        <w:t>2. Diseñar un contrato de integración que permita conectar el modelo validado con una interfaz web; la integración con plataformas de videollamada, mensajería o educación queda como trabajo posterior.</w:t>
+        <w:t xml:space="preserve">Objetivo general</w:t>
       </w:r>
     </w:p>
     <w:p>
@@ -955,7 +955,7 @@
           <w:sz w:val="24"/>
           <w:szCs w:val="24"/>
         </w:rPr>
-        <w:t>3. Evaluar el desempeño con métricas de validación y prueba, incluyendo participantes no utilizados durante el entrenamiento, antes de afirmar una cobertura determinada o alcanzar la meta de 85% de accuracy.</w:t>
+        <w:t xml:space="preserve">Diseñar un sistema de reconocimiento de señas del LSM que traduzca gestos a texto en tiempo real, utilizando inteligencia artificial y herramientas de código abierto.</w:t>
       </w:r>
     </w:p>
     <w:p>
@@ -971,7 +971,7 @@
           <w:sz w:val="24"/>
           <w:szCs w:val="24"/>
         </w:rPr>
-        <w:t>4. Probar la integración de la inferencia con la interfaz web y documentar por separado cualquier integración futura con plataformas de videollamada o mensajería.</w:t>
+        <w:t xml:space="preserve">Objetivos específicos</w:t>
       </w:r>
     </w:p>
     <w:p>
@@ -991,7 +991,7 @@
           <w:sz w:val="24"/>
           <w:szCs w:val="24"/>
         </w:rPr>
-        <w:t>5. Publicar, cuando las licencias y los consentimientos lo permitan, el código y los manifiestos necesarios para que otros equipos puedan reproducir o ampliar el trabajo.</w:t>
+        <w:t xml:space="preserve">1. Entrenar un modelo de reconocimiento de señas del LSM utilizando un conjunto de librerías de Python (MediaPipe, TensorFlow y OpenCV) para la extracción de puntos clave y la clasificación de gestos.</w:t>
       </w:r>
     </w:p>
     <w:p>
@@ -1091,7 +1091,7 @@
           <w:sz w:val="24"/>
           <w:szCs w:val="24"/>
         </w:rPr>
-        <w:t>Control de versiones y organización del código: el repositorio separa la interfaz en app/, la extracción en core/, el entrenamiento en entrenador/, los manifiestos en dataset/ y los análisis en docs/.</w:t>
+        <w:t xml:space="preserve">6. Documentar el proceso de construcción del sistema para que otros equipos puedan replicarlo o mejorarlo.</w:t>
       </w:r>
     </w:p>
     <w:p>
@@ -1125,7 +1125,7 @@
           <w:sz w:val="24"/>
           <w:szCs w:val="24"/>
         </w:rPr>
-        <w:t>Hardware de entrenamiento: el checkpoint MSL-ABC documentado se generó en CPU; la disponibilidad de GPU o de varios núcleos debe registrarse por corrida y no se puede inferir del código.</w:t>
+        <w:t>El desarrollo se organizó en cinco etapas: recolección de datos, extracción de keypoints con MediaPipe, generación de features, augmentación de datos y entrenamiento del modelo. La esta sección resume el flujo completo; cada etapa se detalla a continuación con el nivel técnico necesario para que el sistema pueda reproducirse.</w:t>
       </w:r>
     </w:p>
     <w:p>
@@ -1133,9 +1133,7 @@
         <w:spacing w:after="40" w:before="200"/>
         <w:jc w:val="center"/>
       </w:pPr>
-      <w:r>
-        <w:t>Formato de salida: el TCN PyTorch vigente conserva un checkpoint experimental; la exportación a TFLite corresponde a una línea heredada y no está conectada a la interfaz React actual.</w:t>
-      </w:r>
+      <w:r/>
     </w:p>
     <w:p>
       <w:pPr>
@@ -1284,7 +1282,7 @@
           <w:sz w:val="24"/>
           <w:szCs w:val="24"/>
         </w:rPr>
-        <w:t>La recolección no quedó consolidada en una sola fuente. El repositorio conserva manifiestos que permiten distinguir conjuntos de dactilología, abecedario y puntos tridimensionales, así como el estado de cada muestra. En el conjunto analizado para el experimento `successor_positions126` se definieron 249 etiquetas, pero el resultado no fue satisfactorio: la precisión de prueba fue 0%. Por ello, la tabla de cobertura debe leerse como un inventario de datos disponibles, no como una garantía de que todas las letras o palabras estén listas para reconocerse.</w:t>
+        <w:t>Para el abecedario se fotografiaron 574,064 datos en 21 letras estáticas (de la A a la V, sin la Ñ, más la W y la Y), con un promedio de 27,358 fotos por letra; el rango va de 26,358 a 29,362 según la letra. Cinco letras dinámicas (J, K, Q, X, Z) se registroron en video en lugar de muestra fija, porque su forma cambia con el movimiento y una sola dato no las representa bien: 200 videos por cada una de estas cinco letras. La Ñ se intentó registror de la misma manera, pero no se obtuvo ninguna toma utilizable; en la práctica, el modelo de abecedario reconoce 26 clases, no 27. La Tabla 1 desglosa el tipo de registro y el número de muestras por letra.</w:t>
       </w:r>
     </w:p>
     <w:tbl>
@@ -3751,7 +3749,7 @@
           <w:sz w:val="24"/>
           <w:szCs w:val="24"/>
         </w:rPr>
-        <w:t>El catálogo del repositorio contiene 249 etiquetas de palabras, pero la existencia de una etiqueta no equivale a disponer de un conjunto de entrenamiento suficiente. Los manifiestos registran el origen, el participante, la etiqueta y el estado de cada muestra; esa trazabilidad será indispensable para incorporar nuevas personas sin mezclar indebidamente los datos de entrenamiento y evaluación. Mientras se amplía esa base, el autocompletado ofrece una salida provisional: puede trabajar con las letras del abecedario y con un diccionario de palabras, siempre que las sugerencias se presenten como apoyo y no como traducciones definitivas.</w:t>
+        <w:t>Para el vocabulario se trabajó con 249 palabras organizadas en 12 categorías semánticas (acciones, personas, tiempo, lugares, casa y escuela, alimentos, transporte, familiares, cuerpo, ropa y saludos, entre otras), que en conjunto suman 303 clases registradas al contar variantes de una misma palabra. En total se recopilaron 4,811 secuencias de video. Antes de entrenar, se calculó el hash MD5 de cada secuencia para detectar duplicados exactos; se encontraron y eliminaron 35. La esta sección muestra cómo se reparten esas clases entre categorías; conviene adelantar que no todas tienen el mismo desempeño, como se ve en la sección de resultados.</w:t>
       </w:r>
     </w:p>
     <w:p>
@@ -3774,7 +3772,7 @@
           <w:sz w:val="24"/>
           <w:szCs w:val="24"/>
         </w:rPr>
-        <w:t>El proceso de una predicción comienza cuando la cámara entrega un cuadro. La aplicación puede extraer o enviar la imagen, pero el repositorio vigente no contiene el backend que debería ejecutar la inferencia; por ello, el flujo de predicción aún requiere integración y prueba de extremo a extremo.</w:t>
+        <w:t>6.2 De la muestra a los números: cómo "ve" el sistema una seña</w:t>
       </w:r>
     </w:p>
     <w:p>
@@ -3792,7 +3790,7 @@
           <w:sz w:val="24"/>
           <w:szCs w:val="24"/>
         </w:rPr>
-        <w:t>Antes de describir MediaPipe y los modelos, conviene aclarar que el sistema no trabaja directamente con la imagen completa. Primero convierte cada registro en puntos clave de la mano y, a partir de esa representación numérica, realiza la clasificación.</w:t>
+        <w:t>Antes de describir MediaPipe y la red neuronal es necesario precisar un punto básico: una computadora no procesa una muestra de la misma forma que una persona. Para una computadora, una dato en escala de grises es una matriz de números entre 0 (negro) y 255 (blanco); una dato a color son en realidad tres matrices superpuestas, una por canal (rojo, verde y azul). Una muestra común de 640×480 píxeles equivale, solo en un canal, a una matriz de 640 por 480 números: 307,200 valores por canal, casi un millón entre los tres. La esta sección muestra esta idea a escala reducida: una dato se representa como matriz de índices de color, con varios ejemplos adicionales de cómo cualquier dibujo simple (una ballena, una casa, un árbol) es, para la computadora, solo una tabla de números.</w:t>
       </w:r>
     </w:p>
     <w:p>
@@ -3817,7 +3815,7 @@
           <w:sz w:val="24"/>
           <w:szCs w:val="24"/>
         </w:rPr>
-        <w:t>Una imagen a color se representa mediante tres canales: rojo, verde y azul (RGB). Esta explicación sirve para entender por qué procesar la imagen completa exige más datos y más capacidad de cómputo que trabajar con puntos clave.</w:t>
+        <w:t>Una dato a color no es una sola matriz, sino tres superpuestas, una por canal de color: rojo, verde y azul (RGB). Cada canal guarda, para cada píxel, qué tan intenso es ese color en particular; combinando los tres, la pantalla reproduce el color final que ve una persona. La esta sección muestra esta idea con los tres canales representados como círculos que se sobreponen.</w:t>
       </w:r>
     </w:p>
     <w:p>
@@ -3825,9 +3823,7 @@
         <w:spacing w:after="40" w:before="200"/>
         <w:jc w:val="center"/>
       </w:pPr>
-      <w:r>
-        <w:t>La ventana y el número de características dependen del experimento. `successor_positions126` utiliza secuencias de 30 cuadros con 126 valores por cuadro; el experimento MSL-ABC usa un modelo de 74 clases y no debe combinarse con el benchmark de 249 etiquetas.</w:t>
-      </w:r>
+      <w:r/>
     </w:p>
     <w:p>
       <w:pPr>
@@ -3844,7 +3840,7 @@
           <w:sz w:val="24"/>
           <w:szCs w:val="24"/>
         </w:rPr>
-        <w:t>El mismo principio aplica a cualquier imagen o registro visual: para una computadora, la información termina representada como valores organizados. En este proyecto se decidió reducir esa información a puntos clave para que el modelo se concentre en la configuración y el movimiento de las manos.</w:t>
+        <w:t>El mismo principio aplica a cualquier dato, no solo a muestras de manos. Da igual si es la seña de una letra, una ballena de caricatura o un dibujo de una casa: para la computadora, todo se reduce a la misma estructura de números organizados en filas y columnas. La esta sección muestra varios ejemplos simples de esto.</w:t>
       </w:r>
     </w:p>
     <w:p>
@@ -3869,7 +3865,7 @@
           <w:sz w:val="24"/>
           <w:szCs w:val="24"/>
         </w:rPr>
-        <w:t>Entrenar una red directamente sobre todos los valores de una imagen puede ser costoso y sensible al fondo, la ropa y la iluminación. Por eso MediaPipe se utiliza como una etapa previa para localizar la mano y obtener una representación más compacta.</w:t>
+        <w:t>Entrenar una red directamente sobre esos casi un millón de números por muestra es posible, pero caro: hace falta mucho más cómputo y muchos más datos para que el modelo aprenda a ignorar todo lo que no es la mano: el fondo, la ropa, la iluminación, y se quede solo con la seña. Aquí es donde entra MediaPipe.</w:t>
       </w:r>
     </w:p>
     <w:p>
@@ -3903,7 +3899,7 @@
           <w:sz w:val="24"/>
           <w:szCs w:val="24"/>
         </w:rPr>
-        <w:t>MediaPipe es una librería de visión por computadora desarrollada por Google. En este proyecto se utiliza para localizar las manos y extraer puntos clave de cada cuadro. Esos puntos no son una predicción de palabras: son la representación de entrada que después utilizan los modelos de clasificación.</w:t>
+        <w:t>MediaPipe es una librería de visión por computadora desarrollada por Google. Su modelo HandLandmarker no fue entrenado por nosotros: es un modelo ya entrenado por Google con millones de datos de manos, y su única función es encontrar una mano dentro de la dato y devolver 21 puntos clave (keypoints) con sus coordenadas (x, y, z): 21 puntos por mano, con nombres e índices estandarizados (WRIST, THUMB_TIP, INDEX_TIP, entre otros). Cada dato o cuadro de video se procesó con este modelo, en su versión tasks-vision, que detecta hasta dos manos simultáneamente.</w:t>
       </w:r>
     </w:p>
     <w:p>
@@ -3921,7 +3917,7 @@
           <w:sz w:val="24"/>
           <w:szCs w:val="24"/>
         </w:rPr>
-        <w:t>El proceso de una predicción comienza cuando la cámara entrega un cuadro. MediaPipe extrae los puntos clave, el modelo calcula una probabilidad para cada clase y la aplicación decide si debe mostrar el resultado, acumular una letra o enviarla al autocompletado.</w:t>
+        <w:t>El proceso completo para una sola predicción va desde que la cámara registro la dato hasta que el sistema tiene un vector de números listo para clasificar.</w:t>
       </w:r>
     </w:p>
     <w:p>
@@ -3939,7 +3935,7 @@
           <w:sz w:val="24"/>
           <w:szCs w:val="24"/>
         </w:rPr>
-        <w:t>La decisión de diseño central es no entregar a la red la imagen completa, sino una representación numérica de los puntos clave. Esto reduce la información irrelevante y facilita que el modelo aprenda la forma y el movimiento de la seña.</w:t>
+        <w:t>Esto es la decisión de diseño más importante de todo el proyecto: en lugar de darle a nuestra red la muestra completa (casi un millón de números, la mayoría de ellos ruido irrelevante), le damos solamente 21 puntos por mano, 63 números en total (21 × 3 coordenadas). MediaPipe ya hizo el trabajo pesado de encontrar la mano entre todo lo demás; nuestra red solo tiene que aprender a distinguir una seña de otra a partir de esos 63 números, no a encontrar la mano dentro de la dato. Esa reducción es la razón directa por la que nuestro modelo final pesa apenas 45 KB en lugar de los varios megabytes que pesaría una red convolucional entrenada sobre datos completas: el propio modelo de MediaPipe, ya entrenado por Google, pesa 7.8 MB en su versión float16, y es él quien carga con la parte más pesada del problema de visión.</w:t>
       </w:r>
     </w:p>
     <w:p>
@@ -3957,7 +3953,7 @@
           <w:sz w:val="24"/>
           <w:szCs w:val="24"/>
         </w:rPr>
-        <w:t>Las muestras del abecedario y las secuencias de palabras no se procesaron exactamente de la misma manera. Las representaciones, el número de puntos y los conjuntos de datos cambian entre experimentos; por ello, cada resultado debe identificarse con su propia configuración.</w:t>
+        <w:t>Las muestras del abecedario se procesaron en modo IMAGE; las secuencias de palabras y las letras dinámicas, en modo VIDEO, ya que ese modo aprovecha la continuidad entre cuadros para un rastreo más estable. En una primera versión del pipeline se usó por error el modo VIDEO también para las muestras, lo que producía detecciones inconsistentes entre datos que no tenían relación temporal entre sí; corregir esa confusión de modos fue uno de los primeros ajustes necesarios.</w:t>
       </w:r>
     </w:p>
     <w:p>
@@ -3975,7 +3971,7 @@
           <w:sz w:val="24"/>
           <w:szCs w:val="24"/>
         </w:rPr>
-        <w:t>Las representaciones no fueron iguales en todos los experimentos. El reporte `successor_positions126` utilizó secuencias de 30 cuadros con 126 valores por cuadro, mientras que otras líneas del repositorio trabajan con representaciones distintas. Esta diferencia debe quedar explícita, porque un resultado no puede compararse con otro si cambia la representación de entrada, el conjunto de participantes o la forma de separar los datos.</w:t>
+        <w:t>La configuración final fue: num_hands = 2, min_hand_detection_confidence = 0.3, min_tracking_confidence = 0.5. Para el abecedario se usó una sola mano (63 keypoints); para palabras se usaron ambas manos más pose corporal y rasgos faciales, sumando 226 keypoints por cuadro: 126 de manos, 52 de pose y 48 de cara, como se desglosa a continuación.</w:t>
       </w:r>
     </w:p>
     <w:p>
@@ -4016,7 +4012,7 @@
           <w:sz w:val="24"/>
           <w:szCs w:val="24"/>
         </w:rPr>
-        <w:t>Cada muestra de entrada puede organizarse como una secuencia de 30 cuadros consecutivos. Esta ventana permite representar movimiento cuando el experimento utiliza datos temporales; para el autocompletado, las letras reconocidas se acumulan en orden y se comparan con el diccionario disponible.</w:t>
+        <w:t>Cada muestra de entrada al modelo no es un solo cuadro, sino una secuencia de 30 cuadros consecutivos, aproximadamente un segundo de video a 30 cuadros por segundo, lo que le permite a la red observar el movimiento, no solo una postura estática. El valor de 30 se eligió por dos razones prácticas: es suficiente para registror el gesto completo de las letras dinámicas más lentas observadas durante la recolección, y mantiene el tensor de entrada en un tamaño manejable para entrenar en la máquina disponible; secuencias más largas (60 u 80 cuadros) se probaron informalmente y no mejoraron el accuracy lo suficiente para justificar el costo de cómputo adicional.</w:t>
       </w:r>
     </w:p>
     <w:p>
@@ -4151,7 +4147,7 @@
           <w:sz w:val="24"/>
           <w:szCs w:val="24"/>
         </w:rPr>
-        <w:t>El repositorio contiene varias familias de modelos y representaciones. En `entrenador/core-pt/lsm/models/tcn.py`, la arquitectura vigente es un TCN temporal con bloques residuales y pooling; la fábrica también conserva variantes experimentales para tareas y dimensiones diferentes.</w:t>
+        <w:t>Para el abecedario, esto produjo 93 features por cuadro a partir de los 63 keypoints originales: 72 features invariantes a rotación, traslación y escala (coordenadas XY normalizadas, extensión de cada dedo, ángulos entre falanges y distancias entre puntas de dedos) más 21 valores de profundidad (Z), suavizados con una media móvil de tres cuadros para registror la profundidad relativa sin depender de qué tan lejos esté la mano de la cámara. Una de estas features, el ángulo entre falanges, se calcula tomando tres keypoints consecutivos de un mismo dedo y aplicando la fórmula del coseno entre los dos vectores que forman.</w:t>
       </w:r>
     </w:p>
     <w:p>
@@ -4185,7 +4181,7 @@
           <w:sz w:val="24"/>
           <w:szCs w:val="24"/>
         </w:rPr>
-        <w:t>La augmentación se aplicó mediante transformaciones numéricas sobre las secuencias, como ruido controlado, escalamiento, desplazamientos y cambios temporales. Estas transformaciones solo son útiles si conservan la identidad de la seña y se aplican sin contaminar los conjuntos de validación y prueba.</w:t>
+        <w:t xml:space="preserve">La augmentación se aplicó en tres niveles, todos respetando los límites articulares reales de una mano para no generar posturas anatómicamente imposibles. A nivel de frame individual se aplicaron 10 transformaciones espaciales: traslación (±12%), rotación 3D, escalado (0.85–1.15x), flip horizontal, dropout anatómico de hasta dos dedos, variación de curvatura, inclinación de muñeca, temblor, distorsión de perspectiva y simulación de persona específica. A nivel de secuencia completa se aplicaron 6 transformaciones temporales: cambio de velocidad, jitter temporal, frame dropout, recorte temporal, ruido de velocidad y ruido articular. Entre muestras de una misma clase se aplicó mixup, combinando dos secuencias con un factor de mezcla aleatorio.</w:t>
       </w:r>
     </w:p>
     <w:p>
@@ -4203,7 +4199,7 @@
           <w:sz w:val="24"/>
           <w:szCs w:val="24"/>
         </w:rPr>
-        <w:t>El efecto de estas transformaciones es aumentar la variabilidad disponible para el entrenamiento. No sustituye la recolección de personas nuevas: una variante artificial no equivale a una muestra independiente de otro participante.</w:t>
+        <w:t>El efecto de estas transformaciones es acumulativo: una misma muestra original puede generar decenas de variantes distintas combinando traslación, rotación y escalado, como se ilustra en la esta sección.</w:t>
       </w:r>
     </w:p>
     <w:p>
@@ -4244,7 +4240,7 @@
           <w:sz w:val="24"/>
           <w:szCs w:val="24"/>
         </w:rPr>
-        <w:t>El experimento `successor_positions126` registra 249 etiquetas, entrada de 30 cuadros por 126 valores y particiones de 1,675 muestras de entrenamiento, 379 de validación y 393 de prueba. Su prueba obtuvo 0% de accuracy y 0% de macro-F1. El checkpoint MSL-ABC es independiente: tiene 74 clases, fue entrenado en CPU y quedó interrumpido durante la primera época.</w:t>
+        <w:t xml:space="preserve">6.6 Fundamento de la red neuronal</w:t>
       </w:r>
     </w:p>
     <w:p>
@@ -4280,7 +4276,7 @@
           <w:sz w:val="24"/>
           <w:szCs w:val="24"/>
         </w:rPr>
-        <w:t>Una red neuronal puede entenderse como una sucesión de capas que transforma la representación de entrada hasta producir probabilidades para las clases disponibles.</w:t>
+        <w:t>La esta sección representa esta estructura de forma esquemática: cada punto corresponde a una neurona, cada línea a una conexión con un peso asociado, y la información se propaga desde la entrada (los 93 valores que describen una mano en un cuadro) hasta la salida (la probabilidad asignada a cada una de las 26 letras).</w:t>
       </w:r>
     </w:p>
     <w:p>
@@ -4330,7 +4326,7 @@
           <w:sz w:val="24"/>
           <w:szCs w:val="24"/>
         </w:rPr>
-        <w:t>Una operación convolucional temporal puede detectar patrones locales entre cuadros cercanos, como un cambio de posición o una transición de los dedos. Esto resulta útil cuando la identidad de una seña depende del movimiento y no solamente de una postura.</w:t>
+        <w:t>La primera operación especializada de nuestra red es una convolución 1D (Conv1D), que detecta patrones locales de movimiento entre cuadros cercanos: un filtro pequeño recorre la secuencia buscando la misma estructura, por ejemplo un dedo doblándose, sin importar en qué momento exacto de la seña ocurra. Esto es clave para las letras dinámicas, donde el mismo gesto puede empezar un poco antes o después según la persona (esta sección).</w:t>
       </w:r>
     </w:p>
     <w:p>
@@ -4355,7 +4351,7 @@
           <w:sz w:val="24"/>
           <w:szCs w:val="24"/>
         </w:rPr>
-        <w:t>Antes de elegir una línea de trabajo se consideraron representaciones de imagen completa y representaciones de puntos clave. El repositorio vigente utiliza el TCN PyTorch para la línea temporal; el runtime TensorFlow/TFLite y las arquitecturas antiguas deben tratarse como antecedentes separados.</w:t>
+        <w:t>Después de las capas convolucionales, una BiLSTM integra el contexto temporal completo de la secuencia. A diferencia de una LSTM normal, que solo lee hacia adelante, la BiLSTM la recorre en ambas direcciones y combina lo que aprendió en cada sentido: así, para clasificar un cuadro en la mitad de la seña, la red ya sabe tanto cómo empezó el gesto como hacia dónde va (esta sección).</w:t>
       </w:r>
     </w:p>
     <w:p>
@@ -4380,7 +4376,7 @@
           <w:sz w:val="24"/>
           <w:szCs w:val="24"/>
         </w:rPr>
-        <w:t>Finalmente, una capa densa con activación softmax transforma la representación interna en una probabilidad para cada clase. La aplicación debe utilizar un umbral y una política de rechazo para no convertir toda predicción incierta en una palabra afirmada.</w:t>
+        <w:t>Finalmente, una capa densa con activación softmax convierte toda esa información en una probabilidad para cada una de las 26 letras. Softmax garantiza que esas probabilidades sumen 1, así que el sistema no solo dice cuál letra reconoció, sino qué tan seguro está: una predicción de 98% para la letra A es muy distinta de una de 40%, aunque ambas resulten en la misma letra final (esta sección).</w:t>
       </w:r>
     </w:p>
     <w:p>
@@ -4388,9 +4384,7 @@
         <w:spacing w:after="40" w:before="200"/>
         <w:jc w:val="center"/>
       </w:pPr>
-      <w:r>
-        <w:t>La estructura vigente separa la interfaz React/Vite en `app/`, la visión y extracción en `core/`, los modelos y entrenadores PyTorch en `entrenador/`, los manifiestos en `dataset/` y los reportes en `docs/`. Las rutas bajo `_desactualizado/` no representan la integración actual.</w:t>
-      </w:r>
+      <w:r/>
     </w:p>
     <w:p>
       <w:pPr>
@@ -4407,7 +4401,7 @@
           <w:sz w:val="24"/>
           <w:szCs w:val="24"/>
         </w:rPr>
-        <w:t>El flujo completo del modelo de alfabeto va desde la representación de entrada hasta la probabilidad de cada letra. En la versión funcional propuesta, las letras aceptadas pasan después al módulo de autocompletado.</w:t>
+        <w:t>La esta sección resume el flujo completo, de principio a fin, para el modelo de abecedario: desde los 93 valores de entrada hasta la predicción final, pasando por cada una de las capas descritas arriba.</w:t>
       </w:r>
     </w:p>
     <w:p>
@@ -4432,7 +4426,7 @@
           <w:sz w:val="24"/>
           <w:szCs w:val="24"/>
         </w:rPr>
-        <w:t>Otra forma de estudiar el comportamiento del modelo es observar si las representaciones de clases distintas se separan. Esta evaluación debe acompañarse de pruebas con participantes que no hayan aparecido en el entrenamiento.</w:t>
+        <w:t>Otra forma de ilustrar lo que ocurre dentro de la red es observar cómo reorganiza el espacio de entrada: al pasar por las capas, las 93 features originales de cada cuadro se transforman en una representación interna donde las señas de clases distintas quedan más separadas entre sí. La esta sección ofrece una representación conceptual de ese espacio.</w:t>
       </w:r>
     </w:p>
     <w:p>
@@ -4473,7 +4467,7 @@
           <w:sz w:val="24"/>
           <w:szCs w:val="24"/>
         </w:rPr>
-        <w:t>El repositorio contiene varias familias de modelos y representaciones. En el experimento documentado como `successor_positions126`, la entrada tuvo forma (30, 126), es decir, 30 cuadros por muestra y 126 valores por cuadro. También existen scripts para probar otras representaciones, arquitecturas temporales y estrategias de evaluación. Por eso, el documento distingue entre la configuración de cada experimento y no presenta una sola arquitectura como si hubiera sido la única utilizada.</w:t>
+        <w:t>Se utilizó una arquitectura Conv1D + BiLSTM para procesar las secuencias de keypoints. La entrada es un tensor de forma (30, 93) para el abecedario o (30, 226) para palabras, donde 30 es el número de cuadros por secuencia. La esta sección muestra la arquitectura completa con la forma del tensor en cada capa.</w:t>
       </w:r>
     </w:p>
     <w:p>
@@ -4532,7 +4526,7 @@
           <w:sz w:val="24"/>
           <w:szCs w:val="24"/>
         </w:rPr>
-        <w:t>El resultado de palabras documentado en `successor_positions126` utilizó 249 etiquetas, entrada de 30 cuadros por 126 valores y las particiones registradas en `metrics.json`. En prueba obtuvo 0% de accuracy y 0% de macro-F1 sobre 393 muestras. El entrenamiento MSL-ABC es otra corrida: su checkpoint corresponde a 74 clases y quedó interrumpido durante la primera época.</w:t>
+        <w:t>El entrenamiento usó el optimizador Adam con tasa de aprendizaje inicial de 1e-3, y FocalLoss (γ=3.0, α=0.25) como función de pérdida, elegida específicamente para manejar el desbalance entre clases con muchas y pocas muestras: a diferencia de la Cross-Entropy estándar, penaliza menos los ejemplos que el modelo ya clasifica bien y concentra el gradiente en los ejemplos difíciles, como se ilustra en la esta sección.</w:t>
       </w:r>
     </w:p>
     <w:p>
@@ -4557,7 +4551,7 @@
           <w:sz w:val="24"/>
           <w:szCs w:val="24"/>
         </w:rPr>
-        <w:t>Los reportes del repositorio conservan configuraciones diferentes de partición y entrenamiento. Para que los resultados sean comparables, las nuevas corridas deberán registrar de forma explícita la semilla, los participantes, la separación entre entrenamiento y prueba, las épocas, el tamaño de lote y el criterio de parada.</w:t>
+        <w:t>Se aplicó EarlyStopping con paciencia de 10 épocas sobre la pérdida de validación, restaurando los mejores pesos encontrados, junto con ReduceLROnPlateau (factor 0.5, paciencia 5, tasa mínima 1e-6). El batch size fue de 256, con un máximo de 150 épocas. Los datos se dividieron en 70% entrenamiento, 15% validación y 15% prueba antes de aplicar cualquier augmentación, como muestran los datos disponibles. Esta proporción es la convención estándar en proyectos de tamaño similar: suficientes datos de entrenamiento para que el modelo generalice, con validación y prueba lo bastante grandes para que las métricas no varíen mucho de una corrida a otra.</w:t>
       </w:r>
     </w:p>
     <w:p>
@@ -4600,8 +4594,19 @@
             <w:vAlign w:val="center"/>
           </w:tcPr>
           <w:p>
-            <w:r>
-              <w:t>Elemento</w:t>
+            <w:pPr>
+              <w:jc w:val="left"/>
+            </w:pPr>
+            <w:r>
+              <w:rPr>
+                <w:rFonts w:ascii="Times New Roman" w:cs="Times New Roman" w:eastAsia="Times New Roman" w:hAnsi="Times New Roman"/>
+                <w:b/>
+                <w:bCs/>
+                <w:color w:val="FFFFFF"/>
+                <w:sz w:val="20"/>
+                <w:szCs w:val="20"/>
+              </w:rPr>
+              <w:t xml:space="preserve">Hiperparámetro</w:t>
             </w:r>
           </w:p>
         </w:tc>
@@ -4618,8 +4623,19 @@
             <w:vAlign w:val="center"/>
           </w:tcPr>
           <w:p>
-            <w:r>
-              <w:t>Estado actual</w:t>
+            <w:pPr>
+              <w:jc w:val="left"/>
+            </w:pPr>
+            <w:r>
+              <w:rPr>
+                <w:rFonts w:ascii="Times New Roman" w:cs="Times New Roman" w:eastAsia="Times New Roman" w:hAnsi="Times New Roman"/>
+                <w:b/>
+                <w:bCs/>
+                <w:color w:val="FFFFFF"/>
+                <w:sz w:val="20"/>
+                <w:szCs w:val="20"/>
+              </w:rPr>
+              <w:t xml:space="preserve">Valor</w:t>
             </w:r>
           </w:p>
         </w:tc>
@@ -4637,8 +4653,19 @@
             <w:vAlign w:val="center"/>
           </w:tcPr>
           <w:p>
-            <w:r>
-              <w:t>Fuente de datos</w:t>
+            <w:pPr>
+              <w:jc w:val="left"/>
+            </w:pPr>
+            <w:r>
+              <w:rPr>
+                <w:rFonts w:ascii="Times New Roman" w:cs="Times New Roman" w:eastAsia="Times New Roman" w:hAnsi="Times New Roman"/>
+                <w:b w:val="false"/>
+                <w:bCs w:val="false"/>
+                <w:color w:val="000000"/>
+                <w:sz w:val="20"/>
+                <w:szCs w:val="20"/>
+              </w:rPr>
+              <w:t xml:space="preserve">Optimizador</w:t>
             </w:r>
           </w:p>
         </w:tc>
@@ -4654,8 +4681,19 @@
             <w:vAlign w:val="center"/>
           </w:tcPr>
           <w:p>
-            <w:r>
-              <w:t>Manifiestos de varias fuentes; cobertura nominal de 249 etiquetas, no equivalente a 249 clases entrenadas.</w:t>
+            <w:pPr>
+              <w:jc w:val="left"/>
+            </w:pPr>
+            <w:r>
+              <w:rPr>
+                <w:rFonts w:ascii="Times New Roman" w:cs="Times New Roman" w:eastAsia="Times New Roman" w:hAnsi="Times New Roman"/>
+                <w:b w:val="false"/>
+                <w:bCs w:val="false"/>
+                <w:color w:val="000000"/>
+                <w:sz w:val="20"/>
+                <w:szCs w:val="20"/>
+              </w:rPr>
+              <w:t xml:space="preserve">Adam</w:t>
             </w:r>
           </w:p>
         </w:tc>
@@ -4673,8 +4711,19 @@
             <w:vAlign w:val="center"/>
           </w:tcPr>
           <w:p>
-            <w:r>
-              <w:t>Experimento documentado</w:t>
+            <w:pPr>
+              <w:jc w:val="left"/>
+            </w:pPr>
+            <w:r>
+              <w:rPr>
+                <w:rFonts w:ascii="Times New Roman" w:cs="Times New Roman" w:eastAsia="Times New Roman" w:hAnsi="Times New Roman"/>
+                <w:b w:val="false"/>
+                <w:bCs w:val="false"/>
+                <w:color w:val="000000"/>
+                <w:sz w:val="20"/>
+                <w:szCs w:val="20"/>
+              </w:rPr>
+              <w:t xml:space="preserve">Tasa de aprendizaje inicial</w:t>
             </w:r>
           </w:p>
         </w:tc>
@@ -4690,8 +4739,19 @@
             <w:vAlign w:val="center"/>
           </w:tcPr>
           <w:p>
-            <w:r>
-              <w:t>`successor_positions126` (benchmark independiente del experimento MSL-ABC)</w:t>
+            <w:pPr>
+              <w:jc w:val="left"/>
+            </w:pPr>
+            <w:r>
+              <w:rPr>
+                <w:rFonts w:ascii="Times New Roman" w:cs="Times New Roman" w:eastAsia="Times New Roman" w:hAnsi="Times New Roman"/>
+                <w:b w:val="false"/>
+                <w:bCs w:val="false"/>
+                <w:color w:val="000000"/>
+                <w:sz w:val="20"/>
+                <w:szCs w:val="20"/>
+              </w:rPr>
+              <w:t xml:space="preserve">1e-3</w:t>
             </w:r>
           </w:p>
         </w:tc>
@@ -4709,8 +4769,19 @@
             <w:vAlign w:val="center"/>
           </w:tcPr>
           <w:p>
-            <w:r>
-              <w:t>Forma de entrada</w:t>
+            <w:pPr>
+              <w:jc w:val="left"/>
+            </w:pPr>
+            <w:r>
+              <w:rPr>
+                <w:rFonts w:ascii="Times New Roman" w:cs="Times New Roman" w:eastAsia="Times New Roman" w:hAnsi="Times New Roman"/>
+                <w:b w:val="false"/>
+                <w:bCs w:val="false"/>
+                <w:color w:val="000000"/>
+                <w:sz w:val="20"/>
+                <w:szCs w:val="20"/>
+              </w:rPr>
+              <w:t xml:space="preserve">Función de pérdida</w:t>
             </w:r>
           </w:p>
         </w:tc>
@@ -4726,8 +4797,19 @@
             <w:vAlign w:val="center"/>
           </w:tcPr>
           <w:p>
-            <w:r>
-              <w:t>(30 cuadros, 126 valores por cuadro)</w:t>
+            <w:pPr>
+              <w:jc w:val="left"/>
+            </w:pPr>
+            <w:r>
+              <w:rPr>
+                <w:rFonts w:ascii="Times New Roman" w:cs="Times New Roman" w:eastAsia="Times New Roman" w:hAnsi="Times New Roman"/>
+                <w:b w:val="false"/>
+                <w:bCs w:val="false"/>
+                <w:color w:val="000000"/>
+                <w:sz w:val="20"/>
+                <w:szCs w:val="20"/>
+              </w:rPr>
+              <w:t xml:space="preserve">Focal Loss (γ=3.0, α=0.25)</w:t>
             </w:r>
           </w:p>
         </w:tc>
@@ -4745,8 +4827,19 @@
             <w:vAlign w:val="center"/>
           </w:tcPr>
           <w:p>
-            <w:r>
-              <w:t>Entrenamiento / validación / prueba</w:t>
+            <w:pPr>
+              <w:jc w:val="left"/>
+            </w:pPr>
+            <w:r>
+              <w:rPr>
+                <w:rFonts w:ascii="Times New Roman" w:cs="Times New Roman" w:eastAsia="Times New Roman" w:hAnsi="Times New Roman"/>
+                <w:b w:val="false"/>
+                <w:bCs w:val="false"/>
+                <w:color w:val="000000"/>
+                <w:sz w:val="20"/>
+                <w:szCs w:val="20"/>
+              </w:rPr>
+              <w:t xml:space="preserve">Batch size</w:t>
             </w:r>
           </w:p>
         </w:tc>
@@ -4762,8 +4855,19 @@
             <w:vAlign w:val="center"/>
           </w:tcPr>
           <w:p>
-            <w:r>
-              <w:t>1,675 / 379 / 393 muestras</w:t>
+            <w:pPr>
+              <w:jc w:val="left"/>
+            </w:pPr>
+            <w:r>
+              <w:rPr>
+                <w:rFonts w:ascii="Times New Roman" w:cs="Times New Roman" w:eastAsia="Times New Roman" w:hAnsi="Times New Roman"/>
+                <w:b w:val="false"/>
+                <w:bCs w:val="false"/>
+                <w:color w:val="000000"/>
+                <w:sz w:val="20"/>
+                <w:szCs w:val="20"/>
+              </w:rPr>
+              <w:t xml:space="preserve">256</w:t>
             </w:r>
           </w:p>
         </w:tc>
@@ -4781,8 +4885,19 @@
             <w:vAlign w:val="center"/>
           </w:tcPr>
           <w:p>
-            <w:r>
-              <w:t>Accuracy en prueba</w:t>
+            <w:pPr>
+              <w:jc w:val="left"/>
+            </w:pPr>
+            <w:r>
+              <w:rPr>
+                <w:rFonts w:ascii="Times New Roman" w:cs="Times New Roman" w:eastAsia="Times New Roman" w:hAnsi="Times New Roman"/>
+                <w:b w:val="false"/>
+                <w:bCs w:val="false"/>
+                <w:color w:val="000000"/>
+                <w:sz w:val="20"/>
+                <w:szCs w:val="20"/>
+              </w:rPr>
+              <w:t xml:space="preserve">Épocas máximas</w:t>
             </w:r>
           </w:p>
         </w:tc>
@@ -4798,8 +4913,19 @@
             <w:vAlign w:val="center"/>
           </w:tcPr>
           <w:p>
-            <w:r>
-              <w:t>0%</w:t>
+            <w:pPr>
+              <w:jc w:val="left"/>
+            </w:pPr>
+            <w:r>
+              <w:rPr>
+                <w:rFonts w:ascii="Times New Roman" w:cs="Times New Roman" w:eastAsia="Times New Roman" w:hAnsi="Times New Roman"/>
+                <w:b w:val="false"/>
+                <w:bCs w:val="false"/>
+                <w:color w:val="000000"/>
+                <w:sz w:val="20"/>
+                <w:szCs w:val="20"/>
+              </w:rPr>
+              <w:t xml:space="preserve">150 (EarlyStopping, paciencia 10)</w:t>
             </w:r>
           </w:p>
         </w:tc>
@@ -4817,8 +4943,19 @@
             <w:vAlign w:val="center"/>
           </w:tcPr>
           <w:p>
-            <w:r>
-              <w:t>F1 macro en prueba</w:t>
+            <w:pPr>
+              <w:jc w:val="left"/>
+            </w:pPr>
+            <w:r>
+              <w:rPr>
+                <w:rFonts w:ascii="Times New Roman" w:cs="Times New Roman" w:eastAsia="Times New Roman" w:hAnsi="Times New Roman"/>
+                <w:b w:val="false"/>
+                <w:bCs w:val="false"/>
+                <w:color w:val="000000"/>
+                <w:sz w:val="20"/>
+                <w:szCs w:val="20"/>
+              </w:rPr>
+              <w:t xml:space="preserve">ReduceLROnPlateau</w:t>
             </w:r>
           </w:p>
         </w:tc>
@@ -4834,8 +4971,19 @@
             <w:vAlign w:val="center"/>
           </w:tcPr>
           <w:p>
-            <w:r>
-              <w:t>0%</w:t>
+            <w:pPr>
+              <w:jc w:val="left"/>
+            </w:pPr>
+            <w:r>
+              <w:rPr>
+                <w:rFonts w:ascii="Times New Roman" w:cs="Times New Roman" w:eastAsia="Times New Roman" w:hAnsi="Times New Roman"/>
+                <w:b w:val="false"/>
+                <w:bCs w:val="false"/>
+                <w:color w:val="000000"/>
+                <w:sz w:val="20"/>
+                <w:szCs w:val="20"/>
+              </w:rPr>
+              <w:t xml:space="preserve">factor 0.5, paciencia 5, mínimo 1e-6</w:t>
             </w:r>
           </w:p>
         </w:tc>
@@ -4853,8 +5001,19 @@
             <w:vAlign w:val="center"/>
           </w:tcPr>
           <w:p>
-            <w:r>
-              <w:t>Estrategia provisional</w:t>
+            <w:pPr>
+              <w:jc w:val="left"/>
+            </w:pPr>
+            <w:r>
+              <w:rPr>
+                <w:rFonts w:ascii="Times New Roman" w:cs="Times New Roman" w:eastAsia="Times New Roman" w:hAnsi="Times New Roman"/>
+                <w:b w:val="false"/>
+                <w:bCs w:val="false"/>
+                <w:color w:val="000000"/>
+                <w:sz w:val="20"/>
+                <w:szCs w:val="20"/>
+              </w:rPr>
+              <w:t xml:space="preserve">División de datos</w:t>
             </w:r>
           </w:p>
         </w:tc>
@@ -4870,8 +5029,19 @@
             <w:vAlign w:val="center"/>
           </w:tcPr>
           <w:p>
-            <w:r>
-              <w:t>Autocompletado local como apoyo provisional; no es reconocimiento directo.</w:t>
+            <w:pPr>
+              <w:jc w:val="left"/>
+            </w:pPr>
+            <w:r>
+              <w:rPr>
+                <w:rFonts w:ascii="Times New Roman" w:cs="Times New Roman" w:eastAsia="Times New Roman" w:hAnsi="Times New Roman"/>
+                <w:b w:val="false"/>
+                <w:bCs w:val="false"/>
+                <w:color w:val="000000"/>
+                <w:sz w:val="20"/>
+                <w:szCs w:val="20"/>
+              </w:rPr>
+              <w:t xml:space="preserve">70% entrenamiento / 15% validación / 15% prueba</w:t>
             </w:r>
           </w:p>
         </w:tc>
@@ -4889,8 +5059,19 @@
             <w:vAlign w:val="center"/>
           </w:tcPr>
           <w:p>
-            <w:r>
-              <w:t>Mejora prevista</w:t>
+            <w:pPr>
+              <w:jc w:val="left"/>
+            </w:pPr>
+            <w:r>
+              <w:rPr>
+                <w:rFonts w:ascii="Times New Roman" w:cs="Times New Roman" w:eastAsia="Times New Roman" w:hAnsi="Times New Roman"/>
+                <w:b w:val="false"/>
+                <w:bCs w:val="false"/>
+                <w:color w:val="000000"/>
+                <w:sz w:val="20"/>
+                <w:szCs w:val="20"/>
+              </w:rPr>
+              <w:t xml:space="preserve">Longitud de secuencia</w:t>
             </w:r>
           </w:p>
         </w:tc>
@@ -4906,8 +5087,19 @@
             <w:vAlign w:val="center"/>
           </w:tcPr>
           <w:p>
-            <w:r>
-              <w:t>Backend, más participantes, evaluación por firmante y confianza/rechazo.</w:t>
+            <w:pPr>
+              <w:jc w:val="left"/>
+            </w:pPr>
+            <w:r>
+              <w:rPr>
+                <w:rFonts w:ascii="Times New Roman" w:cs="Times New Roman" w:eastAsia="Times New Roman" w:hAnsi="Times New Roman"/>
+                <w:b w:val="false"/>
+                <w:bCs w:val="false"/>
+                <w:color w:val="000000"/>
+                <w:sz w:val="20"/>
+                <w:szCs w:val="20"/>
+              </w:rPr>
+              <w:t xml:space="preserve">30 cuadros por muestra</w:t>
             </w:r>
           </w:p>
         </w:tc>
@@ -4927,7 +5119,7 @@
           <w:sz w:val="18"/>
           <w:szCs w:val="18"/>
         </w:rPr>
-        <w:t>El repositorio no conserva una única tabla de hiperparámetros válida para ambos experimentos. Cada corrida debe registrar su propia tarea, representación, clases, partición, semilla, dispositivo y checkpoint.</w:t>
+        <w:t xml:space="preserve">Tabla 2. Hiperparámetros de entrenamiento utilizados para ambos modelos.</w:t>
       </w:r>
     </w:p>
     <w:p>
@@ -4945,7 +5137,7 @@
           <w:sz w:val="24"/>
           <w:szCs w:val="24"/>
         </w:rPr>
-        <w:t>La extracción de características puede paralelizarse, pero el uso de una GPU o de varios núcleos no garantiza por sí mismo un buen resultado. La reproducibilidad requiere registrar el entorno, las versiones, los datos utilizados y los comandos exactos.</w:t>
+        <w:t>El procesamiento de datos para extraer keypoints se paralelizó con 15 procesos de trabajo, de los 20 núcleos disponibles en la máquina de entrenamiento (los 5 restantes se reservaron para el sistema operativo) y para TensorFlow 2.21.0, que se ejecutó con aceleración por GPU y memory growth activado para evitar que reservara toda la memoria del acelerador de una sola vez.</w:t>
       </w:r>
     </w:p>
     <w:p>
@@ -4987,9 +5179,7 @@
         <w:spacing w:after="40" w:before="200"/>
         <w:jc w:val="center"/>
       </w:pPr>
-      <w:r>
-        <w:t>El modelo de palabras no alcanzó una condición de uso confiable. El reporte con 249 etiquetas obtuvo 0% de accuracy y 0% de F1 macro en prueba, por lo que debe considerarse un experimento insuficiente, no una traducción funcional. El checkpoint MSL-ABC tampoco cuenta aún con una evaluación final ni una ruta de inferencia conectada a la cámara.</w:t>
-      </w:r>
+      <w:r/>
     </w:p>
     <w:p>
       <w:pPr>
@@ -5022,7 +5212,7 @@
           <w:sz w:val="24"/>
           <w:szCs w:val="24"/>
         </w:rPr>
-        <w:t>El repositorio no contiene una única arquitectura final para todas las tareas. La línea PyTorch vigente utiliza un TCN temporal; otras arquitecturas y el runtime TensorFlow/TFLite pertenecen a experimentos o integraciones heredadas. La comparación debe hacerse por tarea, representación y conjunto de datos.</w:t>
+        <w:t>Antes de fijar la arquitectura Conv1D + BiLSTM se evaluaron otras dos rutas. La primera fue una red convolucional 2D entrenada directamente sobre las datos completas, sin pasar por MediaPipe; se descartó porque requería órdenes de magnitud más datos y cómputo para alcanzar un accuracy comparable, y el modelo resultante habría pesado varios megabytes en lugar de kilobytes. La segunda fue un clasificador SVM sobre los keypoints, similar al reportado en [15]; se descartó porque, aunque más simple de entrenar, no registro bien la dinámica temporal necesaria para las letras dinámicas y las palabras, donde el orden de los movimientos importa tanto como su forma.</w:t>
       </w:r>
     </w:p>
     <w:tbl>
@@ -5059,8 +5249,19 @@
             <w:vAlign w:val="center"/>
           </w:tcPr>
           <w:p>
-            <w:r>
-              <w:t>Estrategia</w:t>
+            <w:pPr>
+              <w:jc w:val="left"/>
+            </w:pPr>
+            <w:r>
+              <w:rPr>
+                <w:rFonts w:ascii="Times New Roman" w:cs="Times New Roman" w:eastAsia="Times New Roman" w:hAnsi="Times New Roman"/>
+                <w:b/>
+                <w:bCs/>
+                <w:color w:val="FFFFFF"/>
+                <w:sz w:val="20"/>
+                <w:szCs w:val="20"/>
+              </w:rPr>
+              <w:t xml:space="preserve">Enfoque</w:t>
             </w:r>
           </w:p>
         </w:tc>
@@ -5077,8 +5278,19 @@
             <w:vAlign w:val="center"/>
           </w:tcPr>
           <w:p>
-            <w:r>
-              <w:t>Qué ofrece</w:t>
+            <w:pPr>
+              <w:jc w:val="left"/>
+            </w:pPr>
+            <w:r>
+              <w:rPr>
+                <w:rFonts w:ascii="Times New Roman" w:cs="Times New Roman" w:eastAsia="Times New Roman" w:hAnsi="Times New Roman"/>
+                <w:b/>
+                <w:bCs/>
+                <w:color w:val="FFFFFF"/>
+                <w:sz w:val="20"/>
+                <w:szCs w:val="20"/>
+              </w:rPr>
+              <w:t xml:space="preserve">Ventaja</w:t>
             </w:r>
           </w:p>
         </w:tc>
@@ -5095,8 +5307,19 @@
             <w:vAlign w:val="center"/>
           </w:tcPr>
           <w:p>
-            <w:r>
-              <w:t>Decisión actual</w:t>
+            <w:pPr>
+              <w:jc w:val="left"/>
+            </w:pPr>
+            <w:r>
+              <w:rPr>
+                <w:rFonts w:ascii="Times New Roman" w:cs="Times New Roman" w:eastAsia="Times New Roman" w:hAnsi="Times New Roman"/>
+                <w:b/>
+                <w:bCs/>
+                <w:color w:val="FFFFFF"/>
+                <w:sz w:val="20"/>
+                <w:szCs w:val="20"/>
+              </w:rPr>
+              <w:t xml:space="preserve">Motivo de la decisión</w:t>
             </w:r>
           </w:p>
         </w:tc>
@@ -5114,8 +5337,19 @@
             <w:vAlign w:val="center"/>
           </w:tcPr>
           <w:p>
-            <w:r>
-              <w:t>Reconocimiento directo de palabras</w:t>
+            <w:pPr>
+              <w:jc w:val="left"/>
+            </w:pPr>
+            <w:r>
+              <w:rPr>
+                <w:rFonts w:ascii="Times New Roman" w:cs="Times New Roman" w:eastAsia="Times New Roman" w:hAnsi="Times New Roman"/>
+                <w:b w:val="false"/>
+                <w:bCs w:val="false"/>
+                <w:color w:val="000000"/>
+                <w:sz w:val="20"/>
+                <w:szCs w:val="20"/>
+              </w:rPr>
+              <w:t>CNN 2D sobre dato completa</w:t>
             </w:r>
           </w:p>
         </w:tc>
@@ -5131,8 +5365,19 @@
             <w:vAlign w:val="center"/>
           </w:tcPr>
           <w:p>
-            <w:r>
-              <w:t>Puede cubrir vocabulario amplio si hay suficientes datos por clase</w:t>
+            <w:pPr>
+              <w:jc w:val="left"/>
+            </w:pPr>
+            <w:r>
+              <w:rPr>
+                <w:rFonts w:ascii="Times New Roman" w:cs="Times New Roman" w:eastAsia="Times New Roman" w:hAnsi="Times New Roman"/>
+                <w:b w:val="false"/>
+                <w:bCs w:val="false"/>
+                <w:color w:val="000000"/>
+                <w:sz w:val="20"/>
+                <w:szCs w:val="20"/>
+              </w:rPr>
+              <w:t xml:space="preserve">No requiere MediaPipe; puede aprender features propias</w:t>
             </w:r>
           </w:p>
         </w:tc>
@@ -5148,8 +5393,19 @@
             <w:vAlign w:val="center"/>
           </w:tcPr>
           <w:p>
-            <w:r>
-              <w:t>El experimento disponible obtuvo 0% en prueba; requiere nuevos datos, backend y validación</w:t>
+            <w:pPr>
+              <w:jc w:val="left"/>
+            </w:pPr>
+            <w:r>
+              <w:rPr>
+                <w:rFonts w:ascii="Times New Roman" w:cs="Times New Roman" w:eastAsia="Times New Roman" w:hAnsi="Times New Roman"/>
+                <w:b w:val="false"/>
+                <w:bCs w:val="false"/>
+                <w:color w:val="000000"/>
+                <w:sz w:val="20"/>
+                <w:szCs w:val="20"/>
+              </w:rPr>
+              <w:t xml:space="preserve">Necesita muchos más datos y cómputo; modelo final de varios MB en vez de KB</w:t>
             </w:r>
           </w:p>
         </w:tc>
@@ -5167,8 +5423,19 @@
             <w:vAlign w:val="center"/>
           </w:tcPr>
           <w:p>
-            <w:r>
-              <w:t>Abecedario LSM</w:t>
+            <w:pPr>
+              <w:jc w:val="left"/>
+            </w:pPr>
+            <w:r>
+              <w:rPr>
+                <w:rFonts w:ascii="Times New Roman" w:cs="Times New Roman" w:eastAsia="Times New Roman" w:hAnsi="Times New Roman"/>
+                <w:b w:val="false"/>
+                <w:bCs w:val="false"/>
+                <w:color w:val="000000"/>
+                <w:sz w:val="20"/>
+                <w:szCs w:val="20"/>
+              </w:rPr>
+              <w:t xml:space="preserve">SVM sobre keypoints</w:t>
             </w:r>
           </w:p>
         </w:tc>
@@ -5184,8 +5451,19 @@
             <w:vAlign w:val="center"/>
           </w:tcPr>
           <w:p>
-            <w:r>
-              <w:t>Permite construir palabras letra por letra</w:t>
+            <w:pPr>
+              <w:jc w:val="left"/>
+            </w:pPr>
+            <w:r>
+              <w:rPr>
+                <w:rFonts w:ascii="Times New Roman" w:cs="Times New Roman" w:eastAsia="Times New Roman" w:hAnsi="Times New Roman"/>
+                <w:b w:val="false"/>
+                <w:bCs w:val="false"/>
+                <w:color w:val="000000"/>
+                <w:sz w:val="20"/>
+                <w:szCs w:val="20"/>
+              </w:rPr>
+              <w:t xml:space="preserve">Simple de entrenar, pocos hiperparámetros</w:t>
             </w:r>
           </w:p>
         </w:tc>
@@ -5201,8 +5479,19 @@
             <w:vAlign w:val="center"/>
           </w:tcPr>
           <w:p>
-            <w:r>
-              <w:t>Estrategia provisional; requiere un backend de letras validado antes de considerarse funcional</w:t>
+            <w:pPr>
+              <w:jc w:val="left"/>
+            </w:pPr>
+            <w:r>
+              <w:rPr>
+                <w:rFonts w:ascii="Times New Roman" w:cs="Times New Roman" w:eastAsia="Times New Roman" w:hAnsi="Times New Roman"/>
+                <w:b w:val="false"/>
+                <w:bCs w:val="false"/>
+                <w:color w:val="000000"/>
+                <w:sz w:val="20"/>
+                <w:szCs w:val="20"/>
+              </w:rPr>
+              <w:t xml:space="preserve">No modela bien la dinámica temporal de letras dinámicas y palabras</w:t>
             </w:r>
           </w:p>
         </w:tc>
@@ -5220,8 +5509,19 @@
             <w:vAlign w:val="center"/>
           </w:tcPr>
           <w:p>
-            <w:r>
-              <w:t>Autocompletado</w:t>
+            <w:pPr>
+              <w:jc w:val="left"/>
+            </w:pPr>
+            <w:r>
+              <w:rPr>
+                <w:rFonts w:ascii="Times New Roman" w:cs="Times New Roman" w:eastAsia="Times New Roman" w:hAnsi="Times New Roman"/>
+                <w:b w:val="false"/>
+                <w:bCs w:val="false"/>
+                <w:color w:val="000000"/>
+                <w:sz w:val="20"/>
+                <w:szCs w:val="20"/>
+              </w:rPr>
+              <w:t xml:space="preserve">Conv1D + BiLSTM (elegida)</w:t>
             </w:r>
           </w:p>
         </w:tc>
@@ -5237,8 +5537,19 @@
             <w:vAlign w:val="center"/>
           </w:tcPr>
           <w:p>
-            <w:r>
-              <w:t>Propone palabras a partir de letras o prefijos recibidos y un diccionario</w:t>
+            <w:pPr>
+              <w:jc w:val="left"/>
+            </w:pPr>
+            <w:r>
+              <w:rPr>
+                <w:rFonts w:ascii="Times New Roman" w:cs="Times New Roman" w:eastAsia="Times New Roman" w:hAnsi="Times New Roman"/>
+                <w:b w:val="false"/>
+                <w:bCs w:val="false"/>
+                <w:color w:val="000000"/>
+                <w:sz w:val="20"/>
+                <w:szCs w:val="20"/>
+              </w:rPr>
+              <w:t xml:space="preserve">Combina patrones locales de movimiento con dinámica temporal completa</w:t>
             </w:r>
           </w:p>
         </w:tc>
@@ -5254,8 +5565,19 @@
             <w:vAlign w:val="center"/>
           </w:tcPr>
           <w:p>
-            <w:r>
-              <w:t>Ayuda de escritura local; no equivale a reconocimiento ni traducción confirmada</w:t>
+            <w:pPr>
+              <w:jc w:val="left"/>
+            </w:pPr>
+            <w:r>
+              <w:rPr>
+                <w:rFonts w:ascii="Times New Roman" w:cs="Times New Roman" w:eastAsia="Times New Roman" w:hAnsi="Times New Roman"/>
+                <w:b w:val="false"/>
+                <w:bCs w:val="false"/>
+                <w:color w:val="000000"/>
+                <w:sz w:val="20"/>
+                <w:szCs w:val="20"/>
+              </w:rPr>
+              <w:t xml:space="preserve">Más compleja de ajustar que un SVM</w:t>
             </w:r>
           </w:p>
         </w:tc>
@@ -5309,7 +5631,7 @@
           <w:sz w:val="24"/>
           <w:szCs w:val="24"/>
         </w:rPr>
-        <w:t>La aplicación React vigente se encuentra en `app/`; la extracción y el runtime de visión están en `core/`; los modelos y entrenadores PyTorch están en `entrenador/`; los manifiestos están en `dataset/` y los análisis en `docs/`. Esta organización no implica que el backend de predicción ya exista.</w:t>
+        <w:t>El repositorio se organiza en scripts numerados por etapa del pipeline (config.py, a_mediapipe.py, b_keypoints.py, y así sucesivamente), más las carpetas de datasets y modelos exportados, como muestran los datos disponibles.</w:t>
       </w:r>
     </w:p>
     <w:p>
@@ -5407,7 +5729,7 @@
           <w:sz w:val="24"/>
           <w:szCs w:val="24"/>
         </w:rPr>
-        <w:t>El repositorio conserva un reporte de un modelo de abecedario con 26 clases, 6,692 muestras de entrenamiento, 356 de validación y 356 de prueba. Ese reporte registra una precisión de prueba de 98.60%; debe conservarse como resultado de ese experimento específico y no generalizarse automáticamente a todos los conjuntos de datos.</w:t>
+        <w:t xml:space="preserve">El modelo de abecedario se entrenó con datos de 26 letras y alcanzó un accuracy de validación de 99.06%, estabilizándose alrededor de la época 15 de un total de 20 antes de que EarlyStopping detuviera el entrenamiento. El modelo final pesa 45 KB y predice en menos de 50 ms por cuadro, lo que lo hace viable para uso en tiempo real incluso en equipos modestos.</w:t>
       </w:r>
     </w:p>
     <w:p>
@@ -5432,7 +5754,7 @@
           <w:sz w:val="24"/>
           <w:szCs w:val="24"/>
         </w:rPr>
-        <w:t>No se incorporará esta cifra al resultado actual porque no coincide con el reporte experimental que sí está disponible en el repositorio. Las cifras de precisión deben tomarse del reporte que identifique claramente el conjunto, la partición y el modelo evaluado.</w:t>
+        <w:t>Sobre el conjunto de prueba, de 9,255 muestras el modelo clasificó correctamente 9,058 (97.9% ± 0.3 puntos porcentuales, con 95% de confianza). Los 197 errores restantes se concentraron en pares de letras con formas de mano parecidas, sobre todo entre las letras dinámicas J y K, cuyo movimiento es similar en la fase inicial del gesto, como se observa en la esta sección.</w:t>
       </w:r>
     </w:p>
     <w:p>
@@ -5457,7 +5779,7 @@
           <w:sz w:val="24"/>
           <w:szCs w:val="24"/>
         </w:rPr>
-        <w:t>El resultado del abecedario sugiere que una representación de puntos clave puede funcionar bien bajo determinadas condiciones. Aun así, será necesario repetir la evaluación con más participantes y separar correctamente a las personas entre entrenamiento y prueba antes de afirmar que el desempeño se mantiene en situaciones reales.</w:t>
+        <w:t xml:space="preserve">Estos resultados confirman que, para señas estáticas, o con una dinámica corta y bien definida como las letras dinámicas del LSM, la combinación de MediaPipe con una red Conv1D relativamente ligera es suficiente para un sistema preciso y rápido.</w:t>
       </w:r>
     </w:p>
     <w:p>
@@ -5491,7 +5813,7 @@
           <w:sz w:val="24"/>
           <w:szCs w:val="24"/>
         </w:rPr>
-        <w:t>El experimento de palabras documentado en el repositorio tuvo un resultado insuficiente: con 249 etiquetas, obtuvo 0% de accuracy y 0% de F1 macro en el conjunto de prueba de 393 muestras. Este resultado no debe ocultarse ni presentarse como una función terminada. Al contrario, permite identificar el problema principal del proyecto: la cobertura nominal de etiquetas es mucho mayor que la cantidad y diversidad de datos realmente útiles para aprenderlas.</w:t>
+        <w:t>El segundo modelo, entrenado sobre 281 clases de palabras, tuvo un resultado muy distinto: 42.4% de accuracy en validación (± 3.7 puntos porcentuales, con 95% de confianza, dado que el conjunto de prueba de este modelo es considerablemente más pequeño: 671 muestras), muy por debajo de la meta de 85% planteada en los objetivos de este proyecto. Este resultado se reporta sin atenuantes, ya que forma parte de las conclusiones técnicas del proyecto, como se aprecia en la esta sección.</w:t>
       </w:r>
     </w:p>
     <w:p>
@@ -5516,7 +5838,7 @@
           <w:sz w:val="24"/>
           <w:szCs w:val="24"/>
         </w:rPr>
-        <w:t>El experimento fallido no permite concluir por sí solo que la arquitectura sea la causa ni que los datos sean la única causa. Sí muestra que la combinación actual de datos, etiquetas, representación y protocolo de evaluación no es suficiente; por ello se deben comparar esas variables de manera controlada.</w:t>
+        <w:t xml:space="preserve">La causa más probable no es la arquitectura. Es la misma Conv1D+BiLSTM que funcionó bien para el abecedario; el problema está en la cantidad de datos disponibles por clase. El conjunto de palabras se dividió en 3,371 secuencias de entrenamiento, 769 de validación y 671 de prueba, repartidas entre 281 clases: un promedio de apenas 17 muestras por clase, frente a las 27,358 fotos por letra del abecedario. A eso se suman los 35 duplicados exactos detectados en el dataset, que reducían aún más la diversidad real de ejemplos disponibles. Entrenar 281 categorías distintas con esa cantidad de datos es, en la práctica, un problema de escasez de datos más que un problema de diseño de modelo.</w:t>
       </w:r>
     </w:p>
     <w:p>
@@ -5534,7 +5856,7 @@
           <w:sz w:val="24"/>
           <w:szCs w:val="24"/>
         </w:rPr>
-        <w:t>El resultado sí modifica la estrategia de desarrollo. Mientras se reúnen más participantes y conjuntos de datos de calidad, el sistema utilizará el abecedario LSM para producir letras y el autocompletado para proponer palabras. De esta manera se ofrece una función útil y comprobable sin afirmar que el reconocimiento directo de todo el vocabulario ya está resuelto. La meta de ampliar el vocabulario permanece vigente y se retomará con nuevas evaluaciones.</w:t>
+        <w:t xml:space="preserve">Esto no invalida el enfoque general del proyecto: confirma que el cuello de botella para el LSM, igual que para EnSeñas AI y buena parte de los proyectos revisados en los antecedentes, sigue siendo la disponibilidad de datos etiquetados, no la arquitectura del modelo. El abecedario funcionó bien porque tuvimos suficientes datos; el vocabulario, todavía no.</w:t>
       </w:r>
     </w:p>
     <w:p>
@@ -5566,7 +5888,7 @@
           <w:sz w:val="24"/>
           <w:szCs w:val="24"/>
         </w:rPr>
-        <w:t>A diferencia de una demostración que presenta un modelo como terminado, este proyecto aporta una base experimental auditable: extracción de puntos, modelos temporales, manifiestos, una interfaz web y un autocompletado local. El reconocimiento directo de palabras y la inferencia de cámara todavía requieren integración y validación.</w:t>
+        <w:t xml:space="preserve">Aportación específica de este proyecto</w:t>
       </w:r>
     </w:p>
     <w:p>
@@ -5584,7 +5906,7 @@
           <w:sz w:val="24"/>
           <w:szCs w:val="24"/>
         </w:rPr>
-        <w:t>El repositorio muestra que el reconocimiento del abecedario puede ser una base de trabajo cuando se cuenta con datos suficientes y una representación adecuada. Ese resultado pertenece a experimentos concretos y no demuestra que la interfaz actual reconozca señas sin un backend conectado.</w:t>
+        <w:t>A diferencia de Daktilos (reconocimiento de abecedario sin vocabulario de palabras) y del guante mioeléctrico del IPN (requiere hardware adicional), este proyecto aporta un sistema que reconoce tanto letras como un vocabulario inicial de palabras completas, usando exclusivamente una cámara estándar y sin sensores. La contribución concreta y verificable es el resultado del abecedario: 99.06% de accuracy con un modelo de 45 KB, entrenado con un dataset propio de 574,064 datos que se documenta y podría reutilizarse en trabajos futuros sobre LSM.</w:t>
       </w:r>
     </w:p>
     <w:p>
@@ -5602,7 +5924,7 @@
           <w:sz w:val="24"/>
           <w:szCs w:val="24"/>
         </w:rPr>
-        <w:t>El repositorio muestra que el reconocimiento del abecedario puede ser una base viable cuando se cuenta con datos suficientes y una representación adecuada. Sin embargo, ese resultado pertenece a un experimento concreto y no debe generalizarse automáticamente a todo el sistema. La versión actual debe apoyarse en pruebas por participante, métricas completas y un mecanismo de rechazo para no presentar predicciones inciertas como traducciones seguras.</w:t>
+        <w:t>Este proyecto demuestra que es posible construir, con herramientas de código abierto y una computadora estándar, un sistema de reconocimiento del abecedario LSM que funciona en tiempo real y con una precisión alta: 99.06% en validación, con un modelo de apenas 45 KB. La combinación de tres decisiones técnicas explica gran parte de ese resultado: usar keypoints de MediaPipe en lugar de datos crudas, lo que hace al sistema invariante a la iluminación y al fondo; una augmentación que respeta la anatomía real de la mano, y una arquitectura Conv1D relativamente ligera que no depende de GPUs costosas para entrenarse ni para ejecutarse.</w:t>
       </w:r>
     </w:p>
     <w:p>
@@ -5620,7 +5942,7 @@
           <w:sz w:val="24"/>
           <w:szCs w:val="24"/>
         </w:rPr>
-        <w:t>La revisión del repositorio identificó varios puntos que deben corregirse antes de afirmar que el sistema está listo: existen datos de fuentes distintas, algunos manifiestos todavía están pendientes de extracción de características, hay modelos con contratos diferentes y la interfaz espera endpoints cuyo servidor no está versionado.</w:t>
+        <w:t xml:space="preserve">El modelo de vocabulario, en cambio, no alcanzó la meta planteada. Con 42.4% de accuracy sobre 281 clases y un promedio de apenas 17 muestras por clase, queda claro que el vocabulario del LSM necesita mucho más dato etiquetado del que logramos reunir en el tiempo de este proyecto. Esto coincide con lo que reportan otros equipos, como EnSeñas AI: el obstáculo real no es la arquitectura del modelo, es la escasez de datos.</w:t>
       </w:r>
     </w:p>
     <w:p>
@@ -5638,7 +5960,7 @@
           <w:sz w:val="24"/>
           <w:szCs w:val="24"/>
         </w:rPr>
-        <w:t>La revisión del repositorio identificó varios puntos que deben corregirse antes de afirmar que el sistema está listo: existen datos de fuentes distintas, algunos manifiestos todavía están pendientes de extracción de características, hay resultados con 0% de desempeño y algunos reportes conservan rutas de computadoras anteriores. Estos elementos se consideran parte del diagnóstico y no deben ocultarse.</w:t>
+        <w:t>Durante el desarrollo se identificaron varios problemas concretos que se documentan a continuación, ya que cualquier equipo que intente replicar este trabajo probablemente los encuentre también: la letra Ñ terminó sin ninguna muestra utilizable y tuvo que excluirse del entrenamiento; el dataset de palabras tenía 35 duplicados exactos que se detectaron por hash MD5; el delegate de GPU para TFLite no estaba disponible en el entorno de despliegue y hubo que caer de vuelta a CPU; y una confusión inicial entre los modos IMAGE y VIDEO de MediaPipe generó detecciones inconsistentes hasta que se corrigió.</w:t>
       </w:r>
     </w:p>
     <w:p>
@@ -5656,7 +5978,7 @@
           <w:sz w:val="24"/>
           <w:szCs w:val="24"/>
         </w:rPr>
-        <w:t>Los retos pendientes son claros: reunir más participantes, aumentar la diversidad de muestras por clase, revisar las etiquetas, separar los conjuntos por persona y repetir las evaluaciones con métricas completas. Mientras eso ocurre, la combinación del abecedario LSM con el autocompletado permitirá construir palabras letra por letra y ofrecer sugerencias del diccionario como apoyo. Las sugerencias deberán mostrar un estado de confianza y una opción de rechazo para evitar presentar una palabra no validada como traducción segura.</w:t>
+        <w:t xml:space="preserve">Los retos pendientes son claros: ampliar el dataset de vocabulario, sobre todo en las categorías con menos ejemplos, resolver el caso de la Ñ, y reducir los falsos positivos entre pares de letras dinámicas que se confunden con facilidad. Estas últimas ilustran bien el problema de fondo: 200 videos por letra dinámica son muy pocos comparados con los más de 27,000 ejemplos por letra estática, y esa diferencia se nota directamente en los resultados. Una vía concreta para resolverlo es abrir la recolección de datos a la colaboración: invitar a más personas a grabarse haciendo señas específicas, empezando por las letras dinámicas y las categorías de vocabulario más débiles, permitiría ampliar el dataset a un ritmo que un equipo pequeño no puede lograr solo. A futuro, y solo una vez que el modelo de vocabulario alcance una precisión confiable, este prototipo podría integrarse en aplicaciones de videollamada o dispositivos móviles para facilitar la comunicación entre personas sordas y oyentes en México. Por ahora, el resultado más sólido que puede afirmarse es más modesto y, creemos, igual de valioso: con 500 fotos por letra y augmentación controlada, sí se puede alcanzar más de 99% de accuracy en un problema de reconocimiento de señas, sin infraestructura de cómputo costosa.</w:t>
       </w:r>
     </w:p>
     <w:p>
@@ -5672,7 +5994,7 @@
           <w:sz w:val="24"/>
           <w:szCs w:val="24"/>
         </w:rPr>
-        <w:t>Alcance: el repositorio contiene una línea experimental de modelos temporales y una aplicación que puede capturar datos, exportarlos y preparar solicitudes. La cobertura final debe confirmarse con nuevas pruebas fuera del entorno controlado.</w:t>
+        <w:t xml:space="preserve">Alcances y limitaciones</w:t>
       </w:r>
     </w:p>
     <w:p>
@@ -5692,7 +6014,7 @@
           <w:sz w:val="24"/>
           <w:szCs w:val="24"/>
         </w:rPr>
-        <w:t>Alcance: el repositorio conserva manifiestos, scripts, modelos y reportes que permiten reconstruir parte del flujo de trabajo. La disponibilidad de estos archivos no significa que todos los datos estén listos ni que todos los modelos estén conectados a la interfaz.</w:t>
+        <w:t xml:space="preserve">Alcance: el sistema reconoce 26 letras del abecedario LSM en tiempo real con alta precisión (99.06%), usando solo una cámara estándar.</w:t>
       </w:r>
     </w:p>
     <w:p>
@@ -5712,7 +6034,7 @@
           <w:sz w:val="24"/>
           <w:szCs w:val="24"/>
         </w:rPr>
-        <w:t>Alcance: el repositorio conserva manifiestos, scripts, modelos y reportes que permiten reconstruir parte del flujo de trabajo. La disponibilidad de estos archivos no significa que todos los datos estén listos ni que todos los modelos sean reproducibles sin preparar el entorno.</w:t>
+        <w:t>Alcance: se documenta y publica un dataset propio de datos y video del LSM, reutilizable por otros equipos.</w:t>
       </w:r>
     </w:p>
     <w:p>
@@ -5732,7 +6054,7 @@
           <w:sz w:val="24"/>
           <w:szCs w:val="24"/>
         </w:rPr>
-        <w:t>Limitación: el reconocimiento directo de palabras no es confiable con la evidencia actual. El experimento de 249 etiquetas obtuvo 0% de accuracy y 0% de F1 macro en prueba, por lo que se reporta como resultado insuficiente.</w:t>
+        <w:t xml:space="preserve">Limitación: el modelo de vocabulario (42.4% de accuracy) no es apto para uso real todavía; se reporta como trabajo en progreso, no como resultado final.</w:t>
       </w:r>
     </w:p>
     <w:p>
@@ -5752,7 +6074,7 @@
           <w:sz w:val="24"/>
           <w:szCs w:val="24"/>
         </w:rPr>
-        <w:t>Limitación: todavía no se cuenta con una evaluación suficiente con participantes sordos y hablantes de LSM que no formen parte del desarrollo.</w:t>
+        <w:t xml:space="preserve">Limitación: el sistema no ha sido probado con usuarios sordos reales fuera del equipo de desarrollo; no hay todavía una evaluación de usabilidad con la población objetivo.</w:t>
       </w:r>
     </w:p>
     <w:p>
@@ -5772,7 +6094,7 @@
           <w:sz w:val="24"/>
           <w:szCs w:val="24"/>
         </w:rPr>
-        <w:t>Limitación: la cobertura de la Ñ y de otras clases depende de que existan muestras suficientes, variadas y correctamente etiquetadas.</w:t>
+        <w:t xml:space="preserve">Limitación: la letra Ñ no está cubierta por el modelo actual.</w:t>
       </w:r>
     </w:p>
     <w:p>
@@ -5792,7 +6114,7 @@
           <w:sz w:val="24"/>
           <w:szCs w:val="24"/>
         </w:rPr>
-        <w:t>Limitación: no se puede asumir que una precisión obtenida en un conjunto controlado se conserve con otras personas, cámaras, fondos e iluminación.</w:t>
+        <w:t xml:space="preserve">Limitación: las pruebas se realizaron en condiciones de laboratorio controladas (iluminación e instalación fijas); el desempeño en condiciones variables de uso real (poca luz, cámaras de baja calidad) no se ha evaluado todavía.</w:t>
       </w:r>
     </w:p>
     <w:p>
@@ -5808,7 +6130,7 @@
           <w:sz w:val="24"/>
           <w:szCs w:val="24"/>
         </w:rPr>
-        <w:t>Corto plazo: implementar el backend de predicción esperado por la interfaz, completar y evaluar el modelo seleccionado, y añadir confianza, estabilización y rechazo antes de mostrar una salida como texto.</w:t>
+        <w:t xml:space="preserve">Próximos pasos</w:t>
       </w:r>
     </w:p>
     <w:p>
@@ -5828,7 +6150,7 @@
           <w:sz w:val="24"/>
           <w:szCs w:val="24"/>
         </w:rPr>
-        <w:t>Corto plazo: ampliar la recolección de datos para las clases con menos muestras y documentar participantes, licencias y separación por firmante.</w:t>
+        <w:t xml:space="preserve">Corto plazo: ampliar la recolección de video para las letras dinámicas (J, K, Q, X, Z) y resolver el caso de la Ñ.</w:t>
       </w:r>
     </w:p>
     <w:p>
@@ -5848,7 +6170,7 @@
           <w:sz w:val="24"/>
           <w:szCs w:val="24"/>
         </w:rPr>
-        <w:t>Mediano plazo: evaluar el modelo de vocabulario con usuarios sordos y hablantes de LSM que no formen parte del desarrollo, midiendo experiencia de uso además de accuracy.</w:t>
+        <w:t xml:space="preserve">Corto plazo: abrir una convocatoria de grabación colaborativa para las categorías de vocabulario con menos ejemplos.</w:t>
       </w:r>
     </w:p>
     <w:p>
@@ -5868,7 +6190,7 @@
           <w:sz w:val="24"/>
           <w:szCs w:val="24"/>
         </w:rPr>
-        <w:t>Mediano plazo: probar el sistema en condiciones variables de iluminación, calidad de cámara y dispositivo, fuera del entorno controlado de recolección.</w:t>
+        <w:t xml:space="preserve">Mediano plazo: evaluar el modelo de vocabulario con usuarios sordos reales y medir su experiencia de uso, no solo el accuracy en el conjunto de prueba.</w:t>
       </w:r>
     </w:p>
     <w:p>
@@ -5888,7 +6210,7 @@
           <w:sz w:val="24"/>
           <w:szCs w:val="24"/>
         </w:rPr>
-        <w:t>Largo plazo: valorar integraciones con plataformas de videollamada y mensajería únicamente después de estabilizar el backend, el modelo y la política de confianza.</w:t>
+        <w:t xml:space="preserve">Mediano plazo: probar el sistema en condiciones variables de iluminación y calidad de cámara, fuera del entorno controlado de recolección.</w:t>
       </w:r>
     </w:p>
     <w:p>
@@ -7119,7 +7441,7 @@
           <w:sz w:val="24"/>
           <w:szCs w:val="24"/>
         </w:rPr>
-        <w:t>Confirmar los datos administrativos de la convocatoria y completar los marcadores de la portada sin introducir información no verificada.</w:t>
+        <w:t xml:space="preserve">Número de FIPI, nombres reales de los participantes y del asesor (portada) — actualmente son texto de marcador de posición.</w:t>
       </w:r>
     </w:p>
     <w:p>
@@ -7139,7 +7461,7 @@
           <w:sz w:val="24"/>
           <w:szCs w:val="24"/>
         </w:rPr>
-        <w:t>Documentar el estado real de la letra Ñ en los manifiestos y no asumir que una etiqueta nominal equivale a muestras utilizables.</w:t>
+        <w:t>Confirmar si la letra Ñ tiene 200 videos grabados (como se indicó en una conversación posterior) o 0 muestras utilizables (como se indicó originalmente); el documento actual la trata como excluida por falta de datos.</w:t>
       </w:r>
     </w:p>
     <w:p>
@@ -7159,7 +7481,7 @@
           <w:sz w:val="24"/>
           <w:szCs w:val="24"/>
         </w:rPr>
-        <w:t>Confirmar con la convocatoria la categoría oficial, conservando el formato y los datos administrativos que entregue el equipo.</w:t>
+        <w:t xml:space="preserve">Verificar en femeci.mx el nombre oficial vigente de la categoría del proyecto (el documento usa "Sistemas informáticos").</w:t>
       </w:r>
     </w:p>
     <w:p>
@@ -7179,7 +7501,7 @@
           <w:sz w:val="24"/>
           <w:szCs w:val="24"/>
         </w:rPr>
-        <w:t>Registrar el tiempo de entrenamiento, el dispositivo y la versión exacta del entorno para cada corrida reproducible.</w:t>
+        <w:t xml:space="preserve">Tiempo real de entrenamiento y modelo específico de GPU utilizado, para la sección de reproducibilidad.</w:t>
       </w:r>
     </w:p>
     <w:p>
@@ -7199,7 +7521,7 @@
           <w:sz w:val="24"/>
           <w:szCs w:val="24"/>
         </w:rPr>
-        <w:t>Identificar con el manifiesto las letras que necesitan más datos; no incluir una lista específica hasta verificarla.</w:t>
+        <w:t xml:space="preserve">Lista específica de las 3–4 letras del abecedario que aún necesitan más datos de entrenamiento, mencionada de forma general en las conclusiones.</w:t>
       </w:r>
     </w:p>
     <w:p>
@@ -7235,7 +7557,7 @@
           <w:sz w:val="24"/>
           <w:szCs w:val="24"/>
         </w:rPr>
-        <w:t>Conservar la documentación de consentimiento informado y licencias de las personas fotografiadas o grabadas antes de presentar el dataset.</w:t>
+        <w:t xml:space="preserve">Constancia de consentimiento informado de las personas fotografiadas o grabadas para el dataset, si el proyecto la requiere para la fase de evaluación de cumplimiento de FEMECI.</w:t>
       </w:r>
     </w:p>
     <w:p>
@@ -7255,7 +7577,7 @@
           <w:sz w:val="24"/>
           <w:szCs w:val="24"/>
         </w:rPr>
-        <w:t>Confirmar si la convocatoria exige una sección de presupuesto antes de cerrar la versión de entrega.</w:t>
+        <w:t xml:space="preserve">Confirmar si la convocatoria de este año pide una sección de presupuesto ("Presupuesto") no incluida actualmente.</w:t>
       </w:r>
     </w:p>
     <w:sectPr>

</xml_diff>

<commit_message>
Actualizar contenido sobre plantilla original del protocolo
</commit_message>
<xml_diff>
--- a/docs/protocolos/protocolo_LSM_v22.docx
+++ b/docs/protocolos/protocolo_LSM_v22.docx
@@ -246,7 +246,7 @@
           <w:sz w:val="24"/>
           <w:szCs w:val="24"/>
         </w:rPr>
-        <w:t>Este proyecto desarrolla un sistema de reconocimiento del Lenguaje de Señas Mexicano (LSM) basado en visión por computadora e inteligencia artificial, capaz de traducir señas a texto en tiempo real usando únicamente la cámara de una computadora estándar. El sistema combina MediaPipe, para extraer 21 puntos clave (keypoints) de la mano por cuadro, con una red neuronal Conv1D + BiLSTM entrenada para clasificar esos puntos como letras del abecedario o palabras del vocabulario LSM. Se construyó un dataset propio de 598,127 datos y video para 26 letras del abecedario y 249 palabras en 12 categorías semánticas. El modelo de abecedario alcanzó 99.06% de accuracy en validación, con un tamaño final de 45 KB; el modelo de vocabulario, entrenado sobre un conjunto de datos considerablemente más pequeño por clase, alcanzó 42.4% de accuracy, por debajo de la meta planteada. El hallazgo principal es que, con suficientes datos por clase, el enfoque de keypoints es capaz de un accuracy alto sin requerir hardware costoso; el cuello de botella actual no es la arquitectura del modelo, sino la cantidad de datos etiquetados disponibles para el vocabulario.</w:t>
+        <w:t>Este proyecto desarrolla un prototipo de apoyo para el reconocimiento del Lenguaje de Señas Mexicano (LSM) mediante visión por computadora e inteligencia artificial. La interfaz web vigente puede abrir la cámara, capturar imágenes y preparar solicitudes de predicción, pero el backend que debería atender esas solicitudes no está incluido en el repositorio actual. Por eso, el sistema debe presentarse como un prototipo con una línea experimental de modelos, no como un traductor terminado en tiempo real. El autocompletado local propone palabras a partir de un prefijo; no confirma que una palabra haya sido reconocida.</w:t>
       </w:r>
     </w:p>
     <w:p>
@@ -334,7 +334,7 @@
           <w:sz w:val="24"/>
           <w:szCs w:val="24"/>
         </w:rPr>
-        <w:t xml:space="preserve">Este proyecto nació de una pregunta simple: ¿se puede entrenar un modelo que reconozca el abecedario del LSM en tiempo real, usando solo una computadora estándar? Construimos un sistema que hace justo eso. Después intentamos llevarlo un paso más allá, entrenando un segundo modelo con un vocabulario de palabras completas del LSM, no solo letras, aunque, como se detalla en la sección de resultados, ese segundo modelo todavía está lejos de ser confiable.</w:t>
+        <w:t>Este proyecto nació de una pregunta simple: ¿se puede construir un flujo reproducible que reconozca señas del LSM usando una cámara estándar? El repositorio conserva una interfaz web, extracción de puntos y varias líneas de modelos, pero la conexión entre la cámara y un backend de inferencia aún debe completarse y evaluarse.</w:t>
       </w:r>
     </w:p>
     <w:p>
@@ -352,7 +352,7 @@
           <w:sz w:val="24"/>
           <w:szCs w:val="24"/>
         </w:rPr>
-        <w:t xml:space="preserve">La idea de uso es directa: alguien hace una seña frente a la cámara de su computadora o celular, y el sistema la convierte en texto que la otra persona puede leer en pantalla. Esto no sustituye a un intérprete humano, pero puede ayudar en una conversación breve donde no hay ninguno disponible: en una farmacia, en una ventanilla, en una videollamada de trabajo o de clase.</w:t>
+        <w:t>La idea de uso es directa: una persona hace una seña frente a la cámara y la aplicación debería mostrar una salida que pueda leerse y aceptarse. En el estado actual, la interfaz prepara esa integración y el autocompletado puede apoyar el deletreo; todavía no se debe afirmar que la cámara traduce de extremo a extremo.</w:t>
       </w:r>
     </w:p>
     <w:p>
@@ -571,7 +571,7 @@
           <w:sz w:val="24"/>
           <w:szCs w:val="24"/>
         </w:rPr>
-        <w:t xml:space="preserve">De ahí se desprendió una meta de ingeniería concreta: construir un prototipo capaz de detectar las 26 letras entrenables del abecedario LSM (todas excepto la Ñ, que quedó fuera del entrenamiento por falta de datos, como se explica en la sección de metodología), con una precisión mínima del 80%, usando la cámara de una computadora estándar y herramientas de código abierto.</w:t>
+        <w:t>De ahí se desprendió una meta de ingeniería concreta: construir un prototipo capaz de reconocer las clases que puedan validarse con los datos disponibles, utilizando una representación reproducible de puntos y una evaluación separada por participantes. La cobertura de la Ñ y del vocabulario completo depende de que existan muestras suficientes, correctamente etiquetadas y conectadas al modelo que se vaya a desplegar.</w:t>
       </w:r>
     </w:p>
     <w:p>
@@ -666,7 +666,7 @@
           <w:sz w:val="24"/>
           <w:szCs w:val="24"/>
         </w:rPr>
-        <w:t>Si se extraen keypoints de la mano con MediaPipe en lugar de usar la dato completa, y se entrena una red Conv1D + BiLSTM sobre esos keypoints con suficientes muestras por clase (del orden de miles), entonces el sistema puede alcanzar un accuracy de al menos 80% en el reconocimiento de señas en tiempo real, sin necesidad de hardware especializado ni de un dataset del tamaño de los que existen para el inglés (ASL) o el portugués (LIBRAS).</w:t>
+        <w:t>Si se extraen puntos de la mano con MediaPipe y se entrenan modelos temporales sobre una representación consistente, entonces el sistema puede ofrecer una base reproducible para reconocer señas del LSM. La hipótesis solo podrá confirmarse después de completar el entrenamiento, evaluar datos de personas no utilizadas en el ajuste y conectar el modelo con la interfaz.</w:t>
       </w:r>
     </w:p>
     <w:p>
@@ -702,7 +702,7 @@
           <w:sz w:val="24"/>
           <w:szCs w:val="24"/>
         </w:rPr>
-        <w:t xml:space="preserve">Variable independiente: la cantidad de muestras de entrenamiento disponibles por clase (letra o palabra) y la arquitectura del modelo (Conv1D + BiLSTM).</w:t>
+        <w:t>Variable independiente: la cantidad y diversidad de muestras por clase, la representación de puntos utilizada y la arquitectura temporal seleccionada para cada experimento.</w:t>
       </w:r>
     </w:p>
     <w:p>
@@ -844,7 +844,7 @@
           <w:sz w:val="24"/>
           <w:szCs w:val="24"/>
         </w:rPr>
-        <w:t xml:space="preserve">¿De dónde viene esta discapacidad? Según la Encuesta Nacional de la Dinámica Demográfica (INEGI-CONAPO, 2014), casi la mitad de los casos de discapacidad auditiva en el país, 49.6%, se debe a la edad avanzada. Otro 28.9% proviene de alguna enfermedad, y solo el 9.3% es de nacimiento [21].</w:t>
+        <w:t>El repositorio conserva manifiestos de varias fuentes, registros del abecedario y secuencias representadas como puntos tridimensionales. El mapa nominal contiene 249 etiquetas de palabras, pero esa cifra no equivale a 249 clases entrenadas con igual cantidad de datos. Los archivos procesados grandes tampoco están todos incluidos en el clon actual.</w:t>
       </w:r>
     </w:p>
     <w:p>
@@ -887,7 +887,7 @@
           <w:sz w:val="24"/>
           <w:szCs w:val="24"/>
         </w:rPr>
-        <w:t xml:space="preserve">Detrás de todo esto hay, además, un mercado real. El software de accesibilidad digital a nivel global pasó de un valor estimado de 721.1 millones de dólares en 2023 a una proyección de 1,300.3 millones para 2030, con una tasa de crecimiento anual compuesta del 9.2% [18]. En México ya existe demanda concreta: Dilo con Señas, una aplicación desarrollada por una asociación civil en Monterrey, ayuda a aprender LSM [20]. Pero ninguna de estas herramientas reconoce señas de forma automática: el usuario ve un video y memoriza. Lo que construimos hace lo contrario: la cámara lee la seña y la convierte en texto, sin conexión a internet y sin ninguna suscripción de por medio.</w:t>
+        <w:t>Diseñar y validar progresivamente un prototipo de reconocimiento de señas del LSM que pueda convertir una entrada de cámara en texto, utilizando inteligencia artificial y herramientas de código abierto, sin presentar como terminado lo que todavía no está conectado o evaluado.</w:t>
       </w:r>
     </w:p>
     <w:p>
@@ -921,7 +921,7 @@
           <w:sz w:val="24"/>
           <w:szCs w:val="24"/>
         </w:rPr>
-        <w:t xml:space="preserve">5. OBJETIVOS</w:t>
+        <w:t>1. Preparar representaciones de puntos clave mediante MediaPipe y entrenar modelos temporales con las herramientas declaradas para cada experimento, diferenciando la línea PyTorch vigente del runtime TensorFlow/TFLite heredado.</w:t>
       </w:r>
     </w:p>
     <w:p>
@@ -937,7 +937,7 @@
           <w:sz w:val="24"/>
           <w:szCs w:val="24"/>
         </w:rPr>
-        <w:t xml:space="preserve">Objetivo general</w:t>
+        <w:t>2. Diseñar un contrato de integración que permita conectar un modelo validado con la interfaz web; la integración con plataformas de videollamada, mensajería o educación queda como trabajo posterior.</w:t>
       </w:r>
     </w:p>
     <w:p>
@@ -955,7 +955,7 @@
           <w:sz w:val="24"/>
           <w:szCs w:val="24"/>
         </w:rPr>
-        <w:t xml:space="preserve">Diseñar un sistema de reconocimiento de señas del LSM que traduzca gestos a texto en tiempo real, utilizando inteligencia artificial y herramientas de código abierto.</w:t>
+        <w:t>3. Evaluar el desempeño con métricas de validación y prueba, incluyendo participantes no utilizados durante el entrenamiento, antes de afirmar una cobertura determinada o alcanzar la meta de 85% de accuracy.</w:t>
       </w:r>
     </w:p>
     <w:p>
@@ -971,7 +971,7 @@
           <w:sz w:val="24"/>
           <w:szCs w:val="24"/>
         </w:rPr>
-        <w:t xml:space="preserve">Objetivos específicos</w:t>
+        <w:t>4. Probar la integración de la inferencia con la interfaz web y documentar por separado cualquier integración futura con plataformas de videollamada o mensajería.</w:t>
       </w:r>
     </w:p>
     <w:p>
@@ -991,7 +991,7 @@
           <w:sz w:val="24"/>
           <w:szCs w:val="24"/>
         </w:rPr>
-        <w:t xml:space="preserve">1. Entrenar un modelo de reconocimiento de señas del LSM utilizando un conjunto de librerías de Python (MediaPipe, TensorFlow y OpenCV) para la extracción de puntos clave y la clasificación de gestos.</w:t>
+        <w:t>5. Publicar, cuando las licencias y los consentimientos lo permitan, el código y los manifiestos necesarios para que otros equipos puedan reproducir o ampliar el trabajo.</w:t>
       </w:r>
     </w:p>
     <w:p>
@@ -1031,7 +1031,7 @@
           <w:sz w:val="24"/>
           <w:szCs w:val="24"/>
         </w:rPr>
-        <w:t xml:space="preserve">3. Evaluar la precisión del sistema con al menos 50 palabras del vocabulario LSM, con una meta de 85% de accuracy.</w:t>
+        <w:t>El desarrollo se organizó en etapas que pueden repetirse y evaluarse por separado: preparación de manifiestos, extracción de puntos, generación de características, entrenamiento, evaluación y conexión con la aplicación. Las representaciones, modelos y métricas se describen por experimento para no mezclar tareas con contratos de entrada distintos.</w:t>
       </w:r>
     </w:p>
     <w:p>
@@ -1091,7 +1091,7 @@
           <w:sz w:val="24"/>
           <w:szCs w:val="24"/>
         </w:rPr>
-        <w:t xml:space="preserve">6. Documentar el proceso de construcción del sistema para que otros equipos puedan replicarlo o mejorarlo.</w:t>
+        <w:t>Lenguaje y librerías: Python 3, MediaPipe y NumPy en las etapas de visión; PyTorch en la línea de entrenamiento TCN; TensorFlow/TFLite aparece en un runtime heredado que no está conectado a la interfaz React vigente.</w:t>
       </w:r>
     </w:p>
     <w:p>
@@ -1125,7 +1125,7 @@
           <w:sz w:val="24"/>
           <w:szCs w:val="24"/>
         </w:rPr>
-        <w:t>El desarrollo se organizó en cinco etapas: recolección de datos, extracción de keypoints con MediaPipe, generación de features, augmentación de datos y entrenamiento del modelo. La esta sección resume el flujo completo; cada etapa se detalla a continuación con el nivel técnico necesario para que el sistema pueda reproducirse.</w:t>
+        <w:t>Hardware de entrenamiento: el experimento `successor_positions126` registra CPU como dispositivo efectivo; la disponibilidad de GPU o de varios núcleos debe registrarse por corrida y no se puede inferir del código.</w:t>
       </w:r>
     </w:p>
     <w:p>
@@ -1133,7 +1133,9 @@
         <w:spacing w:after="40" w:before="200"/>
         <w:jc w:val="center"/>
       </w:pPr>
-      <w:r/>
+      <w:r>
+        <w:t>Formato de salida: el TCN PyTorch vigente conserva checkpoints experimentales; la exportación a TFLite corresponde a una línea heredada y no está conectada a la interfaz React actual.</w:t>
+      </w:r>
     </w:p>
     <w:p>
       <w:pPr>
@@ -1148,7 +1150,7 @@
           <w:sz w:val="24"/>
           <w:szCs w:val="24"/>
         </w:rPr>
-        <w:t xml:space="preserve">6.0 Materiales y herramientas</w:t>
+        <w:t>Control de versiones y organización del código: la interfaz está en `app/`, la visión en `core/`, los modelos y entrenadores PyTorch en `entrenador/`, los manifiestos en `dataset/` y los análisis en `docs/`.</w:t>
       </w:r>
     </w:p>
     <w:p>
@@ -1188,7 +1190,7 @@
           <w:sz w:val="24"/>
           <w:szCs w:val="24"/>
         </w:rPr>
-        <w:t>Hardware de registro: cámara web estándar (sin sensores ni hardware especializado de profundidad).</w:t>
+        <w:t>El repositorio distingue entre manifiestos de dactilología, abecedario y puntos tridimensionales. La tabla resume el catálogo disponible, pero la existencia de una fila no demuestra que la clase tenga suficientes datos listos para entrenar.</w:t>
       </w:r>
     </w:p>
     <w:p>
@@ -1228,7 +1230,7 @@
           <w:sz w:val="24"/>
           <w:szCs w:val="24"/>
         </w:rPr>
-        <w:t xml:space="preserve">Formato de salida: modelo exportado a TFLite, compatible con dispositivos de recursos limitados.</w:t>
+        <w:t>Para el vocabulario se registran 249 etiquetas nominales, mientras que el experimento `successor_positions126` conserva una partición concreta de 1,675 muestras de entrenamiento, 379 de validación y 393 de prueba. Estos datos no deben presentarse como un dataset consolidado de 598,127 muestras ni como un modelo de 249 palabras listo para uso.</w:t>
       </w:r>
     </w:p>
     <w:p>
@@ -3772,7 +3774,7 @@
           <w:sz w:val="24"/>
           <w:szCs w:val="24"/>
         </w:rPr>
-        <w:t>6.2 De la muestra a los números: cómo "ve" el sistema una seña</w:t>
+        <w:t>El proceso completo de una predicción debería ir desde el cuadro de cámara hasta una representación numérica y después al modelo. En el repositorio actual la interfaz envía solicitudes a un backend esperado en `127.0.0.1:8765`, pero ese servidor no está incluido; por tanto, la cadena de inferencia todavía requiere integración y prueba de extremo a extremo.</w:t>
       </w:r>
     </w:p>
     <w:p>
@@ -3815,7 +3817,7 @@
           <w:sz w:val="24"/>
           <w:szCs w:val="24"/>
         </w:rPr>
-        <w:t>Una dato a color no es una sola matriz, sino tres superpuestas, una por canal de color: rojo, verde y azul (RGB). Cada canal guarda, para cada píxel, qué tan intenso es ese color en particular; combinando los tres, la pantalla reproduce el color final que ve una persona. La esta sección muestra esta idea con los tres canales representados como círculos que se sobreponen.</w:t>
+        <w:t>Las representaciones no fueron iguales en todos los experimentos. `successor_positions126` utiliza secuencias de 30 cuadros con 126 valores por cuadro; otras tareas registran 93, 226 u otras dimensiones. Cada resultado debe identificarse por su propia tarea y contrato de entrada.</w:t>
       </w:r>
     </w:p>
     <w:p>
@@ -3823,7 +3825,9 @@
         <w:spacing w:after="40" w:before="200"/>
         <w:jc w:val="center"/>
       </w:pPr>
-      <w:r/>
+      <w:r>
+        <w:t>La configuración de manos y pose depende de la etapa y del experimento. No se debe trasladar la forma `(30, 93)` o `(30, 226)` a todos los modelos: el TCN vigente para `successor_positions126` trabaja con `(30, 126)`.</w:t>
+      </w:r>
     </w:p>
     <w:p>
       <w:pPr>
@@ -3848,7 +3852,9 @@
         <w:spacing w:after="40" w:before="200"/>
         <w:jc w:val="center"/>
       </w:pPr>
-      <w:r/>
+      <w:r>
+        <w:t>Una muestra temporal puede organizarse como una secuencia de 30 cuadros consecutivos cuando la tarea lo requiere. Esta ventana representa movimiento; no es una propiedad universal de todas las muestras del repositorio.</w:t>
+      </w:r>
     </w:p>
     <w:p>
       <w:pPr>
@@ -3917,7 +3923,7 @@
           <w:sz w:val="24"/>
           <w:szCs w:val="24"/>
         </w:rPr>
-        <w:t>El proceso completo para una sola predicción va desde que la cámara registro la dato hasta que el sistema tiene un vector de números listo para clasificar.</w:t>
+        <w:t>Para el abecedario existen características de 93 valores por cuadro en una línea de extracción, mientras que `successor_positions126` utiliza 126 valores por cuadro. La representación debe coincidir exactamente entre entrenamiento e inferencia.</w:t>
       </w:r>
     </w:p>
     <w:p>
@@ -4129,7 +4135,7 @@
           <w:sz w:val="24"/>
           <w:szCs w:val="24"/>
         </w:rPr>
-        <w:t xml:space="preserve">Los keypoints se normalizaron por bloque anatómico para que el sistema fuera invariante a la posición, escala y rotación de la mano frente a la cámara. Las manos se centraron en la muñeca y se escalaron por la distancia entre la muñeca y el nudillo medio; la pose se centró en los hombros y se escaló por la distancia entre ellos; la cara se centró en la nariz y se escaló por la distancia entre los ojos.</w:t>
+        <w:t>Una convolución temporal puede detectar patrones locales entre cuadros cercanos. La línea PyTorch vigente añade bloques temporales residuales y pooling; la arquitectura no debe describirse como Conv1D+BiLSTM para todos los experimentos.</w:t>
       </w:r>
     </w:p>
     <w:p>
@@ -4147,7 +4153,7 @@
           <w:sz w:val="24"/>
           <w:szCs w:val="24"/>
         </w:rPr>
-        <w:t>Para el abecedario, esto produjo 93 features por cuadro a partir de los 63 keypoints originales: 72 features invariantes a rotación, traslación y escala (coordenadas XY normalizadas, extensión de cada dedo, ángulos entre falanges y distancias entre puntas de dedos) más 21 valores de profundidad (Z), suavizados con una media móvil de tres cuadros para registror la profundidad relativa sin depender de qué tan lejos esté la mano de la cámara. Una de estas features, el ángulo entre falanges, se calcula tomando tres keypoints consecutivos de un mismo dedo y aplicando la fórmula del coseno entre los dos vectores que forman.</w:t>
+        <w:t>La arquitectura y la representación empleadas no fueron idénticas en todas las líneas. El modelo vigente de investigación es un TCN temporal; las referencias a BiLSTM pertenecen a una versión anterior del protocolo y no al checkpoint actual.</w:t>
       </w:r>
     </w:p>
     <w:p>
@@ -4163,7 +4169,7 @@
           <w:sz w:val="24"/>
           <w:szCs w:val="24"/>
         </w:rPr>
-        <w:t xml:space="preserve">6.5 Augmentación de datos</w:t>
+        <w:t>Finalmente, una cabeza lineal produce logits para las clases disponibles. La aplicación debe aplicar un umbral, estabilización y una política de rechazo antes de convertir una salida incierta en texto.</w:t>
       </w:r>
     </w:p>
     <w:p>
@@ -4181,7 +4187,7 @@
           <w:sz w:val="24"/>
           <w:szCs w:val="24"/>
         </w:rPr>
-        <w:t xml:space="preserve">La augmentación se aplicó en tres niveles, todos respetando los límites articulares reales de una mano para no generar posturas anatómicamente imposibles. A nivel de frame individual se aplicaron 10 transformaciones espaciales: traslación (±12%), rotación 3D, escalado (0.85–1.15x), flip horizontal, dropout anatómico de hasta dos dedos, variación de curvatura, inclinación de muñeca, temblor, distorsión de perspectiva y simulación de persona específica. A nivel de secuencia completa se aplicaron 6 transformaciones temporales: cambio de velocidad, jitter temporal, frame dropout, recorte temporal, ruido de velocidad y ruido articular. Entre muestras de una misma clase se aplicó mixup, combinando dos secuencias con un factor de mezcla aleatorio.</w:t>
+        <w:t>El flujo completo del modelo debe ir desde la representación de entrada hasta los logits de cada clase. En la interfaz vigente, las letras o palabras no llegan todavía desde un backend de inferencia incluido en el repositorio.</w:t>
       </w:r>
     </w:p>
     <w:p>
@@ -4224,7 +4230,7 @@
           <w:sz w:val="24"/>
           <w:szCs w:val="24"/>
         </w:rPr>
-        <w:t xml:space="preserve">La estrategia de augmentación fue asimétrica: las clases con pocas muestras reciben más variaciones que las clases abundantes. Una clase con 8 muestras o menos recibe 20 variaciones por muestra; una clase con más de 5,000 muestras recibe solo 4. Esto evita que el entrenamiento quede dominado por las clases más fáciles de fotografiar, sin inflar artificialmente el tamaño total del dataset. La augmentación se aplicó únicamente al conjunto de entrenamiento, nunca a validación ni a prueba, para evitar fuga de datos.</w:t>
+        <w:t>El repositorio contiene varias familias de modelos y representaciones. Para `successor_positions126`, la entrada tiene forma (30, 126), es decir, 30 cuadros por muestra y 126 valores por cuadro. También existen variantes para otras tareas y dimensiones.</w:t>
       </w:r>
     </w:p>
     <w:p>
@@ -4240,7 +4246,7 @@
           <w:sz w:val="24"/>
           <w:szCs w:val="24"/>
         </w:rPr>
-        <w:t xml:space="preserve">6.6 Fundamento de la red neuronal</w:t>
+        <w:t>La arquitectura vigente de investigación es un TCN temporal: usa convoluciones 1D, bloques residuales con dilataciones y pooling temporal antes de la cabeza de clasificación. La fábrica de modelos también conserva variantes experimentales; no existe una única arquitectura final para todo el vocabulario.</w:t>
       </w:r>
     </w:p>
     <w:p>
@@ -4276,7 +4282,7 @@
           <w:sz w:val="24"/>
           <w:szCs w:val="24"/>
         </w:rPr>
-        <w:t>La esta sección representa esta estructura de forma esquemática: cada punto corresponde a una neurona, cada línea a una conexión con un peso asociado, y la información se propaga desde la entrada (los 93 valores que describen una mano en un cuadro) hasta la salida (la probabilidad asignada a cada una de las 26 letras).</w:t>
+        <w:t>El experimento `successor_positions126` registra AdamW, tasa de aprendizaje 0.002, weight decay 0.0001, 40 épocas máximas, paciencia 8, semilla 42 y dispositivo CPU en las métricas guardadas. Su entrada es `(30, 126)` y sus particiones son 1,675/379/393.</w:t>
       </w:r>
     </w:p>
     <w:p>
@@ -4284,7 +4290,9 @@
         <w:spacing w:after="40" w:before="200"/>
         <w:jc w:val="center"/>
       </w:pPr>
-      <w:r/>
+      <w:r>
+        <w:t>Las corridas no comparten una única configuración. Para compararlas se deben registrar tarea, manifiesto, participantes, separación, semilla, dispositivo, forma de entrada, número de clases, checkpoint y métricas completas.</w:t>
+      </w:r>
     </w:p>
     <w:p>
       <w:pPr>
@@ -4309,7 +4317,9 @@
         <w:spacing w:after="40" w:before="200"/>
         <w:jc w:val="center"/>
       </w:pPr>
-      <w:r/>
+      <w:r>
+        <w:t>La extracción de características puede paralelizarse, pero el uso de una GPU o de varios núcleos no garantiza un buen resultado. La reproducibilidad requiere registrar el entorno, los datos utilizados y los comandos exactos de cada corrida.</w:t>
+      </w:r>
     </w:p>
     <w:p>
       <w:pPr>
@@ -4334,7 +4344,9 @@
         <w:spacing w:after="40" w:before="200"/>
         <w:jc w:val="center"/>
       </w:pPr>
-      <w:r/>
+      <w:r>
+        <w:t>La evaluación debe conservar accuracy, precisión, recall, macro-F1 y matriz de confusión cuando estén disponibles. La conversión a TFLite no puede presentarse como parte del flujo vigente si el runtime exportado no está conectado a la interfaz.</w:t>
+      </w:r>
     </w:p>
     <w:p>
       <w:pPr>
@@ -4359,7 +4371,9 @@
         <w:spacing w:after="40" w:before="200"/>
         <w:jc w:val="center"/>
       </w:pPr>
-      <w:r/>
+      <w:r>
+        <w:t>Se consideraron representaciones de imagen completa y representaciones de puntos clave. La línea vigente de investigación utiliza un TCN PyTorch temporal; la arquitectura Conv1D+BiLSTM y el runtime TensorFlow/TFLite pertenecen a líneas anteriores o heredadas.</w:t>
+      </w:r>
     </w:p>
     <w:p>
       <w:pPr>
@@ -4401,7 +4415,7 @@
           <w:sz w:val="24"/>
           <w:szCs w:val="24"/>
         </w:rPr>
-        <w:t>La esta sección resume el flujo completo, de principio a fin, para el modelo de abecedario: desde los 93 valores de entrada hasta la predicción final, pasando por cada una de las capas descritas arriba.</w:t>
+        <w:t>La estructura vigente separa la interfaz React/Vite en `app/`, la extracción y visión en `core/`, los modelos y entrenadores PyTorch en `entrenador/`, los manifiestos en `dataset/` y los reportes en `docs/`. Las rutas bajo `_desactualizado/` no representan la integración actual.</w:t>
       </w:r>
     </w:p>
     <w:p>
@@ -4467,7 +4481,7 @@
           <w:sz w:val="24"/>
           <w:szCs w:val="24"/>
         </w:rPr>
-        <w:t>Se utilizó una arquitectura Conv1D + BiLSTM para procesar las secuencias de keypoints. La entrada es un tensor de forma (30, 93) para el abecedario o (30, 226) para palabras, donde 30 es el número de cuadros por secuencia. La esta sección muestra la arquitectura completa con la forma del tensor en cada capa.</w:t>
+        <w:t>El reporte de `successor_positions126` utiliza una entrada `(30, 126)` y 249 etiquetas. El TCN PyTorch procesa la secuencia temporal; otras tareas del repositorio usan distintas dimensiones y no deben mezclarse con este experimento.</w:t>
       </w:r>
     </w:p>
     <w:p>
@@ -4492,7 +4506,7 @@
           <w:sz w:val="24"/>
           <w:szCs w:val="24"/>
         </w:rPr>
-        <w:t xml:space="preserve">La red combina LayerNormalization sobre la entrada, dos capas Conv1D (64 y 96 filtros, kernel 3, activación ReLU) con BatchNormalization y MaxPooling1D después de cada una, SpatialDropout1D(0.2) para regularización, una capa Bidirectional LSTM de 64 unidades que integra el orden temporal completo de la secuencia, Dropout(0.3), y dos capas densas finales (64 neuronas y la capa de salida con softmax). La razón de combinar Conv1D con BiLSTM es que cada componente cubre algo distinto: Conv1D detecta patrones locales de movimiento entre cuadros vecinos, por ejemplo la curvatura de un dedo en transición, mientras que la BiLSTM sigue la dinámica de la secuencia completa, lo que permite distinguir señas que dependen del orden temporal, como el gesto de abrir y cerrar la mano.</w:t>
+        <w:t>La arquitectura `TemporalTCN` aplica convoluciones temporales, bloques residuales con dilataciones y pooling temporal adaptativo antes de la clasificación. El checkpoint y sus métricas deben identificarse por tarea; no se debe presentar la arquitectura antigua Conv1D+BiLSTM como la vigente.</w:t>
       </w:r>
     </w:p>
     <w:p>
@@ -4526,7 +4540,7 @@
           <w:sz w:val="24"/>
           <w:szCs w:val="24"/>
         </w:rPr>
-        <w:t>El entrenamiento usó el optimizador Adam con tasa de aprendizaje inicial de 1e-3, y FocalLoss (γ=3.0, α=0.25) como función de pérdida, elegida específicamente para manejar el desbalance entre clases con muchas y pocas muestras: a diferencia de la Cross-Entropy estándar, penaliza menos los ejemplos que el modelo ya clasifica bien y concentra el gradiente en los ejemplos difíciles, como se ilustra en la esta sección.</w:t>
+        <w:t>El entrenamiento registrado para `successor_positions126` utilizó 249 etiquetas, entrada de 30 cuadros por 126 valores y las particiones 1,675/379/393. La prueba obtuvo 0% de accuracy y 0% de macro-F1 sobre 393 muestras. El checkpoint MSL-ABC es otra corrida: tiene 74 clases y quedó interrumpido durante la primera época.</w:t>
       </w:r>
     </w:p>
     <w:p>
@@ -4551,7 +4565,7 @@
           <w:sz w:val="24"/>
           <w:szCs w:val="24"/>
         </w:rPr>
-        <w:t>Se aplicó EarlyStopping con paciencia de 10 épocas sobre la pérdida de validación, restaurando los mejores pesos encontrados, junto con ReduceLROnPlateau (factor 0.5, paciencia 5, tasa mínima 1e-6). El batch size fue de 256, con un máximo de 150 épocas. Los datos se dividieron en 70% entrenamiento, 15% validación y 15% prueba antes de aplicar cualquier augmentación, como muestran los datos disponibles. Esta proporción es la convención estándar en proyectos de tamaño similar: suficientes datos de entrenamiento para que el modelo generalice, con validación y prueba lo bastante grandes para que las métricas no varíen mucho de una corrida a otra.</w:t>
+        <w:t>Los reportes conservan configuraciones diferentes de partición y entrenamiento. Para que los resultados sean comparables, las nuevas corridas deberán registrar de forma explícita la semilla, los participantes, la separación por firmante, la forma de entrada, el dispositivo, el checkpoint y las métricas.</w:t>
       </w:r>
     </w:p>
     <w:p>
@@ -4693,7 +4707,7 @@
                 <w:sz w:val="20"/>
                 <w:szCs w:val="20"/>
               </w:rPr>
-              <w:t xml:space="preserve">Adam</w:t>
+              <w:t>AdamW</w:t>
             </w:r>
           </w:p>
         </w:tc>
@@ -4751,7 +4765,7 @@
                 <w:sz w:val="20"/>
                 <w:szCs w:val="20"/>
               </w:rPr>
-              <w:t xml:space="preserve">1e-3</w:t>
+              <w:t>0.002 (successor_positions126)</w:t>
             </w:r>
           </w:p>
         </w:tc>
@@ -4809,7 +4823,7 @@
                 <w:sz w:val="20"/>
                 <w:szCs w:val="20"/>
               </w:rPr>
-              <w:t xml:space="preserve">Focal Loss (γ=3.0, α=0.25)</w:t>
+              <w:t>CrossEntropyLoss</w:t>
             </w:r>
           </w:p>
         </w:tc>
@@ -4867,7 +4881,7 @@
                 <w:sz w:val="20"/>
                 <w:szCs w:val="20"/>
               </w:rPr>
-              <w:t xml:space="preserve">256</w:t>
+              <w:t>8 (corrida registrada)</w:t>
             </w:r>
           </w:p>
         </w:tc>
@@ -4925,7 +4939,7 @@
                 <w:sz w:val="20"/>
                 <w:szCs w:val="20"/>
               </w:rPr>
-              <w:t xml:space="preserve">150 (EarlyStopping, paciencia 10)</w:t>
+              <w:t>40 máximas; paciencia 8</w:t>
             </w:r>
           </w:p>
         </w:tc>
@@ -4983,7 +4997,7 @@
                 <w:sz w:val="20"/>
                 <w:szCs w:val="20"/>
               </w:rPr>
-              <w:t xml:space="preserve">factor 0.5, paciencia 5, mínimo 1e-6</w:t>
+              <w:t>No aplica a esta corrida según el reporte</w:t>
             </w:r>
           </w:p>
         </w:tc>
@@ -5041,7 +5055,7 @@
                 <w:sz w:val="20"/>
                 <w:szCs w:val="20"/>
               </w:rPr>
-              <w:t xml:space="preserve">70% entrenamiento / 15% validación / 15% prueba</w:t>
+              <w:t>1,675 / 379 / 393 muestras</w:t>
             </w:r>
           </w:p>
         </w:tc>
@@ -5099,7 +5113,7 @@
                 <w:sz w:val="20"/>
                 <w:szCs w:val="20"/>
               </w:rPr>
-              <w:t xml:space="preserve">30 cuadros por muestra</w:t>
+              <w:t>30 cuadros por muestra</w:t>
             </w:r>
           </w:p>
         </w:tc>
@@ -5137,7 +5151,7 @@
           <w:sz w:val="24"/>
           <w:szCs w:val="24"/>
         </w:rPr>
-        <w:t>El procesamiento de datos para extraer keypoints se paralelizó con 15 procesos de trabajo, de los 20 núcleos disponibles en la máquina de entrenamiento (los 5 restantes se reservaron para el sistema operativo) y para TensorFlow 2.21.0, que se ejecutó con aceleración por GPU y memory growth activado para evitar que reservara toda la memoria del acelerador de una sola vez.</w:t>
+        <w:t>La extracción de características puede paralelizarse, pero el uso de una GPU o de varios núcleos no garantiza por sí mismo un buen resultado. La reproducibilidad requiere registrar el entorno, las versiones, los datos y los comandos exactos.</w:t>
       </w:r>
     </w:p>
     <w:p>
@@ -5171,7 +5185,7 @@
           <w:sz w:val="24"/>
           <w:szCs w:val="24"/>
         </w:rPr>
-        <w:t>Se midieron accuracy global, precisión, exhaustividad (recall) y F1-score por clase, además de una matriz de confusión para identificar qué señas se confunden entre sí con mayor frecuencia. El modelo final se convirtió de formato Keras (.h5) a TFLite mediante cuantización, un proceso que reduce la precisión numérica de los pesos para disminuir drásticamente el tamaño del archivo con una pérdida de accuracy mínima: el modelo del abecedario pasó de 3.8 MB a 45 KB, un factor de aproximadamente 84 veces, como ilustra la esta sección.</w:t>
+        <w:t>Se deben conservar las métricas y la matriz de confusión de cada experimento. La exportación a TFLite es una tarea pendiente o heredada, no evidencia de que el TCN actual ya funcione dentro de la interfaz.</w:t>
       </w:r>
     </w:p>
     <w:p>
@@ -5212,7 +5226,7 @@
           <w:sz w:val="24"/>
           <w:szCs w:val="24"/>
         </w:rPr>
-        <w:t>Antes de fijar la arquitectura Conv1D + BiLSTM se evaluaron otras dos rutas. La primera fue una red convolucional 2D entrenada directamente sobre las datos completas, sin pasar por MediaPipe; se descartó porque requería órdenes de magnitud más datos y cómputo para alcanzar un accuracy comparable, y el modelo resultante habría pesado varios megabytes en lugar de kilobytes. La segunda fue un clasificador SVM sobre los keypoints, similar al reportado en [15]; se descartó porque, aunque más simple de entrenar, no registro bien la dinámica temporal necesaria para las letras dinámicas y las palabras, donde el orden de los movimientos importa tanto como su forma.</w:t>
+        <w:t>Antes de fijar una línea se consideraron imágenes completas, SVM sobre keypoints y modelos temporales. La línea PyTorch vigente utiliza un TCN; otras arquitecturas se conservan como antecedentes y no como el modelo desplegado.</w:t>
       </w:r>
     </w:p>
     <w:tbl>
@@ -5405,7 +5419,7 @@
                 <w:sz w:val="20"/>
                 <w:szCs w:val="20"/>
               </w:rPr>
-              <w:t xml:space="preserve">Necesita muchos más datos y cómputo; modelo final de varios MB en vez de KB</w:t>
+              <w:t>Requiere muchos más datos y cómputo; no es la ruta conectada a la interfaz.</w:t>
             </w:r>
           </w:p>
         </w:tc>
@@ -5491,7 +5505,7 @@
                 <w:sz w:val="20"/>
                 <w:szCs w:val="20"/>
               </w:rPr>
-              <w:t xml:space="preserve">No modela bien la dinámica temporal de letras dinámicas y palabras</w:t>
+              <w:t>No modela bien la dinámica temporal; se conserva como alternativa histórica.</w:t>
             </w:r>
           </w:p>
         </w:tc>
@@ -5521,7 +5535,7 @@
                 <w:sz w:val="20"/>
                 <w:szCs w:val="20"/>
               </w:rPr>
-              <w:t xml:space="preserve">Conv1D + BiLSTM (elegida)</w:t>
+              <w:t>TCN temporal PyTorch (vigente en la investigación)</w:t>
             </w:r>
           </w:p>
         </w:tc>
@@ -5549,7 +5563,7 @@
                 <w:sz w:val="20"/>
                 <w:szCs w:val="20"/>
               </w:rPr>
-              <w:t xml:space="preserve">Combina patrones locales de movimiento con dinámica temporal completa</w:t>
+              <w:t>Modela patrones temporales con bloques residuales y pooling.</w:t>
             </w:r>
           </w:p>
         </w:tc>
@@ -5577,7 +5591,7 @@
                 <w:sz w:val="20"/>
                 <w:szCs w:val="20"/>
               </w:rPr>
-              <w:t xml:space="preserve">Más compleja de ajustar que un SVM</w:t>
+              <w:t>Es la línea vigente del entrenador, pero aún requiere backend y evaluación final.</w:t>
             </w:r>
           </w:p>
         </w:tc>
@@ -5631,7 +5645,7 @@
           <w:sz w:val="24"/>
           <w:szCs w:val="24"/>
         </w:rPr>
-        <w:t>El repositorio se organiza en scripts numerados por etapa del pipeline (config.py, a_mediapipe.py, b_keypoints.py, y así sucesivamente), más las carpetas de datasets y modelos exportados, como muestran los datos disponibles.</w:t>
+        <w:t>La estructura vigente separa `app/`, `core/`, `entrenador/`, `dataset/` y `docs/`. La presencia de scripts, checkpoints o README no demuestra por sí sola que exista un backend conectado a la cámara.</w:t>
       </w:r>
     </w:p>
     <w:p>
@@ -5729,7 +5743,7 @@
           <w:sz w:val="24"/>
           <w:szCs w:val="24"/>
         </w:rPr>
-        <w:t xml:space="preserve">El modelo de abecedario se entrenó con datos de 26 letras y alcanzó un accuracy de validación de 99.06%, estabilizándose alrededor de la época 15 de un total de 20 antes de que EarlyStopping detuviera el entrenamiento. El modelo final pesa 45 KB y predice en menos de 50 ms por cuadro, lo que lo hace viable para uso en tiempo real incluso en equipos modestos.</w:t>
+        <w:t>El repositorio conserva un reporte de un modelo de abecedario con 26 clases, 6,692 muestras de entrenamiento, 356 de validación y 356 de prueba. Ese reporte registra una precisión de prueba de 98.60%; debe conservarse como resultado de ese experimento específico y no generalizarse automáticamente a la interfaz actual.</w:t>
       </w:r>
     </w:p>
     <w:p>
@@ -5754,7 +5768,7 @@
           <w:sz w:val="24"/>
           <w:szCs w:val="24"/>
         </w:rPr>
-        <w:t>Sobre el conjunto de prueba, de 9,255 muestras el modelo clasificó correctamente 9,058 (97.9% ± 0.3 puntos porcentuales, con 95% de confianza). Los 197 errores restantes se concentraron en pares de letras con formas de mano parecidas, sobre todo entre las letras dinámicas J y K, cuyo movimiento es similar en la fase inicial del gesto, como se observa en la esta sección.</w:t>
+        <w:t>La cifra del modelo de abecedario no demuestra reconocimiento en cámara. Las métricas deben identificarse por conjunto, partición, participantes, checkpoint y condiciones de evaluación antes de compararlas con nuevos experimentos.</w:t>
       </w:r>
     </w:p>
     <w:p>
@@ -5779,7 +5793,7 @@
           <w:sz w:val="24"/>
           <w:szCs w:val="24"/>
         </w:rPr>
-        <w:t xml:space="preserve">Estos resultados confirman que, para señas estáticas, o con una dinámica corta y bien definida como las letras dinámicas del LSM, la combinación de MediaPipe con una red Conv1D relativamente ligera es suficiente para un sistema preciso y rápido.</w:t>
+        <w:t>El resultado del abecedario sugiere que una representación de puntos clave puede funcionar bien bajo determinadas condiciones. Aun así, será necesario repetir la evaluación con más participantes y conectar un runtime que reproduzca exactamente la representación usada en el entrenamiento.</w:t>
       </w:r>
     </w:p>
     <w:p>
@@ -5813,7 +5827,7 @@
           <w:sz w:val="24"/>
           <w:szCs w:val="24"/>
         </w:rPr>
-        <w:t>El segundo modelo, entrenado sobre 281 clases de palabras, tuvo un resultado muy distinto: 42.4% de accuracy en validación (± 3.7 puntos porcentuales, con 95% de confianza, dado que el conjunto de prueba de este modelo es considerablemente más pequeño: 671 muestras), muy por debajo de la meta de 85% planteada en los objetivos de este proyecto. Este resultado se reporta sin atenuantes, ya que forma parte de las conclusiones técnicas del proyecto, como se aprecia en la esta sección.</w:t>
+        <w:t>El experimento de palabras documentado en el repositorio tuvo un resultado insuficiente: con 249 etiquetas, obtuvo 0% de accuracy y 0% de F1 macro en el conjunto de prueba de 393 muestras. Este resultado no debe presentarse como una traducción funcional.</w:t>
       </w:r>
     </w:p>
     <w:p>
@@ -5838,7 +5852,7 @@
           <w:sz w:val="24"/>
           <w:szCs w:val="24"/>
         </w:rPr>
-        <w:t xml:space="preserve">La causa más probable no es la arquitectura. Es la misma Conv1D+BiLSTM que funcionó bien para el abecedario; el problema está en la cantidad de datos disponibles por clase. El conjunto de palabras se dividió en 3,371 secuencias de entrenamiento, 769 de validación y 671 de prueba, repartidas entre 281 clases: un promedio de apenas 17 muestras por clase, frente a las 27,358 fotos por letra del abecedario. A eso se suman los 35 duplicados exactos detectados en el dataset, que reducían aún más la diversidad real de ejemplos disponibles. Entrenar 281 categorías distintas con esa cantidad de datos es, en la práctica, un problema de escasez de datos más que un problema de diseño de modelo.</w:t>
+        <w:t>El resultado insuficiente no permite concluir por sí solo si la causa principal es la arquitectura, los datos, las etiquetas o la separación. Sí muestra que la combinación actual requiere nuevos datos, revisión de etiquetas, evaluación por firmante y una integración de inferencia reproducible.</w:t>
       </w:r>
     </w:p>
     <w:p>
@@ -5856,7 +5870,7 @@
           <w:sz w:val="24"/>
           <w:szCs w:val="24"/>
         </w:rPr>
-        <w:t xml:space="preserve">Esto no invalida el enfoque general del proyecto: confirma que el cuello de botella para el LSM, igual que para EnSeñas AI y buena parte de los proyectos revisados en los antecedentes, sigue siendo la disponibilidad de datos etiquetados, no la arquitectura del modelo. El abecedario funcionó bien porque tuvimos suficientes datos; el vocabulario, todavía no.</w:t>
+        <w:t>Mientras se reúnen más participantes y conjuntos de datos de calidad, el sistema puede utilizar el abecedario y el autocompletado como estrategia provisional de formación de texto. El autocompletado propone palabras por prefijo; no confirma una palabra reconocida.</w:t>
       </w:r>
     </w:p>
     <w:p>
@@ -5906,7 +5920,7 @@
           <w:sz w:val="24"/>
           <w:szCs w:val="24"/>
         </w:rPr>
-        <w:t>A diferencia de Daktilos (reconocimiento de abecedario sin vocabulario de palabras) y del guante mioeléctrico del IPN (requiere hardware adicional), este proyecto aporta un sistema que reconoce tanto letras como un vocabulario inicial de palabras completas, usando exclusivamente una cámara estándar y sin sensores. La contribución concreta y verificable es el resultado del abecedario: 99.06% de accuracy con un modelo de 45 KB, entrenado con un dataset propio de 574,064 datos que se documenta y podría reutilizarse en trabajos futuros sobre LSM.</w:t>
+        <w:t>A diferencia de una afirmación de sistema terminado, este proyecto aporta una base experimental auditable: extracción de puntos, modelos temporales, manifiestos, una interfaz web y autocompletado local. El reconocimiento directo de palabras y la inferencia de cámara todavía requieren integración y validación.</w:t>
       </w:r>
     </w:p>
     <w:p>
@@ -5924,7 +5938,7 @@
           <w:sz w:val="24"/>
           <w:szCs w:val="24"/>
         </w:rPr>
-        <w:t>Este proyecto demuestra que es posible construir, con herramientas de código abierto y una computadora estándar, un sistema de reconocimiento del abecedario LSM que funciona en tiempo real y con una precisión alta: 99.06% en validación, con un modelo de apenas 45 KB. La combinación de tres decisiones técnicas explica gran parte de ese resultado: usar keypoints de MediaPipe en lugar de datos crudas, lo que hace al sistema invariante a la iluminación y al fondo; una augmentación que respeta la anatomía real de la mano, y una arquitectura Conv1D relativamente ligera que no depende de GPUs costosas para entrenarse ni para ejecutarse.</w:t>
+        <w:t>El repositorio muestra que el reconocimiento del abecedario puede ser una base viable cuando se cuenta con datos suficientes y una representación adecuada. Ese resultado pertenece a un experimento concreto y no demuestra que la interfaz actual reconozca señas sin un backend conectado.</w:t>
       </w:r>
     </w:p>
     <w:p>
@@ -5942,7 +5956,7 @@
           <w:sz w:val="24"/>
           <w:szCs w:val="24"/>
         </w:rPr>
-        <w:t xml:space="preserve">El modelo de vocabulario, en cambio, no alcanzó la meta planteada. Con 42.4% de accuracy sobre 281 clases y un promedio de apenas 17 muestras por clase, queda claro que el vocabulario del LSM necesita mucho más dato etiquetado del que logramos reunir en el tiempo de este proyecto. Esto coincide con lo que reportan otros equipos, como EnSeñas AI: el obstáculo real no es la arquitectura del modelo, es la escasez de datos.</w:t>
+        <w:t>El modelo de palabras no alcanzó una condición de uso confiable. El reporte con 249 etiquetas obtuvo 0% de accuracy y 0% de macro-F1 en prueba, por lo que debe considerarse un experimento insuficiente, no una traducción funcional.</w:t>
       </w:r>
     </w:p>
     <w:p>
@@ -5960,7 +5974,7 @@
           <w:sz w:val="24"/>
           <w:szCs w:val="24"/>
         </w:rPr>
-        <w:t>Durante el desarrollo se identificaron varios problemas concretos que se documentan a continuación, ya que cualquier equipo que intente replicar este trabajo probablemente los encuentre también: la letra Ñ terminó sin ninguna muestra utilizable y tuvo que excluirse del entrenamiento; el dataset de palabras tenía 35 duplicados exactos que se detectaron por hash MD5; el delegate de GPU para TFLite no estaba disponible en el entorno de despliegue y hubo que caer de vuelta a CPU; y una confusión inicial entre los modos IMAGE y VIDEO de MediaPipe generó detecciones inconsistentes hasta que se corrigió.</w:t>
+        <w:t>La revisión del repositorio identificó varios puntos que deben corregirse antes de afirmar que el sistema está listo: existen datos de fuentes distintas, algunos manifiestos están pendientes de extracción, los modelos tienen contratos diferentes y la interfaz espera endpoints cuyo servidor no está versionado.</w:t>
       </w:r>
     </w:p>
     <w:p>
@@ -5978,7 +5992,7 @@
           <w:sz w:val="24"/>
           <w:szCs w:val="24"/>
         </w:rPr>
-        <w:t xml:space="preserve">Los retos pendientes son claros: ampliar el dataset de vocabulario, sobre todo en las categorías con menos ejemplos, resolver el caso de la Ñ, y reducir los falsos positivos entre pares de letras dinámicas que se confunden con facilidad. Estas últimas ilustran bien el problema de fondo: 200 videos por letra dinámica son muy pocos comparados con los más de 27,000 ejemplos por letra estática, y esa diferencia se nota directamente en los resultados. Una vía concreta para resolverlo es abrir la recolección de datos a la colaboración: invitar a más personas a grabarse haciendo señas específicas, empezando por las letras dinámicas y las categorías de vocabulario más débiles, permitiría ampliar el dataset a un ritmo que un equipo pequeño no puede lograr solo. A futuro, y solo una vez que el modelo de vocabulario alcance una precisión confiable, este prototipo podría integrarse en aplicaciones de videollamada o dispositivos móviles para facilitar la comunicación entre personas sordas y oyentes en México. Por ahora, el resultado más sólido que puede afirmarse es más modesto y, creemos, igual de valioso: con 500 fotos por letra y augmentación controlada, sí se puede alcanzar más de 99% de accuracy en un problema de reconocimiento de señas, sin infraestructura de cómputo costosa.</w:t>
+        <w:t>Los retos pendientes son claros: reunir más participantes, aumentar la diversidad de muestras por clase, revisar las etiquetas, separar los conjuntos por persona, completar el backend y repetir las evaluaciones con métricas completas.</w:t>
       </w:r>
     </w:p>
     <w:p>
@@ -6014,7 +6028,7 @@
           <w:sz w:val="24"/>
           <w:szCs w:val="24"/>
         </w:rPr>
-        <w:t xml:space="preserve">Alcance: el sistema reconoce 26 letras del abecedario LSM en tiempo real con alta precisión (99.06%), usando solo una cámara estándar.</w:t>
+        <w:t>Alcance: el repositorio contiene una línea experimental de modelos temporales y una aplicación que puede capturar datos, exportarlos y preparar solicitudes. La cobertura final debe confirmarse con nuevas pruebas fuera del entorno controlado.</w:t>
       </w:r>
     </w:p>
     <w:p>
@@ -6034,7 +6048,7 @@
           <w:sz w:val="24"/>
           <w:szCs w:val="24"/>
         </w:rPr>
-        <w:t>Alcance: se documenta y publica un dataset propio de datos y video del LSM, reutilizable por otros equipos.</w:t>
+        <w:t>Alcance: el repositorio conserva manifiestos, scripts, modelos y reportes que permiten reconstruir parte del flujo de trabajo. La disponibilidad de estos archivos no significa que todos los datos estén listos ni que todos los modelos estén conectados a la interfaz.</w:t>
       </w:r>
     </w:p>
     <w:p>
@@ -6054,7 +6068,7 @@
           <w:sz w:val="24"/>
           <w:szCs w:val="24"/>
         </w:rPr>
-        <w:t xml:space="preserve">Limitación: el modelo de vocabulario (42.4% de accuracy) no es apto para uso real todavía; se reporta como trabajo en progreso, no como resultado final.</w:t>
+        <w:t>Limitación: el reconocimiento directo de palabras no es confiable con la evidencia actual. El experimento de 249 etiquetas obtuvo 0% de accuracy y 0% de macro-F1 en prueba, por lo que se reporta como resultado insuficiente.</w:t>
       </w:r>
     </w:p>
     <w:p>
@@ -6074,7 +6088,7 @@
           <w:sz w:val="24"/>
           <w:szCs w:val="24"/>
         </w:rPr>
-        <w:t xml:space="preserve">Limitación: el sistema no ha sido probado con usuarios sordos reales fuera del equipo de desarrollo; no hay todavía una evaluación de usabilidad con la población objetivo.</w:t>
+        <w:t>Limitación: todavía no se cuenta con una evaluación suficiente con participantes sordos y hablantes de LSM que no formen parte del desarrollo.</w:t>
       </w:r>
     </w:p>
     <w:p>
@@ -6094,7 +6108,7 @@
           <w:sz w:val="24"/>
           <w:szCs w:val="24"/>
         </w:rPr>
-        <w:t xml:space="preserve">Limitación: la letra Ñ no está cubierta por el modelo actual.</w:t>
+        <w:t>Limitación: la cobertura de la Ñ y de otras clases depende de que existan muestras suficientes, variadas y correctamente etiquetadas.</w:t>
       </w:r>
     </w:p>
     <w:p>
@@ -6114,7 +6128,7 @@
           <w:sz w:val="24"/>
           <w:szCs w:val="24"/>
         </w:rPr>
-        <w:t xml:space="preserve">Limitación: las pruebas se realizaron en condiciones de laboratorio controladas (iluminación e instalación fijas); el desempeño en condiciones variables de uso real (poca luz, cámaras de baja calidad) no se ha evaluado todavía.</w:t>
+        <w:t>Limitación: no se puede asumir que una precisión obtenida en un conjunto controlado se conserve con otras personas, cámaras, fondos e iluminación.</w:t>
       </w:r>
     </w:p>
     <w:p>
@@ -6150,7 +6164,7 @@
           <w:sz w:val="24"/>
           <w:szCs w:val="24"/>
         </w:rPr>
-        <w:t xml:space="preserve">Corto plazo: ampliar la recolección de video para las letras dinámicas (J, K, Q, X, Z) y resolver el caso de la Ñ.</w:t>
+        <w:t>Corto plazo: implementar el backend de predicción esperado por la interfaz, completar y evaluar el modelo seleccionado, y añadir confianza, estabilización y rechazo antes de mostrar una salida como texto.</w:t>
       </w:r>
     </w:p>
     <w:p>
@@ -6170,7 +6184,7 @@
           <w:sz w:val="24"/>
           <w:szCs w:val="24"/>
         </w:rPr>
-        <w:t xml:space="preserve">Corto plazo: abrir una convocatoria de grabación colaborativa para las categorías de vocabulario con menos ejemplos.</w:t>
+        <w:t>Corto plazo: abrir una convocatoria de grabación colaborativa para las categorías de vocabulario con menos ejemplos y documentar licencias y participantes.</w:t>
       </w:r>
     </w:p>
     <w:p>
@@ -6190,7 +6204,7 @@
           <w:sz w:val="24"/>
           <w:szCs w:val="24"/>
         </w:rPr>
-        <w:t xml:space="preserve">Mediano plazo: evaluar el modelo de vocabulario con usuarios sordos reales y medir su experiencia de uso, no solo el accuracy en el conjunto de prueba.</w:t>
+        <w:t>Mediano plazo: evaluar el modelo de vocabulario con usuarios sordos y hablantes de LSM que no formen parte del desarrollo, midiendo experiencia de uso además del accuracy.</w:t>
       </w:r>
     </w:p>
     <w:p>
@@ -6210,7 +6224,7 @@
           <w:sz w:val="24"/>
           <w:szCs w:val="24"/>
         </w:rPr>
-        <w:t xml:space="preserve">Mediano plazo: probar el sistema en condiciones variables de iluminación y calidad de cámara, fuera del entorno controlado de recolección.</w:t>
+        <w:t>Mediano plazo: probar el sistema en condiciones variables de iluminación, calidad de cámara y dispositivo, fuera del entorno controlado de recolección.</w:t>
       </w:r>
     </w:p>
     <w:p>
@@ -6230,7 +6244,7 @@
           <w:sz w:val="24"/>
           <w:szCs w:val="24"/>
         </w:rPr>
-        <w:t xml:space="preserve">Largo plazo: iniciar la integración con Google Meet, Microsoft Teams y Zoom, antes de escalar hacia WhatsApp, Instagram y Facebook.</w:t>
+        <w:t>Largo plazo: valorar integraciones con Google Meet, Microsoft Teams y Zoom únicamente después de estabilizar el backend, el modelo y la política de confianza.</w:t>
       </w:r>
     </w:p>
     <w:p>
@@ -7461,7 +7475,7 @@
           <w:sz w:val="24"/>
           <w:szCs w:val="24"/>
         </w:rPr>
-        <w:t>Confirmar si la letra Ñ tiene 200 videos grabados (como se indicó en una conversación posterior) o 0 muestras utilizables (como se indicó originalmente); el documento actual la trata como excluida por falta de datos.</w:t>
+        <w:t>Documentar el estado real de la letra Ñ en los manifiestos y no asumir que una etiqueta nominal equivale a muestras utilizables.</w:t>
       </w:r>
     </w:p>
     <w:p>
@@ -7481,7 +7495,7 @@
           <w:sz w:val="24"/>
           <w:szCs w:val="24"/>
         </w:rPr>
-        <w:t xml:space="preserve">Verificar en femeci.mx el nombre oficial vigente de la categoría del proyecto (el documento usa "Sistemas informáticos").</w:t>
+        <w:t>Confirmar con la convocatoria la categoría oficial, conservando los datos administrativos que entregue el equipo.</w:t>
       </w:r>
     </w:p>
     <w:p>
@@ -7501,7 +7515,7 @@
           <w:sz w:val="24"/>
           <w:szCs w:val="24"/>
         </w:rPr>
-        <w:t xml:space="preserve">Tiempo real de entrenamiento y modelo específico de GPU utilizado, para la sección de reproducibilidad.</w:t>
+        <w:t>Registrar el tiempo de entrenamiento, el dispositivo y la versión exacta del entorno para cada corrida reproducible.</w:t>
       </w:r>
     </w:p>
     <w:p>
@@ -7521,7 +7535,7 @@
           <w:sz w:val="24"/>
           <w:szCs w:val="24"/>
         </w:rPr>
-        <w:t xml:space="preserve">Lista específica de las 3–4 letras del abecedario que aún necesitan más datos de entrenamiento, mencionada de forma general en las conclusiones.</w:t>
+        <w:t>Identificar con el manifiesto las letras que necesitan más datos; no incluir una lista específica hasta verificarla.</w:t>
       </w:r>
     </w:p>
     <w:p>

</xml_diff>